<commit_message>
feat(legal): standardize contracts with Vietnam 2-column national header, add agency reseller and labor IP assignment agreements
</commit_message>
<xml_diff>
--- a/legal/01-core/01_MASTER_SERVICE_AGREEMENT_LOCALMATE.docx
+++ b/legal/01-core/01_MASTER_SERVICE_AGREEMENT_LOCALMATE.docx
@@ -2,24 +2,172 @@
 <file path=word/document.xml><?xml version="1.0" encoding="utf-8"?>
 <w:document xmlns:wpc="http://schemas.microsoft.com/office/word/2010/wordprocessingCanvas" xmlns:mo="http://schemas.microsoft.com/office/mac/office/2008/main" xmlns:mc="http://schemas.openxmlformats.org/markup-compatibility/2006" xmlns:mv="urn:schemas-microsoft-com:mac:vml" xmlns:o="urn:schemas-microsoft-com:office:office" xmlns:r="http://schemas.openxmlformats.org/officeDocument/2006/relationships" xmlns:m="http://schemas.openxmlformats.org/officeDocument/2006/math" xmlns:v="urn:schemas-microsoft-com:vml" xmlns:wp14="http://schemas.microsoft.com/office/word/2010/wordprocessingDrawing" xmlns:wp="http://schemas.openxmlformats.org/drawingml/2006/wordprocessingDrawing" xmlns:w10="urn:schemas-microsoft-com:office:word" xmlns:w="http://schemas.openxmlformats.org/wordprocessingml/2006/main" xmlns:w14="http://schemas.microsoft.com/office/word/2010/wordml" xmlns:wpg="http://schemas.microsoft.com/office/word/2010/wordprocessingGroup" xmlns:wpi="http://schemas.microsoft.com/office/word/2010/wordprocessingInk" xmlns:wne="http://schemas.microsoft.com/office/word/2006/wordml" xmlns:wps="http://schemas.microsoft.com/office/word/2010/wordprocessingShape" mc:Ignorable="w14 wp14">
   <w:body>
+    <w:tbl>
+      <w:tblPr>
+        <w:tblW w:type="auto" w:w="0"/>
+        <w:jc w:val="center"/>
+        <w:tblLook w:firstColumn="1" w:firstRow="1" w:lastColumn="0" w:lastRow="0" w:noHBand="0" w:noVBand="1" w:val="04A0"/>
+        <w:tblBorders>
+          <w:top w:val="none"/>
+          <w:bottom w:val="none"/>
+          <w:left w:val="none"/>
+          <w:right w:val="none"/>
+          <w:insideH w:val="none"/>
+          <w:insideV w:val="none"/>
+        </w:tblBorders>
+      </w:tblPr>
+      <w:tblGrid>
+        <w:gridCol w:w="4874"/>
+        <w:gridCol w:w="4874"/>
+      </w:tblGrid>
+      <w:tr>
+        <w:trPr>
+          <w:cantSplit/>
+        </w:trPr>
+        <w:tc>
+          <w:tcPr>
+            <w:tcW w:type="dxa" w:w="4032"/>
+            <w:vAlign w:val="center"/>
+            <w:tcW w:w="4031" w:type="dxa"/>
+            <w:tcMar>
+              <w:top w:w="40" w:type="dxa"/>
+              <w:bottom w:w="40" w:type="dxa"/>
+              <w:left w:w="60" w:type="dxa"/>
+              <w:right w:w="60" w:type="dxa"/>
+            </w:tcMar>
+            <w:shd w:fill="FFFFFF"/>
+          </w:tcPr>
+          <w:p>
+            <w:r/>
+          </w:p>
+          <w:p>
+            <w:pPr>
+              <w:spacing w:before="0" w:after="40" w:line="276" w:lineRule="auto"/>
+              <w:jc w:val="center"/>
+            </w:pPr>
+            <w:r>
+              <w:rPr>
+                <w:b/>
+              </w:rPr>
+              <w:t>ĐƠN VỊ CUNG CẤP DỊCH VỤ</w:t>
+            </w:r>
+          </w:p>
+          <w:p>
+            <w:pPr>
+              <w:spacing w:before="0" w:after="40" w:line="276" w:lineRule="auto"/>
+              <w:jc w:val="center"/>
+            </w:pPr>
+            <w:r>
+              <w:rPr>
+                <w:b/>
+              </w:rPr>
+              <w:t>LOCALMATE VIỆT NAM</w:t>
+            </w:r>
+          </w:p>
+          <w:p>
+            <w:pPr>
+              <w:spacing w:before="0" w:after="40" w:line="276" w:lineRule="auto"/>
+              <w:jc w:val="center"/>
+            </w:pPr>
+            <w:r>
+              <w:t>Số: [MÃ_HỢP_ĐỒNG]/MSA-LM/[NĂM]</w:t>
+            </w:r>
+          </w:p>
+        </w:tc>
+        <w:tc>
+          <w:tcPr>
+            <w:tcW w:type="dxa" w:w="5717"/>
+            <w:vAlign w:val="center"/>
+            <w:tcW w:w="5716" w:type="dxa"/>
+            <w:tcMar>
+              <w:top w:w="40" w:type="dxa"/>
+              <w:bottom w:w="40" w:type="dxa"/>
+              <w:left w:w="60" w:type="dxa"/>
+              <w:right w:w="60" w:type="dxa"/>
+            </w:tcMar>
+            <w:shd w:fill="FFFFFF"/>
+          </w:tcPr>
+          <w:p>
+            <w:r/>
+          </w:p>
+          <w:p>
+            <w:pPr>
+              <w:spacing w:before="0" w:after="40" w:line="276" w:lineRule="auto"/>
+              <w:jc w:val="center"/>
+            </w:pPr>
+            <w:r>
+              <w:rPr>
+                <w:b/>
+                <w:sz w:val="23"/>
+              </w:rPr>
+              <w:t>CỘNG HÒA XÃ HỘI CHỦ NGHĨA VIỆT NAM</w:t>
+            </w:r>
+          </w:p>
+          <w:p>
+            <w:pPr>
+              <w:spacing w:before="0" w:after="40" w:line="276" w:lineRule="auto"/>
+              <w:jc w:val="center"/>
+            </w:pPr>
+            <w:r>
+              <w:rPr>
+                <w:b/>
+              </w:rPr>
+              <w:t>Độc lập - Tự do - Hạnh phúc</w:t>
+            </w:r>
+          </w:p>
+          <w:p>
+            <w:pPr>
+              <w:spacing w:before="0" w:after="40" w:line="276" w:lineRule="auto"/>
+              <w:jc w:val="center"/>
+            </w:pPr>
+            <w:r>
+              <w:rPr>
+                <w:color w:val="0F172A"/>
+                <w:sz w:val="16"/>
+              </w:rPr>
+              <w:t>――――――――――――――――</w:t>
+            </w:r>
+          </w:p>
+          <w:p>
+            <w:pPr>
+              <w:spacing w:before="0" w:after="40" w:line="276" w:lineRule="auto"/>
+              <w:jc w:val="center"/>
+            </w:pPr>
+            <w:r>
+              <w:rPr>
+                <w:i/>
+                <w:color w:val="64748B"/>
+                <w:sz w:val="19"/>
+              </w:rPr>
+              <w:t>Hà Nội, ngày [NGÀY] tháng [THÁNG] năm 202[NĂM]</w:t>
+            </w:r>
+          </w:p>
+        </w:tc>
+      </w:tr>
+    </w:tbl>
     <w:p>
       <w:pPr>
-        <w:spacing w:before="240" w:after="120" w:line="288" w:lineRule="auto"/>
+        <w:spacing w:before="0" w:after="80"/>
+      </w:pPr>
+    </w:p>
+    <w:p>
+      <w:pPr>
+        <w:spacing w:before="240" w:after="80" w:line="288" w:lineRule="auto"/>
         <w:jc w:val="center"/>
       </w:pPr>
       <w:r>
         <w:rPr>
           <w:b/>
-          <w:color w:val="0D7647"/>
-          <w:sz w:val="30"/>
+          <w:color w:val="0F172A"/>
+          <w:sz w:val="29"/>
         </w:rPr>
-        <w:t>HỢP ĐỒNG KHUNG CUNG CẤP DỊCH VỤ SỐ &amp; CÔNG NGHỆ LOCALMATE</w:t>
+        <w:t>HỢP ĐỒNG KHUNG CUNG CẤP DỊCH VỤ CÔNG NGHỆ &amp; MARKETING SỐ</w:t>
       </w:r>
     </w:p>
     <w:p>
       <w:pPr>
-        <w:spacing w:after="80" w:before="0" w:line="276" w:lineRule="auto"/>
-        <w:jc w:val="left"/>
+        <w:spacing w:before="20" w:after="60" w:line="276" w:lineRule="auto"/>
+        <w:jc w:val="both"/>
       </w:pPr>
       <w:r>
         <w:rPr>
@@ -27,53 +175,160 @@
         </w:rPr>
         <w:t>(MASTER SERVICES AGREEMENT - MSA)</w:t>
       </w:r>
-      <w:r>
-        <w:t xml:space="preserve">  </w:t>
-      </w:r>
     </w:p>
     <w:p>
       <w:pPr>
-        <w:spacing w:after="80" w:before="0" w:line="276" w:lineRule="auto"/>
+        <w:spacing w:before="20" w:after="40" w:line="276" w:lineRule="auto"/>
+        <w:ind w:left="288"/>
+        <w:jc w:val="both"/>
+      </w:pPr>
+      <w:r>
+        <w:rPr>
+          <w:i/>
+          <w:color w:val="0F172A"/>
+          <w:sz w:val="20"/>
+        </w:rPr>
+        <w:t>- Căn cứ Bộ luật Dân sự số 91/2015/QH13 ngày 24 tháng 11 năm 2015 và các văn bản hướng dẫn thi hành;</w:t>
+      </w:r>
+    </w:p>
+    <w:p>
+      <w:pPr>
+        <w:spacing w:before="20" w:after="40" w:line="276" w:lineRule="auto"/>
+        <w:ind w:left="288"/>
+        <w:jc w:val="both"/>
+      </w:pPr>
+      <w:r>
+        <w:rPr>
+          <w:i/>
+          <w:color w:val="0F172A"/>
+          <w:sz w:val="20"/>
+        </w:rPr>
+        <w:t>- Căn cứ Luật Thương mại số 36/2005/QH11 ngày 14 tháng 06 năm 2005;</w:t>
+      </w:r>
+    </w:p>
+    <w:p>
+      <w:pPr>
+        <w:spacing w:before="20" w:after="40" w:line="276" w:lineRule="auto"/>
+        <w:ind w:left="288"/>
+        <w:jc w:val="both"/>
+      </w:pPr>
+      <w:r>
+        <w:rPr>
+          <w:i/>
+          <w:color w:val="0F172A"/>
+          <w:sz w:val="20"/>
+        </w:rPr>
+        <w:t>- Căn cứ Luật Công nghệ thông tin số 67/2006/QH11 ngày 29 tháng 06 năm 2006;</w:t>
+      </w:r>
+    </w:p>
+    <w:p>
+      <w:pPr>
+        <w:spacing w:before="20" w:after="40" w:line="276" w:lineRule="auto"/>
+        <w:ind w:left="288"/>
+        <w:jc w:val="both"/>
+      </w:pPr>
+      <w:r>
+        <w:rPr>
+          <w:i/>
+          <w:color w:val="0F172A"/>
+          <w:sz w:val="20"/>
+        </w:rPr>
+        <w:t>- Căn cứ Luật Giao dịch điện tử số 20/2023/QH15 ngày 22 tháng 06 năm 2023;</w:t>
+      </w:r>
+    </w:p>
+    <w:p>
+      <w:pPr>
+        <w:spacing w:before="20" w:after="40" w:line="276" w:lineRule="auto"/>
+        <w:ind w:left="288"/>
+        <w:jc w:val="both"/>
+      </w:pPr>
+      <w:r>
+        <w:rPr>
+          <w:i/>
+          <w:color w:val="0F172A"/>
+          <w:sz w:val="20"/>
+        </w:rPr>
+        <w:t>- Căn cứ Luật Sở hữu trí tuệ số 50/2005/QH11 đã được sửa đổi, bổ sung theo Luật số 07/2022/QH15;</w:t>
+      </w:r>
+    </w:p>
+    <w:p>
+      <w:pPr>
+        <w:spacing w:before="20" w:after="40" w:line="276" w:lineRule="auto"/>
+        <w:ind w:left="288"/>
+        <w:jc w:val="both"/>
+      </w:pPr>
+      <w:r>
+        <w:rPr>
+          <w:i/>
+          <w:color w:val="0F172A"/>
+          <w:sz w:val="20"/>
+        </w:rPr>
+        <w:t>- Căn cứ Luật Quảng cáo số 16/2012/QH13 ngày 21 tháng 06 năm 2012;</w:t>
+      </w:r>
+    </w:p>
+    <w:p>
+      <w:pPr>
+        <w:spacing w:before="20" w:after="40" w:line="276" w:lineRule="auto"/>
+        <w:ind w:left="288"/>
+        <w:jc w:val="both"/>
+      </w:pPr>
+      <w:r>
+        <w:rPr>
+          <w:i/>
+          <w:color w:val="0F172A"/>
+          <w:sz w:val="20"/>
+        </w:rPr>
+        <w:t>- Căn cứ Luật An ninh mạng số 24/2018/QH14 ngày 12 tháng 06 năm 2018;</w:t>
+      </w:r>
+    </w:p>
+    <w:p>
+      <w:pPr>
+        <w:spacing w:before="20" w:after="40" w:line="276" w:lineRule="auto"/>
+        <w:ind w:left="288"/>
+        <w:jc w:val="both"/>
+      </w:pPr>
+      <w:r>
+        <w:rPr>
+          <w:i/>
+          <w:color w:val="0F172A"/>
+          <w:sz w:val="20"/>
+        </w:rPr>
+        <w:t>- Căn cứ Nghị định số 13/2023/NĐ-CP ngày 17 tháng 04 năm 2023 của Chính phủ về bảo vệ dữ liệu cá nhân;</w:t>
+      </w:r>
+    </w:p>
+    <w:p>
+      <w:pPr>
+        <w:spacing w:before="20" w:after="40" w:line="276" w:lineRule="auto"/>
+        <w:ind w:left="288"/>
+        <w:jc w:val="both"/>
+      </w:pPr>
+      <w:r>
+        <w:rPr>
+          <w:i/>
+          <w:color w:val="0F172A"/>
+          <w:sz w:val="20"/>
+        </w:rPr>
+        <w:t>- Căn cứ vào nhu cầu và năng lực thực tế của Hai Bên.</w:t>
+      </w:r>
+    </w:p>
+    <w:p>
+      <w:pPr>
+        <w:spacing w:before="180" w:after="60" w:line="276" w:lineRule="auto"/>
         <w:jc w:val="left"/>
       </w:pPr>
       <w:r>
         <w:rPr>
           <w:b/>
+          <w:color w:val="0F172A"/>
+          <w:sz w:val="22"/>
         </w:rPr>
-        <w:t>Số hiệu Hợp đồng:</w:t>
-      </w:r>
-      <w:r>
-        <w:t xml:space="preserve"> [MÃ_HỢP_ĐỒNG]/MSA-LM/[NĂM]</w:t>
+        <w:t>BẢNG THẨM ĐỊNH MÔ HÌNH PHÁP NHÂN LOCALMATE (KICK-OFF CHECKLIST)</w:t>
       </w:r>
     </w:p>
     <w:p>
       <w:pPr>
-        <w:spacing w:after="120" w:before="80"/>
-      </w:pPr>
-      <w:r>
-        <w:rPr>
-          <w:color w:val="CBD5E1"/>
-        </w:rPr>
-        <w:t>―――――――――――――――――――――――――――――――――――――――――――――――――――――――</w:t>
-      </w:r>
-    </w:p>
-    <w:p>
-      <w:pPr>
-        <w:spacing w:before="160" w:after="60"/>
-      </w:pPr>
-      <w:r>
-        <w:rPr>
-          <w:b/>
-          <w:color w:val="0D7647"/>
-          <w:sz w:val="23"/>
-        </w:rPr>
-        <w:t>BẢNG THẨM ĐỊNH MÔ HÌNH PHÁP NHÂN LOCALMATE (KICK-OFF CHECKLIST)</w:t>
-      </w:r>
-    </w:p>
-    <w:p>
-      <w:pPr>
-        <w:spacing w:after="80" w:before="0" w:line="276" w:lineRule="auto"/>
-        <w:jc w:val="left"/>
+        <w:spacing w:before="20" w:after="60" w:line="276" w:lineRule="auto"/>
+        <w:jc w:val="both"/>
       </w:pPr>
       <w:r>
         <w:rPr>
@@ -84,12 +339,12 @@
     </w:p>
     <w:p>
       <w:pPr>
-        <w:spacing w:after="60" w:before="20" w:line="276" w:lineRule="auto"/>
+        <w:spacing w:before="20" w:after="40" w:line="276" w:lineRule="auto"/>
         <w:ind w:left="360"/>
-        <w:jc w:val="left"/>
-      </w:pPr>
-      <w:r>
-        <w:t xml:space="preserve">•  [ ] </w:t>
+        <w:jc w:val="both"/>
+      </w:pPr>
+      <w:r>
+        <w:t xml:space="preserve">[ ] </w:t>
       </w:r>
       <w:r>
         <w:rPr>
@@ -100,32 +355,32 @@
     </w:p>
     <w:p>
       <w:pPr>
-        <w:spacing w:after="60" w:before="20" w:line="276" w:lineRule="auto"/>
+        <w:spacing w:before="20" w:after="40" w:line="276" w:lineRule="auto"/>
         <w:ind w:left="360"/>
-        <w:jc w:val="left"/>
-      </w:pPr>
-      <w:r>
-        <w:t>•  Áp dụng thuế GTGT (VAT 10% hoặc 8% theo chính sách hiện hành), thuế TNDN 20%.</w:t>
+        <w:jc w:val="both"/>
+      </w:pPr>
+      <w:r>
+        <w:t>Áp dụng thuế GTGT (VAT 10% hoặc 8% theo chính sách hiện hành), thuế TNDN 20%.</w:t>
       </w:r>
     </w:p>
     <w:p>
       <w:pPr>
-        <w:spacing w:after="60" w:before="20" w:line="276" w:lineRule="auto"/>
+        <w:spacing w:before="20" w:after="40" w:line="276" w:lineRule="auto"/>
         <w:ind w:left="360"/>
-        <w:jc w:val="left"/>
-      </w:pPr>
-      <w:r>
-        <w:t>•  Phát hành hóa đơn điện tử GTGT theo Nghị định 123/2020/NĐ-CP và Thông tư 78/2021/TT-BTC.</w:t>
+        <w:jc w:val="both"/>
+      </w:pPr>
+      <w:r>
+        <w:t>Phát hành hóa đơn điện tử GTGT theo Nghị định 123/2020/NĐ-CP và Thông tư 78/2021/TT-BTC.</w:t>
       </w:r>
     </w:p>
     <w:p>
       <w:pPr>
-        <w:spacing w:after="60" w:before="20" w:line="276" w:lineRule="auto"/>
+        <w:spacing w:before="20" w:after="40" w:line="276" w:lineRule="auto"/>
         <w:ind w:left="360"/>
-        <w:jc w:val="left"/>
-      </w:pPr>
-      <w:r>
-        <w:t xml:space="preserve">•  [ ] </w:t>
+        <w:jc w:val="both"/>
+      </w:pPr>
+      <w:r>
+        <w:t xml:space="preserve">[ ] </w:t>
       </w:r>
       <w:r>
         <w:rPr>
@@ -136,32 +391,32 @@
     </w:p>
     <w:p>
       <w:pPr>
-        <w:spacing w:after="60" w:before="20" w:line="276" w:lineRule="auto"/>
+        <w:spacing w:before="20" w:after="40" w:line="276" w:lineRule="auto"/>
         <w:ind w:left="360"/>
-        <w:jc w:val="left"/>
-      </w:pPr>
-      <w:r>
-        <w:t>•  Áp dụng tỷ lệ thuế 7% trên tổng doanh thu (5% GTGT + 2% TNCN) theo Thông tư 40/2021/TT-BTC.</w:t>
+        <w:jc w:val="both"/>
+      </w:pPr>
+      <w:r>
+        <w:t>Áp dụng tỷ lệ thuế 7% trên tổng doanh thu (5% GTGT + 2% TNCN) theo Thông tư 40/2021/TT-BTC.</w:t>
       </w:r>
     </w:p>
     <w:p>
       <w:pPr>
-        <w:spacing w:after="60" w:before="20" w:line="276" w:lineRule="auto"/>
+        <w:spacing w:before="20" w:after="40" w:line="276" w:lineRule="auto"/>
         <w:ind w:left="360"/>
-        <w:jc w:val="left"/>
-      </w:pPr>
-      <w:r>
-        <w:t>•  Xuất hóa đơn bán hàng điện tử có mã của cơ quan thuế.</w:t>
+        <w:jc w:val="both"/>
+      </w:pPr>
+      <w:r>
+        <w:t>Xuất hóa đơn bán hàng điện tử có mã của cơ quan thuế.</w:t>
       </w:r>
     </w:p>
     <w:p>
       <w:pPr>
-        <w:spacing w:after="60" w:before="20" w:line="276" w:lineRule="auto"/>
+        <w:spacing w:before="20" w:after="40" w:line="276" w:lineRule="auto"/>
         <w:ind w:left="360"/>
-        <w:jc w:val="left"/>
-      </w:pPr>
-      <w:r>
-        <w:t xml:space="preserve">•  [ ] </w:t>
+        <w:jc w:val="both"/>
+      </w:pPr>
+      <w:r>
+        <w:t xml:space="preserve">[ ] </w:t>
       </w:r>
       <w:r>
         <w:rPr>
@@ -172,55 +427,45 @@
     </w:p>
     <w:p>
       <w:pPr>
-        <w:spacing w:after="60" w:before="20" w:line="276" w:lineRule="auto"/>
+        <w:spacing w:before="20" w:after="40" w:line="276" w:lineRule="auto"/>
         <w:ind w:left="360"/>
-        <w:jc w:val="left"/>
-      </w:pPr>
-      <w:r>
-        <w:t>•  Khấu trừ 10% thuế TNCN tại nguồn (hoặc nộp thuế khoán nếu có MST cá nhân kinh doanh).</w:t>
+        <w:jc w:val="both"/>
+      </w:pPr>
+      <w:r>
+        <w:t>Khấu trừ 10% thuế TNCN tại nguồn (hoặc nộp thuế khoán nếu có MST cá nhân kinh doanh).</w:t>
       </w:r>
     </w:p>
     <w:p>
       <w:pPr>
-        <w:spacing w:after="120" w:before="80"/>
-      </w:pPr>
-      <w:r>
-        <w:rPr>
-          <w:color w:val="CBD5E1"/>
-        </w:rPr>
-        <w:t>―――――――――――――――――――――――――――――――――――――――――――――――――――――――</w:t>
+        <w:spacing w:before="20" w:after="60" w:line="276" w:lineRule="auto"/>
+        <w:jc w:val="both"/>
+      </w:pPr>
+      <w:r>
+        <w:t>Hôm nay, ngày [NGÀY] tháng [THÁNG] năm 202[NĂM], tại trụ sở các bên, Hợp đồng Khung Cung Cấp Dịch Vụ này ("Hợp đồng") được lập và ký kết giữa:</w:t>
       </w:r>
     </w:p>
     <w:p>
       <w:pPr>
-        <w:spacing w:after="80" w:before="0" w:line="276" w:lineRule="auto"/>
+        <w:spacing w:before="180" w:after="60" w:line="276" w:lineRule="auto"/>
         <w:jc w:val="left"/>
       </w:pPr>
       <w:r>
-        <w:t>Hôm nay, ngày [NGÀY] tháng [THÁNG] năm 202[NĂM], tại trụ sở các bên, Hợp đồng Khung Cung Cấp Dịch Vụ này ("Hợp đồng") được lập và ký kết giữa:</w:t>
+        <w:rPr>
+          <w:b/>
+          <w:color w:val="0F172A"/>
+          <w:sz w:val="22"/>
+        </w:rPr>
+        <w:t>BÊN A: BÊN SỬ DỤNG DỊCH VỤ (KHÁCH HÀNG)</w:t>
       </w:r>
     </w:p>
     <w:p>
       <w:pPr>
-        <w:spacing w:before="160" w:after="60"/>
-      </w:pPr>
-      <w:r>
-        <w:rPr>
-          <w:b/>
-          <w:color w:val="0D7647"/>
-          <w:sz w:val="23"/>
-        </w:rPr>
-        <w:t>BÊN A: BÊN SỬ DỤNG DỊCH VỤ (KHÁCH HÀNG)</w:t>
-      </w:r>
-    </w:p>
-    <w:p>
-      <w:pPr>
-        <w:spacing w:after="60" w:before="20" w:line="276" w:lineRule="auto"/>
+        <w:spacing w:before="20" w:after="40" w:line="276" w:lineRule="auto"/>
         <w:ind w:left="360"/>
-        <w:jc w:val="left"/>
-      </w:pPr>
-      <w:r>
-        <w:t xml:space="preserve">•  Tên Doanh nghiệp / Hộ kinh doanh: </w:t>
+        <w:jc w:val="both"/>
+      </w:pPr>
+      <w:r>
+        <w:t xml:space="preserve">Tên Doanh nghiệp / Hộ kinh doanh: </w:t>
       </w:r>
       <w:r>
         <w:rPr>
@@ -231,85 +476,86 @@
     </w:p>
     <w:p>
       <w:pPr>
-        <w:spacing w:after="60" w:before="20" w:line="276" w:lineRule="auto"/>
+        <w:spacing w:before="20" w:after="40" w:line="276" w:lineRule="auto"/>
         <w:ind w:left="360"/>
-        <w:jc w:val="left"/>
-      </w:pPr>
-      <w:r>
-        <w:t>•  Mã số thuế / Mã số doanh nghiệp: [MST_KHÁCH_HÀNG]</w:t>
+        <w:jc w:val="both"/>
+      </w:pPr>
+      <w:r>
+        <w:t>Mã số thuế / Mã số doanh nghiệp: [MST_KHÁCH_HÀNG]</w:t>
       </w:r>
     </w:p>
     <w:p>
       <w:pPr>
-        <w:spacing w:after="60" w:before="20" w:line="276" w:lineRule="auto"/>
+        <w:spacing w:before="20" w:after="40" w:line="276" w:lineRule="auto"/>
         <w:ind w:left="360"/>
-        <w:jc w:val="left"/>
-      </w:pPr>
-      <w:r>
-        <w:t>•  Địa chỉ trụ sở: [ĐỊA_CHỈ_KHÁCH_HÀNG]</w:t>
+        <w:jc w:val="both"/>
+      </w:pPr>
+      <w:r>
+        <w:t>Địa chỉ trụ sở: [ĐỊA_CHỈ_KHÁCH_HÀNG]</w:t>
       </w:r>
     </w:p>
     <w:p>
       <w:pPr>
-        <w:spacing w:after="60" w:before="20" w:line="276" w:lineRule="auto"/>
+        <w:spacing w:before="20" w:after="40" w:line="276" w:lineRule="auto"/>
         <w:ind w:left="360"/>
-        <w:jc w:val="left"/>
-      </w:pPr>
-      <w:r>
-        <w:t>•  Người đại diện theo pháp luật: [ĐẠI_DIỆN_KHÁCH_HÀNG] — Chức vụ: [CHỨC_VỤ_KHÁCH_HÀNG]</w:t>
+        <w:jc w:val="both"/>
+      </w:pPr>
+      <w:r>
+        <w:t>Người đại diện theo pháp luật: [ĐẠI_DIỆN_KHÁCH_HÀNG] — Chức vụ: [CHỨC_VỤ_KHÁCH_HÀNG]</w:t>
       </w:r>
     </w:p>
     <w:p>
       <w:pPr>
-        <w:spacing w:after="60" w:before="20" w:line="276" w:lineRule="auto"/>
+        <w:spacing w:before="20" w:after="40" w:line="276" w:lineRule="auto"/>
         <w:ind w:left="360"/>
-        <w:jc w:val="left"/>
-      </w:pPr>
-      <w:r>
-        <w:t>•  Số điện thoại liên hệ: [SĐT_KHÁCH_HÀNG]</w:t>
+        <w:jc w:val="both"/>
+      </w:pPr>
+      <w:r>
+        <w:t>Số điện thoại liên hệ: [SĐT_KHÁCH_HÀNG]</w:t>
       </w:r>
     </w:p>
     <w:p>
       <w:pPr>
-        <w:spacing w:after="60" w:before="20" w:line="276" w:lineRule="auto"/>
+        <w:spacing w:before="20" w:after="40" w:line="276" w:lineRule="auto"/>
         <w:ind w:left="360"/>
-        <w:jc w:val="left"/>
-      </w:pPr>
-      <w:r>
-        <w:t>•  Email giao dịch chính thức: [EMAIL_KHÁCH_HÀNG]</w:t>
+        <w:jc w:val="both"/>
+      </w:pPr>
+      <w:r>
+        <w:t>Email giao dịch chính thức: [EMAIL_KHÁCH_HÀNG]</w:t>
       </w:r>
     </w:p>
     <w:p>
       <w:pPr>
-        <w:spacing w:after="60" w:before="20" w:line="276" w:lineRule="auto"/>
+        <w:spacing w:before="20" w:after="40" w:line="276" w:lineRule="auto"/>
         <w:ind w:left="360"/>
-        <w:jc w:val="left"/>
-      </w:pPr>
-      <w:r>
-        <w:t>•  Tài khoản ngân hàng: [SỐ_TK_KHÁCH_HÀNG] mở tại Ngân hàng: [NGÂN_HÀNG_KHÁCH_HÀNG]</w:t>
+        <w:jc w:val="both"/>
+      </w:pPr>
+      <w:r>
+        <w:t>Tài khoản ngân hàng: [SỐ_TK_KHÁCH_HÀNG] mở tại Ngân hàng: [NGÂN_HÀNG_KHÁCH_HÀNG]</w:t>
       </w:r>
     </w:p>
     <w:p>
       <w:pPr>
-        <w:spacing w:before="160" w:after="60"/>
+        <w:spacing w:before="180" w:after="60" w:line="276" w:lineRule="auto"/>
+        <w:jc w:val="left"/>
       </w:pPr>
       <w:r>
         <w:rPr>
           <w:b/>
-          <w:color w:val="0D7647"/>
-          <w:sz w:val="23"/>
+          <w:color w:val="0F172A"/>
+          <w:sz w:val="22"/>
         </w:rPr>
         <w:t>BÊN B: BÊN CUNG CẤP DỊCH VỤ (LOCALMATE)</w:t>
       </w:r>
     </w:p>
     <w:p>
       <w:pPr>
-        <w:spacing w:after="60" w:before="20" w:line="276" w:lineRule="auto"/>
+        <w:spacing w:before="20" w:after="40" w:line="276" w:lineRule="auto"/>
         <w:ind w:left="360"/>
-        <w:jc w:val="left"/>
-      </w:pPr>
-      <w:r>
-        <w:t xml:space="preserve">•  Tên pháp lý: </w:t>
+        <w:jc w:val="both"/>
+      </w:pPr>
+      <w:r>
+        <w:t xml:space="preserve">Tên pháp lý: </w:t>
       </w:r>
       <w:r>
         <w:rPr>
@@ -320,12 +566,12 @@
     </w:p>
     <w:p>
       <w:pPr>
-        <w:spacing w:after="60" w:before="20" w:line="276" w:lineRule="auto"/>
+        <w:spacing w:before="20" w:after="40" w:line="276" w:lineRule="auto"/>
         <w:ind w:left="360"/>
-        <w:jc w:val="left"/>
-      </w:pPr>
-      <w:r>
-        <w:t xml:space="preserve">•  Mã số thuế / Mã số doanh nghiệp: </w:t>
+        <w:jc w:val="both"/>
+      </w:pPr>
+      <w:r>
+        <w:t xml:space="preserve">Mã số thuế / Mã số doanh nghiệp: </w:t>
       </w:r>
       <w:r>
         <w:rPr>
@@ -336,12 +582,12 @@
     </w:p>
     <w:p>
       <w:pPr>
-        <w:spacing w:after="60" w:before="20" w:line="276" w:lineRule="auto"/>
+        <w:spacing w:before="20" w:after="40" w:line="276" w:lineRule="auto"/>
         <w:ind w:left="360"/>
-        <w:jc w:val="left"/>
-      </w:pPr>
-      <w:r>
-        <w:t xml:space="preserve">•  Địa chỉ trụ sở: </w:t>
+        <w:jc w:val="both"/>
+      </w:pPr>
+      <w:r>
+        <w:t xml:space="preserve">Địa chỉ trụ sở: </w:t>
       </w:r>
       <w:r>
         <w:rPr>
@@ -352,12 +598,12 @@
     </w:p>
     <w:p>
       <w:pPr>
-        <w:spacing w:after="60" w:before="20" w:line="276" w:lineRule="auto"/>
+        <w:spacing w:before="20" w:after="40" w:line="276" w:lineRule="auto"/>
         <w:ind w:left="360"/>
-        <w:jc w:val="left"/>
-      </w:pPr>
-      <w:r>
-        <w:t xml:space="preserve">•  Người đại diện theo pháp luật: </w:t>
+        <w:jc w:val="both"/>
+      </w:pPr>
+      <w:r>
+        <w:t xml:space="preserve">Người đại diện theo pháp luật: </w:t>
       </w:r>
       <w:r>
         <w:rPr>
@@ -377,12 +623,12 @@
     </w:p>
     <w:p>
       <w:pPr>
-        <w:spacing w:after="60" w:before="20" w:line="276" w:lineRule="auto"/>
+        <w:spacing w:before="20" w:after="40" w:line="276" w:lineRule="auto"/>
         <w:ind w:left="360"/>
-        <w:jc w:val="left"/>
-      </w:pPr>
-      <w:r>
-        <w:t xml:space="preserve">•  Số điện thoại Hotline: </w:t>
+        <w:jc w:val="both"/>
+      </w:pPr>
+      <w:r>
+        <w:t xml:space="preserve">Số điện thoại Hotline: </w:t>
       </w:r>
       <w:r>
         <w:rPr>
@@ -396,12 +642,12 @@
     </w:p>
     <w:p>
       <w:pPr>
-        <w:spacing w:after="60" w:before="20" w:line="276" w:lineRule="auto"/>
+        <w:spacing w:before="20" w:after="40" w:line="276" w:lineRule="auto"/>
         <w:ind w:left="360"/>
-        <w:jc w:val="left"/>
-      </w:pPr>
-      <w:r>
-        <w:t xml:space="preserve">•  Email giao dịch chính thức: </w:t>
+        <w:jc w:val="both"/>
+      </w:pPr>
+      <w:r>
+        <w:t xml:space="preserve">Email giao dịch chính thức: </w:t>
       </w:r>
       <w:r>
         <w:rPr>
@@ -415,12 +661,12 @@
     </w:p>
     <w:p>
       <w:pPr>
-        <w:spacing w:after="60" w:before="20" w:line="276" w:lineRule="auto"/>
+        <w:spacing w:before="20" w:after="40" w:line="276" w:lineRule="auto"/>
         <w:ind w:left="360"/>
-        <w:jc w:val="left"/>
-      </w:pPr>
-      <w:r>
-        <w:t xml:space="preserve">•  Tài khoản ngân hàng: </w:t>
+        <w:jc w:val="both"/>
+      </w:pPr>
+      <w:r>
+        <w:t xml:space="preserve">Tài khoản ngân hàng: </w:t>
       </w:r>
       <w:r>
         <w:rPr>
@@ -437,11 +683,20 @@
         </w:rPr>
         <w:t>[BANK]</w:t>
       </w:r>
+      <w:r>
+        <w:t xml:space="preserve"> - Chi nhánh: </w:t>
+      </w:r>
+      <w:r>
+        <w:rPr>
+          <w:b/>
+        </w:rPr>
+        <w:t>[BANK_BRANCH]</w:t>
+      </w:r>
     </w:p>
     <w:p>
       <w:pPr>
-        <w:spacing w:after="80" w:before="0" w:line="276" w:lineRule="auto"/>
-        <w:jc w:val="left"/>
+        <w:spacing w:before="20" w:after="60" w:line="276" w:lineRule="auto"/>
+        <w:jc w:val="both"/>
       </w:pPr>
       <w:r>
         <w:rPr>
@@ -452,104 +707,74 @@
     </w:p>
     <w:p>
       <w:pPr>
-        <w:spacing w:after="120" w:before="80"/>
+        <w:spacing w:before="180" w:after="60" w:line="276" w:lineRule="auto"/>
+        <w:jc w:val="left"/>
       </w:pPr>
       <w:r>
         <w:rPr>
-          <w:color w:val="CBD5E1"/>
+          <w:b/>
+          <w:color w:val="0F172A"/>
+          <w:sz w:val="22"/>
         </w:rPr>
-        <w:t>―――――――――――――――――――――――――――――――――――――――――――――――――――――――</w:t>
+        <w:t>LỜI NÓI ĐẦU</w:t>
       </w:r>
     </w:p>
     <w:p>
       <w:pPr>
-        <w:spacing w:before="160" w:after="60"/>
+        <w:spacing w:before="20" w:after="40" w:line="276" w:lineRule="auto"/>
+        <w:ind w:left="360"/>
+        <w:jc w:val="both"/>
+      </w:pPr>
+      <w:r>
+        <w:t>Xét thấy Bên B là đơn vị hoạt động chuyên nghiệp trong lĩnh vực công nghệ thông tin, phát triển website, tối ưu hóa vị trí hiển thị Google Maps, quản trị chiến dịch quảng cáo trực tuyến, sản xuất nội dung số và tự động hóa quy trình khách hàng (CRM &amp; Automation);</w:t>
+      </w:r>
+    </w:p>
+    <w:p>
+      <w:pPr>
+        <w:spacing w:before="20" w:after="40" w:line="276" w:lineRule="auto"/>
+        <w:ind w:left="360"/>
+        <w:jc w:val="both"/>
+      </w:pPr>
+      <w:r>
+        <w:t>Xét thấy Bên A có nhu cầu thuê Bên B cung ứng các dịch vụ số nêu trên phục vụ hoạt động sản xuất, kinh doanh, xúc tiến thương mại của Bên A theo các Đơn Đặt Hàng (Service Order) và Bảng Đặc Tả Công Việc (SOW) phát sinh từng thời kỳ;</w:t>
+      </w:r>
+    </w:p>
+    <w:p>
+      <w:pPr>
+        <w:spacing w:before="20" w:after="60" w:line="276" w:lineRule="auto"/>
+        <w:jc w:val="both"/>
+      </w:pPr>
+      <w:r>
+        <w:t>Hai Bên tự nguyện thỏa thuận và thống nhất ký kết Hợp đồng Khung này với các điều khoản và điều kiện sau đây:</w:t>
+      </w:r>
+    </w:p>
+    <w:p>
+      <w:pPr>
+        <w:spacing w:before="180" w:after="60" w:line="276" w:lineRule="auto"/>
+        <w:jc w:val="left"/>
       </w:pPr>
       <w:r>
         <w:rPr>
           <w:b/>
-          <w:color w:val="0D7647"/>
-          <w:sz w:val="23"/>
+          <w:color w:val="0F172A"/>
+          <w:sz w:val="22"/>
         </w:rPr>
-        <w:t>LỜI NÓI ĐẦU</w:t>
+        <w:t>ĐIỀU 1: ĐỊNH NGHĨA VÀ GIẢI THÍCH TỪ NGỮ</w:t>
       </w:r>
     </w:p>
     <w:p>
       <w:pPr>
-        <w:spacing w:after="60" w:before="20" w:line="276" w:lineRule="auto"/>
-        <w:ind w:left="360"/>
-        <w:jc w:val="left"/>
-      </w:pPr>
-      <w:r>
-        <w:t>•  Xét thấy Bên B là đơn vị hoạt động chuyên nghiệp trong lĩnh vực công nghệ thông tin, phát triển website, tối ưu hóa vị trí hiển thị Google Maps, quản trị chiến dịch quảng cáo trực tuyến, sản xuất nội dung số và tự động hóa quy trình khách hàng (CRM &amp; Automation);</w:t>
+        <w:spacing w:before="20" w:after="60" w:line="276" w:lineRule="auto"/>
+        <w:jc w:val="both"/>
+      </w:pPr>
+      <w:r>
+        <w:t>Trong Hợp đồng này, các từ ngữ dưới đây được hiểu và giải thích như sau:</w:t>
       </w:r>
     </w:p>
     <w:p>
       <w:pPr>
-        <w:spacing w:after="60" w:before="20" w:line="276" w:lineRule="auto"/>
-        <w:ind w:left="360"/>
-        <w:jc w:val="left"/>
-      </w:pPr>
-      <w:r>
-        <w:t>•  Xét thấy Bên A có nhu cầu thuê Bên B cung ứng các dịch vụ số nêu trên phục vụ hoạt động sản xuất, kinh doanh, xúc tiến thương mại của Bên A theo các Đơn Đặt Hàng (Service Order) và Bảng Đặc Tả Công Việc (SOW) phát sinh từng thời kỳ;</w:t>
-      </w:r>
-    </w:p>
-    <w:p>
-      <w:pPr>
-        <w:spacing w:after="60" w:before="20" w:line="276" w:lineRule="auto"/>
-        <w:ind w:left="360"/>
-        <w:jc w:val="left"/>
-      </w:pPr>
-      <w:r>
-        <w:t>•  Căn cứ Bộ luật Dân sự 2015, Luật Thương mại 2005, Luật Giao dịch điện tử 2023, Luật Sở hữu trí tuệ sửa đổi 2022, Luật Quảng cáo và Luật Bảo vệ dữ liệu cá nhân 2025;</w:t>
-      </w:r>
-    </w:p>
-    <w:p>
-      <w:pPr>
-        <w:spacing w:after="80" w:before="0" w:line="276" w:lineRule="auto"/>
-        <w:jc w:val="left"/>
-      </w:pPr>
-      <w:r>
-        <w:t>Hai Bên tự nguyện thỏa thuận và thống nhất ký kết Hợp đồng Khung này với các điều khoản và điều kiện sau đây:</w:t>
-      </w:r>
-    </w:p>
-    <w:p>
-      <w:pPr>
-        <w:spacing w:after="120" w:before="80"/>
-      </w:pPr>
-      <w:r>
-        <w:rPr>
-          <w:color w:val="CBD5E1"/>
-        </w:rPr>
-        <w:t>―――――――――――――――――――――――――――――――――――――――――――――――――――――――</w:t>
-      </w:r>
-    </w:p>
-    <w:p>
-      <w:pPr>
-        <w:spacing w:before="160" w:after="60"/>
-      </w:pPr>
-      <w:r>
-        <w:rPr>
-          <w:b/>
-          <w:color w:val="0D7647"/>
-          <w:sz w:val="23"/>
-        </w:rPr>
-        <w:t>ĐIỀU 1: ĐỊNH NGHĨA VÀ GIẢI THÍCH TỪ NGỮ</w:t>
-      </w:r>
-    </w:p>
-    <w:p>
-      <w:pPr>
-        <w:spacing w:after="80" w:before="0" w:line="276" w:lineRule="auto"/>
-        <w:jc w:val="left"/>
-      </w:pPr>
-      <w:r>
-        <w:t>Trong Hợp đồng này, các từ ngữ dưới đây được hiểu và giải thích như sau:</w:t>
-      </w:r>
-    </w:p>
-    <w:p>
-      <w:pPr>
-        <w:spacing w:after="80" w:before="0" w:line="276" w:lineRule="auto"/>
-        <w:jc w:val="left"/>
+        <w:spacing w:before="20" w:after="60" w:line="276" w:lineRule="auto"/>
+        <w:jc w:val="both"/>
       </w:pPr>
       <w:r>
         <w:t xml:space="preserve">1.1. </w:t>
@@ -566,8 +791,8 @@
     </w:p>
     <w:p>
       <w:pPr>
-        <w:spacing w:after="80" w:before="0" w:line="276" w:lineRule="auto"/>
-        <w:jc w:val="left"/>
+        <w:spacing w:before="20" w:after="60" w:line="276" w:lineRule="auto"/>
+        <w:jc w:val="both"/>
       </w:pPr>
       <w:r>
         <w:t xml:space="preserve">1.2. </w:t>
@@ -584,8 +809,8 @@
     </w:p>
     <w:p>
       <w:pPr>
-        <w:spacing w:after="80" w:before="0" w:line="276" w:lineRule="auto"/>
-        <w:jc w:val="left"/>
+        <w:spacing w:before="20" w:after="60" w:line="276" w:lineRule="auto"/>
+        <w:jc w:val="both"/>
       </w:pPr>
       <w:r>
         <w:t xml:space="preserve">1.3. </w:t>
@@ -602,8 +827,8 @@
     </w:p>
     <w:p>
       <w:pPr>
-        <w:spacing w:after="80" w:before="0" w:line="276" w:lineRule="auto"/>
-        <w:jc w:val="left"/>
+        <w:spacing w:before="20" w:after="60" w:line="276" w:lineRule="auto"/>
+        <w:jc w:val="both"/>
       </w:pPr>
       <w:r>
         <w:t xml:space="preserve">1.4. </w:t>
@@ -620,8 +845,8 @@
     </w:p>
     <w:p>
       <w:pPr>
-        <w:spacing w:after="80" w:before="0" w:line="276" w:lineRule="auto"/>
-        <w:jc w:val="left"/>
+        <w:spacing w:before="20" w:after="60" w:line="276" w:lineRule="auto"/>
+        <w:jc w:val="both"/>
       </w:pPr>
       <w:r>
         <w:t xml:space="preserve">1.5. </w:t>
@@ -638,8 +863,8 @@
     </w:p>
     <w:p>
       <w:pPr>
-        <w:spacing w:after="80" w:before="0" w:line="276" w:lineRule="auto"/>
-        <w:jc w:val="left"/>
+        <w:spacing w:before="20" w:after="60" w:line="276" w:lineRule="auto"/>
+        <w:jc w:val="both"/>
       </w:pPr>
       <w:r>
         <w:t xml:space="preserve">1.6. </w:t>
@@ -656,8 +881,8 @@
     </w:p>
     <w:p>
       <w:pPr>
-        <w:spacing w:after="80" w:before="0" w:line="276" w:lineRule="auto"/>
-        <w:jc w:val="left"/>
+        <w:spacing w:before="20" w:after="60" w:line="276" w:lineRule="auto"/>
+        <w:jc w:val="both"/>
       </w:pPr>
       <w:r>
         <w:t xml:space="preserve">1.7. </w:t>
@@ -674,32 +899,22 @@
     </w:p>
     <w:p>
       <w:pPr>
-        <w:spacing w:after="120" w:before="80"/>
+        <w:spacing w:before="180" w:after="60" w:line="276" w:lineRule="auto"/>
+        <w:jc w:val="left"/>
       </w:pPr>
       <w:r>
         <w:rPr>
-          <w:color w:val="CBD5E1"/>
+          <w:b/>
+          <w:color w:val="0F172A"/>
+          <w:sz w:val="22"/>
         </w:rPr>
-        <w:t>―――――――――――――――――――――――――――――――――――――――――――――――――――――――</w:t>
+        <w:t>ĐIỀU 2: NGUYÊN TẮC CUNG CẤP DỊCH VỤ &amp; QUY TRÌNH ĐẶT HÀNG</w:t>
       </w:r>
     </w:p>
     <w:p>
       <w:pPr>
-        <w:spacing w:before="160" w:after="60"/>
-      </w:pPr>
-      <w:r>
-        <w:rPr>
-          <w:b/>
-          <w:color w:val="0D7647"/>
-          <w:sz w:val="23"/>
-        </w:rPr>
-        <w:t>ĐIỀU 2: NGUYÊN TẮC CUNG CẤP DỊCH VỤ &amp; QUY TRÌNH ĐẶT HÀNG</w:t>
-      </w:r>
-    </w:p>
-    <w:p>
-      <w:pPr>
-        <w:spacing w:after="80" w:before="0" w:line="276" w:lineRule="auto"/>
-        <w:jc w:val="left"/>
+        <w:spacing w:before="20" w:after="60" w:line="276" w:lineRule="auto"/>
+        <w:jc w:val="both"/>
       </w:pPr>
       <w:r>
         <w:t xml:space="preserve">2.1. </w:t>
@@ -716,8 +931,8 @@
     </w:p>
     <w:p>
       <w:pPr>
-        <w:spacing w:after="80" w:before="0" w:line="276" w:lineRule="auto"/>
-        <w:jc w:val="left"/>
+        <w:spacing w:before="20" w:after="60" w:line="276" w:lineRule="auto"/>
+        <w:jc w:val="both"/>
       </w:pPr>
       <w:r>
         <w:t xml:space="preserve">2.2. </w:t>
@@ -734,9 +949,8 @@
     </w:p>
     <w:p>
       <w:pPr>
-        <w:spacing w:after="60" w:before="20" w:line="276" w:lineRule="auto"/>
-        <w:ind w:left="288"/>
-        <w:jc w:val="left"/>
+        <w:spacing w:before="20" w:after="60" w:line="276" w:lineRule="auto"/>
+        <w:jc w:val="both"/>
       </w:pPr>
       <w:r>
         <w:t>1. Đơn Đặt Hàng (Service Order) và Bảng SOW có ngày ký mới nhất;</w:t>
@@ -744,9 +958,8 @@
     </w:p>
     <w:p>
       <w:pPr>
-        <w:spacing w:after="60" w:before="20" w:line="276" w:lineRule="auto"/>
-        <w:ind w:left="288"/>
-        <w:jc w:val="left"/>
+        <w:spacing w:before="20" w:after="60" w:line="276" w:lineRule="auto"/>
+        <w:jc w:val="both"/>
       </w:pPr>
       <w:r>
         <w:t>2. Phụ lục kỹ thuật chuyên ngành tương ứng với dịch vụ;</w:t>
@@ -754,9 +967,8 @@
     </w:p>
     <w:p>
       <w:pPr>
-        <w:spacing w:after="60" w:before="20" w:line="276" w:lineRule="auto"/>
-        <w:ind w:left="288"/>
-        <w:jc w:val="left"/>
+        <w:spacing w:before="20" w:after="60" w:line="276" w:lineRule="auto"/>
+        <w:jc w:val="both"/>
       </w:pPr>
       <w:r>
         <w:t>3. Hợp đồng Khung Cung Cấp Dịch Vụ (MSA);</w:t>
@@ -764,18 +976,17 @@
     </w:p>
     <w:p>
       <w:pPr>
-        <w:spacing w:after="60" w:before="20" w:line="276" w:lineRule="auto"/>
-        <w:ind w:left="288"/>
-        <w:jc w:val="left"/>
-      </w:pPr>
-      <w:r>
-        <w:t>4. Báo giá và đề xuất dịch vụ ban đầu.</w:t>
+        <w:spacing w:before="20" w:after="60" w:line="276" w:lineRule="auto"/>
+        <w:jc w:val="both"/>
+      </w:pPr>
+      <w:r>
+        <w:t xml:space="preserve">4. Báo giá và đề xuất dịch vụ ban đầu.  </w:t>
       </w:r>
     </w:p>
     <w:p>
       <w:pPr>
-        <w:spacing w:after="80" w:before="0" w:line="276" w:lineRule="auto"/>
-        <w:jc w:val="left"/>
+        <w:spacing w:before="20" w:after="60" w:line="276" w:lineRule="auto"/>
+        <w:jc w:val="both"/>
       </w:pPr>
       <w:r>
         <w:t xml:space="preserve">2.3. </w:t>
@@ -792,32 +1003,22 @@
     </w:p>
     <w:p>
       <w:pPr>
-        <w:spacing w:after="120" w:before="80"/>
+        <w:spacing w:before="180" w:after="60" w:line="276" w:lineRule="auto"/>
+        <w:jc w:val="left"/>
       </w:pPr>
       <w:r>
         <w:rPr>
-          <w:color w:val="CBD5E1"/>
+          <w:b/>
+          <w:color w:val="0F172A"/>
+          <w:sz w:val="22"/>
         </w:rPr>
-        <w:t>―――――――――――――――――――――――――――――――――――――――――――――――――――――――</w:t>
+        <w:t>ĐIỀU 3: PHẠM VI DỊCH VỤ, TIÊU CHUẨN KỸ THUẬT VÀ NGHĨA VỤ NỖ LỰC</w:t>
       </w:r>
     </w:p>
     <w:p>
       <w:pPr>
-        <w:spacing w:before="160" w:after="60"/>
-      </w:pPr>
-      <w:r>
-        <w:rPr>
-          <w:b/>
-          <w:color w:val="0D7647"/>
-          <w:sz w:val="23"/>
-        </w:rPr>
-        <w:t>ĐIỀU 3: PHẠM VI DỊCH VỤ, TIÊU CHUẨN KỸ THUẬT VÀ NGHĨA VỤ NỖ LỰC</w:t>
-      </w:r>
-    </w:p>
-    <w:p>
-      <w:pPr>
-        <w:spacing w:after="80" w:before="0" w:line="276" w:lineRule="auto"/>
-        <w:jc w:val="left"/>
+        <w:spacing w:before="20" w:after="60" w:line="276" w:lineRule="auto"/>
+        <w:jc w:val="both"/>
       </w:pPr>
       <w:r>
         <w:t xml:space="preserve">3.1. </w:t>
@@ -834,15 +1035,15 @@
     </w:p>
     <w:p>
       <w:pPr>
-        <w:spacing w:after="60" w:before="20" w:line="276" w:lineRule="auto"/>
+        <w:spacing w:before="20" w:after="40" w:line="276" w:lineRule="auto"/>
         <w:ind w:left="360"/>
-        <w:jc w:val="left"/>
+        <w:jc w:val="both"/>
       </w:pPr>
       <w:r>
         <w:rPr>
           <w:i/>
         </w:rPr>
-        <w:t>•  Dịch vụ 1:</w:t>
+        <w:t>Dịch vụ 1:</w:t>
       </w:r>
       <w:r>
         <w:t xml:space="preserve"> Tư vấn, thiết kế giao diện UI/UX và phát triển Website / Landing Page;</w:t>
@@ -850,15 +1051,15 @@
     </w:p>
     <w:p>
       <w:pPr>
-        <w:spacing w:after="60" w:before="20" w:line="276" w:lineRule="auto"/>
+        <w:spacing w:before="20" w:after="40" w:line="276" w:lineRule="auto"/>
         <w:ind w:left="360"/>
-        <w:jc w:val="left"/>
+        <w:jc w:val="both"/>
       </w:pPr>
       <w:r>
         <w:rPr>
           <w:i/>
         </w:rPr>
-        <w:t>•  Dịch vụ 2:</w:t>
+        <w:t>Dịch vụ 2:</w:t>
       </w:r>
       <w:r>
         <w:t xml:space="preserve"> Khởi tạo, chuẩn hóa dữ liệu định danh (NAP) và tối ưu hóa Google Business Profile (Google Maps &amp; Local SEO);</w:t>
@@ -866,15 +1067,15 @@
     </w:p>
     <w:p>
       <w:pPr>
-        <w:spacing w:after="60" w:before="20" w:line="276" w:lineRule="auto"/>
+        <w:spacing w:before="20" w:after="40" w:line="276" w:lineRule="auto"/>
         <w:ind w:left="360"/>
-        <w:jc w:val="left"/>
+        <w:jc w:val="both"/>
       </w:pPr>
       <w:r>
         <w:rPr>
           <w:i/>
         </w:rPr>
-        <w:t>•  Dịch vụ 3:</w:t>
+        <w:t>Dịch vụ 3:</w:t>
       </w:r>
       <w:r>
         <w:t xml:space="preserve"> Thiết lập cấu hình kỹ thuật, nghiên cứu từ khóa, thiết kế thông điệp và quản trị tối ưu chiến dịch quảng cáo Google Ads;</w:t>
@@ -882,15 +1083,15 @@
     </w:p>
     <w:p>
       <w:pPr>
-        <w:spacing w:after="60" w:before="20" w:line="276" w:lineRule="auto"/>
+        <w:spacing w:before="20" w:after="40" w:line="276" w:lineRule="auto"/>
         <w:ind w:left="360"/>
-        <w:jc w:val="left"/>
+        <w:jc w:val="both"/>
       </w:pPr>
       <w:r>
         <w:rPr>
           <w:i/>
         </w:rPr>
-        <w:t>•  Dịch vụ 4:</w:t>
+        <w:t>Dịch vụ 4:</w:t>
       </w:r>
       <w:r>
         <w:t xml:space="preserve"> Xây dựng kế hoạch nội dung, sản xuất ấn phẩm truyền thông và chăm sóc kênh số (Content Marketing);</w:t>
@@ -898,24 +1099,24 @@
     </w:p>
     <w:p>
       <w:pPr>
-        <w:spacing w:after="60" w:before="20" w:line="276" w:lineRule="auto"/>
+        <w:spacing w:before="20" w:after="40" w:line="276" w:lineRule="auto"/>
         <w:ind w:left="360"/>
-        <w:jc w:val="left"/>
+        <w:jc w:val="both"/>
       </w:pPr>
       <w:r>
         <w:rPr>
           <w:i/>
         </w:rPr>
-        <w:t>•  Dịch vụ 5:</w:t>
-      </w:r>
-      <w:r>
-        <w:t xml:space="preserve"> Thiết kế hệ thống quản trị dữ liệu khách hàng (CRM), luồng tự động hóa (Automation workflows) và tích hợp API.  </w:t>
+        <w:t>Dịch vụ 5:</w:t>
+      </w:r>
+      <w:r>
+        <w:t xml:space="preserve"> Thiết kế hệ thống quản trị dữ liệu khách hàng (CRM), luồng tự động hóa (Automation workflows) và tích hợp API.</w:t>
       </w:r>
     </w:p>
     <w:p>
       <w:pPr>
-        <w:spacing w:after="80" w:before="0" w:line="276" w:lineRule="auto"/>
-        <w:jc w:val="left"/>
+        <w:spacing w:before="20" w:after="60" w:line="276" w:lineRule="auto"/>
+        <w:jc w:val="both"/>
       </w:pPr>
       <w:r>
         <w:t xml:space="preserve">3.2. </w:t>
@@ -929,8 +1130,8 @@
     </w:p>
     <w:p>
       <w:pPr>
-        <w:spacing w:after="80" w:before="0" w:line="276" w:lineRule="auto"/>
-        <w:jc w:val="left"/>
+        <w:spacing w:before="20" w:after="60" w:line="276" w:lineRule="auto"/>
+        <w:jc w:val="both"/>
       </w:pPr>
       <w:r>
         <w:t xml:space="preserve">Căn cứ Điều 80 Luật Thương mại 2005, Các Bên thống nhất rằng đối với các dịch vụ phụ thuộc vào thuật toán tìm kiếm, đấu thầu quảng cáo tự động và thị trường (Google Maps, Google Ads, SEO, Content Marketing), nghĩa vụ của Bên B là </w:t>
@@ -956,48 +1157,48 @@
     </w:p>
     <w:p>
       <w:pPr>
-        <w:spacing w:after="60" w:before="20" w:line="276" w:lineRule="auto"/>
+        <w:spacing w:before="20" w:after="40" w:line="276" w:lineRule="auto"/>
         <w:ind w:left="360"/>
-        <w:jc w:val="left"/>
-      </w:pPr>
-      <w:r>
-        <w:t>•  Thứ hạng từ khóa vĩnh viễn (Top 1 Google, Top 3 Maps);</w:t>
+        <w:jc w:val="both"/>
+      </w:pPr>
+      <w:r>
+        <w:t>Thứ hạng từ khóa vĩnh viễn (Top 1 Google, Top 3 Maps);</w:t>
       </w:r>
     </w:p>
     <w:p>
       <w:pPr>
-        <w:spacing w:after="60" w:before="20" w:line="276" w:lineRule="auto"/>
+        <w:spacing w:before="20" w:after="40" w:line="276" w:lineRule="auto"/>
         <w:ind w:left="360"/>
-        <w:jc w:val="left"/>
-      </w:pPr>
-      <w:r>
-        <w:t>•  Số lượng khách hàng tiềm năng (Leads), doanh thu bán hàng, tỷ suất hoàn vốn (ROI/ROAS);</w:t>
+        <w:jc w:val="both"/>
+      </w:pPr>
+      <w:r>
+        <w:t>Số lượng khách hàng tiềm năng (Leads), doanh thu bán hàng, tỷ suất hoàn vốn (ROI/ROAS);</w:t>
       </w:r>
     </w:p>
     <w:p>
       <w:pPr>
-        <w:spacing w:after="60" w:before="20" w:line="276" w:lineRule="auto"/>
+        <w:spacing w:before="20" w:after="40" w:line="276" w:lineRule="auto"/>
         <w:ind w:left="360"/>
-        <w:jc w:val="left"/>
-      </w:pPr>
-      <w:r>
-        <w:t>•  Chi phí mỗi lượt nhấp (CPC) hoặc chi phí mỗi chuyển đổi (CPA) cố định;</w:t>
+        <w:jc w:val="both"/>
+      </w:pPr>
+      <w:r>
+        <w:t>Chi phí mỗi lượt nhấp (CPC) hoặc chi phí mỗi chuyển đổi (CPA) cố định;</w:t>
       </w:r>
     </w:p>
     <w:p>
       <w:pPr>
-        <w:spacing w:after="60" w:before="20" w:line="276" w:lineRule="auto"/>
+        <w:spacing w:before="20" w:after="40" w:line="276" w:lineRule="auto"/>
         <w:ind w:left="360"/>
-        <w:jc w:val="left"/>
-      </w:pPr>
-      <w:r>
-        <w:t xml:space="preserve">•  Việc Google, Meta hay bất kỳ nền tảng nào chắc chắn 100% phê duyệt hồ sơ hoặc duyệt mẫu quảng cáo.  </w:t>
+        <w:jc w:val="both"/>
+      </w:pPr>
+      <w:r>
+        <w:t>Việc Google, Meta hay bất kỳ nền tảng nào chắc chắn 100% phê duyệt hồ sơ hoặc duyệt mẫu quảng cáo.</w:t>
       </w:r>
     </w:p>
     <w:p>
       <w:pPr>
-        <w:spacing w:after="80" w:before="0" w:line="276" w:lineRule="auto"/>
-        <w:jc w:val="left"/>
+        <w:spacing w:before="20" w:after="60" w:line="276" w:lineRule="auto"/>
+        <w:jc w:val="both"/>
       </w:pPr>
       <w:r>
         <w:t xml:space="preserve">3.3. </w:t>
@@ -1014,32 +1215,22 @@
     </w:p>
     <w:p>
       <w:pPr>
-        <w:spacing w:after="120" w:before="80"/>
+        <w:spacing w:before="180" w:after="60" w:line="276" w:lineRule="auto"/>
+        <w:jc w:val="left"/>
       </w:pPr>
       <w:r>
         <w:rPr>
-          <w:color w:val="CBD5E1"/>
+          <w:b/>
+          <w:color w:val="0F172A"/>
+          <w:sz w:val="22"/>
         </w:rPr>
-        <w:t>―――――――――――――――――――――――――――――――――――――――――――――――――――――――</w:t>
+        <w:t>ĐIỀU 4: GIÁ DỊCH VỤ, BÓC TÁCH DÒNG TIỀN VÀ NGHĨA VỤ THUẾ</w:t>
       </w:r>
     </w:p>
     <w:p>
       <w:pPr>
-        <w:spacing w:before="160" w:after="60"/>
-      </w:pPr>
-      <w:r>
-        <w:rPr>
-          <w:b/>
-          <w:color w:val="0D7647"/>
-          <w:sz w:val="23"/>
-        </w:rPr>
-        <w:t>ĐIỀU 4: GIÁ DỊCH VỤ, BÓC TÁCH DÒNG TIỀN VÀ NGHĨA VỤ THUẾ</w:t>
-      </w:r>
-    </w:p>
-    <w:p>
-      <w:pPr>
-        <w:spacing w:after="80" w:before="0" w:line="276" w:lineRule="auto"/>
-        <w:jc w:val="left"/>
+        <w:spacing w:before="20" w:after="60" w:line="276" w:lineRule="auto"/>
+        <w:jc w:val="both"/>
       </w:pPr>
       <w:r>
         <w:t xml:space="preserve">4.1. </w:t>
@@ -1053,8 +1244,8 @@
     </w:p>
     <w:p>
       <w:pPr>
-        <w:spacing w:after="80" w:before="0" w:line="276" w:lineRule="auto"/>
-        <w:jc w:val="left"/>
+        <w:spacing w:before="20" w:after="60" w:line="276" w:lineRule="auto"/>
+        <w:jc w:val="both"/>
       </w:pPr>
       <w:r>
         <w:t>Nhằm bảo đảm tính tuân thủ pháp luật thuế và minh bạch tài chính, Các Bên cam kết phân định rạch ròi 3 khoản tiền sau:</w:t>
@@ -1062,15 +1253,15 @@
     </w:p>
     <w:p>
       <w:pPr>
-        <w:spacing w:after="60" w:before="20" w:line="276" w:lineRule="auto"/>
+        <w:spacing w:before="20" w:after="40" w:line="276" w:lineRule="auto"/>
         <w:ind w:left="360"/>
-        <w:jc w:val="left"/>
+        <w:jc w:val="both"/>
       </w:pPr>
       <w:r>
         <w:rPr>
           <w:b/>
         </w:rPr>
-        <w:t>•  (A) Phí Dịch Vụ Bên B (Service Fee):</w:t>
+        <w:t>(A) Phí Dịch Vụ Bên B (Service Fee):</w:t>
       </w:r>
       <w:r>
         <w:t xml:space="preserve"> Là khoản thù lao chi trả cho công sức trí tuệ, chuyên môn kỹ thuật của Bên B. Đây là </w:t>
@@ -1087,15 +1278,15 @@
     </w:p>
     <w:p>
       <w:pPr>
-        <w:spacing w:after="60" w:before="20" w:line="276" w:lineRule="auto"/>
+        <w:spacing w:before="20" w:after="40" w:line="276" w:lineRule="auto"/>
         <w:ind w:left="360"/>
-        <w:jc w:val="left"/>
+        <w:jc w:val="both"/>
       </w:pPr>
       <w:r>
         <w:rPr>
           <w:b/>
         </w:rPr>
-        <w:t>•  (B) Ngân Sách Quảng Cáo Trả Nền Tảng (Media Spend):</w:t>
+        <w:t>(B) Ngân Sách Quảng Cáo Trả Nền Tảng (Media Spend):</w:t>
       </w:r>
       <w:r>
         <w:t xml:space="preserve"> Là khoản tiền thanh toán trực tiếp cho Google / Meta để mua lượt hiển thị/click. Khoản tiền này thuộc quyền sở hữu của Bên A và </w:t>
@@ -1112,24 +1303,24 @@
     </w:p>
     <w:p>
       <w:pPr>
-        <w:spacing w:after="60" w:before="20" w:line="276" w:lineRule="auto"/>
+        <w:spacing w:before="20" w:after="40" w:line="276" w:lineRule="auto"/>
         <w:ind w:left="360"/>
-        <w:jc w:val="left"/>
+        <w:jc w:val="both"/>
       </w:pPr>
       <w:r>
         <w:rPr>
           <w:b/>
         </w:rPr>
-        <w:t>•  (C) Chi Phí Công Cụ &amp; Dịch Vụ Bên Thứ Ba (Third-party Costs):</w:t>
-      </w:r>
-      <w:r>
-        <w:t xml:space="preserve"> Phí duy trì tên miền, phí thuê hạ tầng máy chủ đặc thù, phí bản quyền API/SaaS bên thứ ba (OpenAI, Resend, Zalo ZNS). Chi phí này do Bên A trực tiếp chi trả cho nhà cung cấp theo mức tiêu thụ thực tế.  </w:t>
+        <w:t>(C) Chi Phí Công Cụ &amp; Dịch Vụ Bên Thứ Ba (Third-party Costs):</w:t>
+      </w:r>
+      <w:r>
+        <w:t xml:space="preserve"> Phí duy trì tên miền, phí thuê hạ tầng máy chủ đặc thù, phí bản quyền API/SaaS bên thứ ba (OpenAI, Resend, Zalo ZNS). Chi phí này do Bên A trực tiếp chi trả cho nhà cung cấp theo mức tiêu thụ thực tế.</w:t>
       </w:r>
     </w:p>
     <w:p>
       <w:pPr>
-        <w:spacing w:after="80" w:before="0" w:line="276" w:lineRule="auto"/>
-        <w:jc w:val="left"/>
+        <w:spacing w:before="20" w:after="60" w:line="276" w:lineRule="auto"/>
+        <w:jc w:val="both"/>
       </w:pPr>
       <w:r>
         <w:t xml:space="preserve">4.2. </w:t>
@@ -1143,15 +1334,15 @@
     </w:p>
     <w:p>
       <w:pPr>
-        <w:spacing w:after="60" w:before="20" w:line="276" w:lineRule="auto"/>
+        <w:spacing w:before="20" w:after="40" w:line="276" w:lineRule="auto"/>
         <w:ind w:left="360"/>
-        <w:jc w:val="left"/>
+        <w:jc w:val="both"/>
       </w:pPr>
       <w:r>
         <w:rPr>
           <w:i/>
         </w:rPr>
-        <w:t>•  Phương án Chuẩn (Khuyến nghị 1):</w:t>
+        <w:t>Phương án Chuẩn (Khuyến nghị 1):</w:t>
       </w:r>
       <w:r>
         <w:t xml:space="preserve"> Bên A tự khởi tạo hồ sơ thanh toán trên tài khoản Google Ads / Meta Ads của Bên A và tự thêm phương thức thanh toán quốc tế (Thẻ Visa/Mastercard Doanh nghiệp hoặc Cá nhân của Bên A). Google / Meta sẽ trực tiếp khấu trừ tiền quảng cáo và xuất hóa đơn điện tử có mã số thuế nhà thầu tại Việt Nam (kèm 5% thuế GTGT theo Thông tư 80/2021/TT-BTC) trực tiếp cho Bên A. Dòng tiền này hoàn toàn không chạy qua tài khoản Bên B.</w:t>
@@ -1159,15 +1350,15 @@
     </w:p>
     <w:p>
       <w:pPr>
-        <w:spacing w:after="60" w:before="20" w:line="276" w:lineRule="auto"/>
+        <w:spacing w:before="20" w:after="40" w:line="276" w:lineRule="auto"/>
         <w:ind w:left="360"/>
-        <w:jc w:val="left"/>
+        <w:jc w:val="both"/>
       </w:pPr>
       <w:r>
         <w:rPr>
           <w:i/>
         </w:rPr>
-        <w:t>•  Phương án Ủy thác Chi hộ (Chỉ áp dụng khi có văn bản thỏa thuận riêng):</w:t>
+        <w:t>Phương án Ủy thác Chi hộ (Chỉ áp dụng khi có văn bản thỏa thuận riêng):</w:t>
       </w:r>
       <w:r>
         <w:t xml:space="preserve"> Trường hợp Bên A ủy thác cho Bên B nạp tiền quảng cáo hộ, Các Bên phải tuân thủ nghiêm ngặt quy định về </w:t>
@@ -1179,13 +1370,13 @@
         <w:t>Thu hộ - Chi hộ theo Điểm d Khoản 7 Điều 5 Thông tư 219/2013/TT-BTC</w:t>
       </w:r>
       <w:r>
-        <w:t xml:space="preserve">. Bên A tạm ứng tiền vào tài khoản ngân hàng chi hộ của Bên B; Bên B không xuất hóa đơn GTGT cho khoản tiền này mà phát hành Bảng kê đối soát chi hộ khớp đúng 100% với biên lai trừ tiền của Google/Meta.  </w:t>
+        <w:t>. Bên A tạm ứng tiền vào tài khoản ngân hàng chi hộ của Bên B; Bên B không xuất hóa đơn GTGT cho khoản tiền này mà phát hành Bảng kê đối soát chi hộ khớp đúng 100% với biên lai trừ tiền của Google/Meta.</w:t>
       </w:r>
     </w:p>
     <w:p>
       <w:pPr>
-        <w:spacing w:after="80" w:before="0" w:line="276" w:lineRule="auto"/>
-        <w:jc w:val="left"/>
+        <w:spacing w:before="20" w:after="60" w:line="276" w:lineRule="auto"/>
+        <w:jc w:val="both"/>
       </w:pPr>
       <w:r>
         <w:t xml:space="preserve">4.3. </w:t>
@@ -1202,32 +1393,22 @@
     </w:p>
     <w:p>
       <w:pPr>
-        <w:spacing w:after="120" w:before="80"/>
+        <w:spacing w:before="180" w:after="60" w:line="276" w:lineRule="auto"/>
+        <w:jc w:val="left"/>
       </w:pPr>
       <w:r>
         <w:rPr>
-          <w:color w:val="CBD5E1"/>
+          <w:b/>
+          <w:color w:val="0F172A"/>
+          <w:sz w:val="22"/>
         </w:rPr>
-        <w:t>―――――――――――――――――――――――――――――――――――――――――――――――――――――――</w:t>
+        <w:t>ĐIỀU 5: TIỀN ĐẶT CỌC, TIẾN ĐỘ THANH TOÁN VÀ XỬ LÝ CHẬM THANH TOÁN</w:t>
       </w:r>
     </w:p>
     <w:p>
       <w:pPr>
-        <w:spacing w:before="160" w:after="60"/>
-      </w:pPr>
-      <w:r>
-        <w:rPr>
-          <w:b/>
-          <w:color w:val="0D7647"/>
-          <w:sz w:val="23"/>
-        </w:rPr>
-        <w:t>ĐIỀU 5: TIỀN ĐẶT CỌC, TIẾN ĐỘ THANH TOÁN VÀ XỬ LÝ CHẬM THANH TOÁN</w:t>
-      </w:r>
-    </w:p>
-    <w:p>
-      <w:pPr>
-        <w:spacing w:after="80" w:before="0" w:line="276" w:lineRule="auto"/>
-        <w:jc w:val="left"/>
+        <w:spacing w:before="20" w:after="60" w:line="276" w:lineRule="auto"/>
+        <w:jc w:val="both"/>
       </w:pPr>
       <w:r>
         <w:t xml:space="preserve">5.1. </w:t>
@@ -1241,8 +1422,8 @@
     </w:p>
     <w:p>
       <w:pPr>
-        <w:spacing w:after="80" w:before="0" w:line="276" w:lineRule="auto"/>
-        <w:jc w:val="left"/>
+        <w:spacing w:before="20" w:after="60" w:line="276" w:lineRule="auto"/>
+        <w:jc w:val="both"/>
       </w:pPr>
       <w:r>
         <w:t xml:space="preserve">Khoản thanh toán Đợt 1 (thường từ 30% đến 50% tổng giá trị hợp đồng dịch vụ) được hai bên xác lập rõ ràng là </w:t>
@@ -1259,22 +1440,22 @@
     </w:p>
     <w:p>
       <w:pPr>
-        <w:spacing w:after="60" w:before="20" w:line="276" w:lineRule="auto"/>
+        <w:spacing w:before="20" w:after="40" w:line="276" w:lineRule="auto"/>
         <w:ind w:left="360"/>
-        <w:jc w:val="left"/>
-      </w:pPr>
-      <w:r>
-        <w:t>•  Tiền đặt cọc được cấn trừ vào đợt thanh toán cuối cùng khi Các Bên ký Biên bản nghiệm thu tổng thể.</w:t>
+        <w:jc w:val="both"/>
+      </w:pPr>
+      <w:r>
+        <w:t>Tiền đặt cọc được cấn trừ vào đợt thanh toán cuối cùng khi Các Bên ký Biên bản nghiệm thu tổng thể.</w:t>
       </w:r>
     </w:p>
     <w:p>
       <w:pPr>
-        <w:spacing w:after="60" w:before="20" w:line="276" w:lineRule="auto"/>
+        <w:spacing w:before="20" w:after="40" w:line="276" w:lineRule="auto"/>
         <w:ind w:left="360"/>
-        <w:jc w:val="left"/>
-      </w:pPr>
-      <w:r>
-        <w:t xml:space="preserve">•  Trường hợp Bên A tự ý đơn phương chấm dứt Hợp đồng trái quy định hoặc từ chối thực hiện dự án không do lỗi của Bên B, Bên B được quyền </w:t>
+        <w:jc w:val="both"/>
+      </w:pPr>
+      <w:r>
+        <w:t xml:space="preserve">Trường hợp Bên A tự ý đơn phương chấm dứt Hợp đồng trái quy định hoặc từ chối thực hiện dự án không do lỗi của Bên B, Bên B được quyền </w:t>
       </w:r>
       <w:r>
         <w:rPr>
@@ -1288,18 +1469,18 @@
     </w:p>
     <w:p>
       <w:pPr>
-        <w:spacing w:after="60" w:before="20" w:line="276" w:lineRule="auto"/>
+        <w:spacing w:before="20" w:after="40" w:line="276" w:lineRule="auto"/>
         <w:ind w:left="360"/>
-        <w:jc w:val="left"/>
-      </w:pPr>
-      <w:r>
-        <w:t xml:space="preserve">•  Trường hợp Bên B từ chối thực hiện Hợp đồng mà không thuộc các trường hợp miễn trách nhiệm, Bên B sẽ hoàn trả lại đúng số tiền đặt cọc đã nhận cho Bên A; Các Bên thỏa thuận loại trừ nghĩa vụ phạt cọc gấp đôi quy định tại Khoản 2 Điều 328 BLDS 2015.  </w:t>
+        <w:jc w:val="both"/>
+      </w:pPr>
+      <w:r>
+        <w:t>Trường hợp Bên B từ chối thực hiện Hợp đồng mà không thuộc các trường hợp miễn trách nhiệm, Bên B sẽ hoàn trả lại đúng số tiền đặt cọc đã nhận cho Bên A; Các Bên thỏa thuận loại trừ nghĩa vụ phạt cọc gấp đôi quy định tại Khoản 2 Điều 328 BLDS 2015.</w:t>
       </w:r>
     </w:p>
     <w:p>
       <w:pPr>
-        <w:spacing w:after="80" w:before="0" w:line="276" w:lineRule="auto"/>
-        <w:jc w:val="left"/>
+        <w:spacing w:before="20" w:after="60" w:line="276" w:lineRule="auto"/>
+        <w:jc w:val="both"/>
       </w:pPr>
       <w:r>
         <w:t xml:space="preserve">5.2. </w:t>
@@ -1325,8 +1506,8 @@
     </w:p>
     <w:p>
       <w:pPr>
-        <w:spacing w:after="80" w:before="0" w:line="276" w:lineRule="auto"/>
-        <w:jc w:val="left"/>
+        <w:spacing w:before="20" w:after="60" w:line="276" w:lineRule="auto"/>
+        <w:jc w:val="both"/>
       </w:pPr>
       <w:r>
         <w:t xml:space="preserve">5.3. </w:t>
@@ -1340,8 +1521,8 @@
     </w:p>
     <w:p>
       <w:pPr>
-        <w:spacing w:after="80" w:before="0" w:line="276" w:lineRule="auto"/>
-        <w:jc w:val="left"/>
+        <w:spacing w:before="20" w:after="60" w:line="276" w:lineRule="auto"/>
+        <w:jc w:val="both"/>
       </w:pPr>
       <w:r>
         <w:t>Trường hợp Bên A chậm trễ thanh toán bất kỳ khoản tiền nào quá hạn quy định:</w:t>
@@ -1349,15 +1530,15 @@
     </w:p>
     <w:p>
       <w:pPr>
-        <w:spacing w:after="60" w:before="20" w:line="276" w:lineRule="auto"/>
+        <w:spacing w:before="20" w:after="40" w:line="276" w:lineRule="auto"/>
         <w:ind w:left="360"/>
-        <w:jc w:val="left"/>
+        <w:jc w:val="both"/>
       </w:pPr>
       <w:r>
         <w:rPr>
           <w:i/>
         </w:rPr>
-        <w:t>•  Tiền lãi chậm trả:</w:t>
+        <w:t>Tiền lãi chậm trả:</w:t>
       </w:r>
       <w:r>
         <w:t xml:space="preserve"> Bên A phải chịu thêm tiền lãi chậm thanh toán tính trên số tiền chậm trả theo mức lãi suất </w:t>
@@ -1374,15 +1555,15 @@
     </w:p>
     <w:p>
       <w:pPr>
-        <w:spacing w:after="60" w:before="20" w:line="276" w:lineRule="auto"/>
+        <w:spacing w:before="20" w:after="40" w:line="276" w:lineRule="auto"/>
         <w:ind w:left="360"/>
-        <w:jc w:val="left"/>
+        <w:jc w:val="both"/>
       </w:pPr>
       <w:r>
         <w:rPr>
           <w:i/>
         </w:rPr>
-        <w:t>•  Phạt vi phạm hợp đồng:</w:t>
+        <w:t>Phạt vi phạm hợp đồng:</w:t>
       </w:r>
       <w:r>
         <w:t xml:space="preserve"> Nếu việc chậm thanh toán kéo dài quá mười lăm (15) ngày làm việc, Bên A phải chịu thêm khoản tiền phạt vi phạm hợp đồng bằng </w:t>
@@ -1399,32 +1580,22 @@
     </w:p>
     <w:p>
       <w:pPr>
-        <w:spacing w:after="120" w:before="80"/>
+        <w:spacing w:before="180" w:after="60" w:line="276" w:lineRule="auto"/>
+        <w:jc w:val="left"/>
       </w:pPr>
       <w:r>
         <w:rPr>
-          <w:color w:val="CBD5E1"/>
+          <w:b/>
+          <w:color w:val="0F172A"/>
+          <w:sz w:val="22"/>
         </w:rPr>
-        <w:t>―――――――――――――――――――――――――――――――――――――――――――――――――――――――</w:t>
+        <w:t>ĐIỀU 6: QUYỀN TẠM DỪNG CUNG CẤP DỊCH VỤ HỢP PHÁP (SERVICE SUSPENSION)</w:t>
       </w:r>
     </w:p>
     <w:p>
       <w:pPr>
-        <w:spacing w:before="160" w:after="60"/>
-      </w:pPr>
-      <w:r>
-        <w:rPr>
-          <w:b/>
-          <w:color w:val="0D7647"/>
-          <w:sz w:val="23"/>
-        </w:rPr>
-        <w:t>ĐIỀU 6: QUYỀN TẠM DỪNG CUNG CẤP DỊCH VỤ HỢP PHÁP (SERVICE SUSPENSION)</w:t>
-      </w:r>
-    </w:p>
-    <w:p>
-      <w:pPr>
-        <w:spacing w:after="80" w:before="0" w:line="276" w:lineRule="auto"/>
-        <w:jc w:val="left"/>
+        <w:spacing w:before="20" w:after="60" w:line="276" w:lineRule="auto"/>
+        <w:jc w:val="both"/>
       </w:pPr>
       <w:r>
         <w:t xml:space="preserve">6.1. </w:t>
@@ -1441,8 +1612,8 @@
     </w:p>
     <w:p>
       <w:pPr>
-        <w:spacing w:after="80" w:before="0" w:line="276" w:lineRule="auto"/>
-        <w:jc w:val="left"/>
+        <w:spacing w:before="20" w:after="60" w:line="276" w:lineRule="auto"/>
+        <w:jc w:val="both"/>
       </w:pPr>
       <w:r>
         <w:t xml:space="preserve">a) Bên A chậm thực hiện nghĩa vụ thanh toán quá </w:t>
@@ -1459,8 +1630,8 @@
     </w:p>
     <w:p>
       <w:pPr>
-        <w:spacing w:after="80" w:before="0" w:line="276" w:lineRule="auto"/>
-        <w:jc w:val="left"/>
+        <w:spacing w:before="20" w:after="60" w:line="276" w:lineRule="auto"/>
+        <w:jc w:val="both"/>
       </w:pPr>
       <w:r>
         <w:t xml:space="preserve">b) Bên A không cung cấp, cung cấp chậm trễ tài liệu hoặc không phản hồi ý kiến chuyên môn quá mười lăm (15) ngày làm việc làm đình trệ toàn bộ dự án;  </w:t>
@@ -1468,8 +1639,8 @@
     </w:p>
     <w:p>
       <w:pPr>
-        <w:spacing w:after="80" w:before="0" w:line="276" w:lineRule="auto"/>
-        <w:jc w:val="left"/>
+        <w:spacing w:before="20" w:after="60" w:line="276" w:lineRule="auto"/>
+        <w:jc w:val="both"/>
       </w:pPr>
       <w:r>
         <w:t xml:space="preserve">c) Bên A yêu cầu Bên B đăng tải, chạy quảng cáo các nội dung có dấu hiệu vi phạm điều cấm của pháp luật, vi phạm bản quyền hoặc vi phạm chính sách của nền tảng;  </w:t>
@@ -1477,8 +1648,8 @@
     </w:p>
     <w:p>
       <w:pPr>
-        <w:spacing w:after="80" w:before="0" w:line="276" w:lineRule="auto"/>
-        <w:jc w:val="left"/>
+        <w:spacing w:before="20" w:after="60" w:line="276" w:lineRule="auto"/>
+        <w:jc w:val="both"/>
       </w:pPr>
       <w:r>
         <w:t xml:space="preserve">d) Hệ thống hoặc tài khoản của Bên A bị tấn công mạng nghiêm trọng, nhiễm mã độc có nguy cơ làm tổn hại đến hạ tầng dùng chung của Bên B.  </w:t>
@@ -1486,8 +1657,8 @@
     </w:p>
     <w:p>
       <w:pPr>
-        <w:spacing w:after="80" w:before="0" w:line="276" w:lineRule="auto"/>
-        <w:jc w:val="left"/>
+        <w:spacing w:before="20" w:after="60" w:line="276" w:lineRule="auto"/>
+        <w:jc w:val="both"/>
       </w:pPr>
       <w:r>
         <w:t xml:space="preserve">6.2. </w:t>
@@ -1501,12 +1672,12 @@
     </w:p>
     <w:p>
       <w:pPr>
-        <w:spacing w:after="60" w:before="20" w:line="276" w:lineRule="auto"/>
+        <w:spacing w:before="20" w:after="40" w:line="276" w:lineRule="auto"/>
         <w:ind w:left="360"/>
-        <w:jc w:val="left"/>
-      </w:pPr>
-      <w:r>
-        <w:t xml:space="preserve">•  Việc tạm dừng này là hành vi thực hiện quyền tạm ngừng nghĩa vụ hợp đồng theo luật định, </w:t>
+        <w:jc w:val="both"/>
+      </w:pPr>
+      <w:r>
+        <w:t xml:space="preserve">Việc tạm dừng này là hành vi thực hiện quyền tạm ngừng nghĩa vụ hợp đồng theo luật định, </w:t>
       </w:r>
       <w:r>
         <w:rPr>
@@ -1520,35 +1691,35 @@
     </w:p>
     <w:p>
       <w:pPr>
-        <w:spacing w:after="60" w:before="20" w:line="276" w:lineRule="auto"/>
+        <w:spacing w:before="20" w:after="40" w:line="276" w:lineRule="auto"/>
         <w:ind w:left="360"/>
-        <w:jc w:val="left"/>
-      </w:pPr>
-      <w:r>
-        <w:t>•  Bên B được miễn trừ toàn bộ trách nhiệm đối với bất kỳ sự gián đoạn kinh doanh, tổn thất doanh số, sụt giảm thứ hạng tìm kiếm hay khiếu nại của khách hàng của Bên A trong thời gian bị tạm dừng.</w:t>
+        <w:jc w:val="both"/>
+      </w:pPr>
+      <w:r>
+        <w:t>Bên B được miễn trừ toàn bộ trách nhiệm đối với bất kỳ sự gián đoạn kinh doanh, tổn thất doanh số, sụt giảm thứ hạng tìm kiếm hay khiếu nại của khách hàng của Bên A trong thời gian bị tạm dừng.</w:t>
       </w:r>
     </w:p>
     <w:p>
       <w:pPr>
-        <w:spacing w:after="60" w:before="20" w:line="276" w:lineRule="auto"/>
+        <w:spacing w:before="20" w:after="40" w:line="276" w:lineRule="auto"/>
         <w:ind w:left="360"/>
-        <w:jc w:val="left"/>
-      </w:pPr>
-      <w:r>
-        <w:t>•  Thời gian tạm dừng do lỗi của Bên A không được tính vào thời hạn hoàn thành tiến độ của Bên B.</w:t>
+        <w:jc w:val="both"/>
+      </w:pPr>
+      <w:r>
+        <w:t>Thời gian tạm dừng do lỗi của Bên A không được tính vào thời hạn hoàn thành tiến độ của Bên B.</w:t>
       </w:r>
     </w:p>
     <w:p>
       <w:pPr>
-        <w:spacing w:after="60" w:before="20" w:line="276" w:lineRule="auto"/>
+        <w:spacing w:before="20" w:after="40" w:line="276" w:lineRule="auto"/>
         <w:ind w:left="360"/>
-        <w:jc w:val="left"/>
+        <w:jc w:val="both"/>
       </w:pPr>
       <w:r>
         <w:rPr>
           <w:i/>
         </w:rPr>
-        <w:t>•  Phí khôi phục dịch vụ (Re-activation Fee):</w:t>
+        <w:t>Phí khôi phục dịch vụ (Re-activation Fee):</w:t>
       </w:r>
       <w:r>
         <w:t xml:space="preserve"> Để kích hoạt lại dịch vụ sau khi bị tạm dừng do lỗi chậm thanh toán, Bên A phải thanh toán toàn bộ nợ gốc, tiền lãi chậm trả và một khoản phí khôi phục kỹ thuật bằng 10% giá trị đợt thanh toán bị chậm.</w:t>
@@ -1556,32 +1727,22 @@
     </w:p>
     <w:p>
       <w:pPr>
-        <w:spacing w:after="120" w:before="80"/>
+        <w:spacing w:before="180" w:after="60" w:line="276" w:lineRule="auto"/>
+        <w:jc w:val="left"/>
       </w:pPr>
       <w:r>
         <w:rPr>
-          <w:color w:val="CBD5E1"/>
+          <w:b/>
+          <w:color w:val="0F172A"/>
+          <w:sz w:val="22"/>
         </w:rPr>
-        <w:t>―――――――――――――――――――――――――――――――――――――――――――――――――――――――</w:t>
+        <w:t>ĐIỀU 7: NGHĨA VỤ PHỐI HỢP, TIẾN ĐỘ VÀ ĐẦU MỐI PHÊ DUYỆT</w:t>
       </w:r>
     </w:p>
     <w:p>
       <w:pPr>
-        <w:spacing w:before="160" w:after="60"/>
-      </w:pPr>
-      <w:r>
-        <w:rPr>
-          <w:b/>
-          <w:color w:val="0D7647"/>
-          <w:sz w:val="23"/>
-        </w:rPr>
-        <w:t>ĐIỀU 7: NGHĨA VỤ PHỐI HỢP, TIẾN ĐỘ VÀ ĐẦU MỐI PHÊ DUYỆT</w:t>
-      </w:r>
-    </w:p>
-    <w:p>
-      <w:pPr>
-        <w:spacing w:after="80" w:before="0" w:line="276" w:lineRule="auto"/>
-        <w:jc w:val="left"/>
+        <w:spacing w:before="20" w:after="60" w:line="276" w:lineRule="auto"/>
+        <w:jc w:val="both"/>
       </w:pPr>
       <w:r>
         <w:t xml:space="preserve">7.1. </w:t>
@@ -1598,8 +1759,8 @@
     </w:p>
     <w:p>
       <w:pPr>
-        <w:spacing w:after="80" w:before="0" w:line="276" w:lineRule="auto"/>
-        <w:jc w:val="left"/>
+        <w:spacing w:before="20" w:after="60" w:line="276" w:lineRule="auto"/>
+        <w:jc w:val="both"/>
       </w:pPr>
       <w:r>
         <w:t xml:space="preserve">7.2. </w:t>
@@ -1625,8 +1786,8 @@
     </w:p>
     <w:p>
       <w:pPr>
-        <w:spacing w:after="80" w:before="0" w:line="276" w:lineRule="auto"/>
-        <w:jc w:val="left"/>
+        <w:spacing w:before="20" w:after="60" w:line="276" w:lineRule="auto"/>
+        <w:jc w:val="both"/>
       </w:pPr>
       <w:r>
         <w:t xml:space="preserve">7.3. </w:t>
@@ -1661,32 +1822,22 @@
     </w:p>
     <w:p>
       <w:pPr>
-        <w:spacing w:after="120" w:before="80"/>
+        <w:spacing w:before="180" w:after="60" w:line="276" w:lineRule="auto"/>
+        <w:jc w:val="left"/>
       </w:pPr>
       <w:r>
         <w:rPr>
-          <w:color w:val="CBD5E1"/>
+          <w:b/>
+          <w:color w:val="0F172A"/>
+          <w:sz w:val="22"/>
         </w:rPr>
-        <w:t>―――――――――――――――――――――――――――――――――――――――――――――――――――――――</w:t>
+        <w:t>ĐIỀU 8: QUY TRÌNH YÊU CẦU THAY ĐỔI PHẠM VI (CHANGE REQUEST - CR)</w:t>
       </w:r>
     </w:p>
     <w:p>
       <w:pPr>
-        <w:spacing w:before="160" w:after="60"/>
-      </w:pPr>
-      <w:r>
-        <w:rPr>
-          <w:b/>
-          <w:color w:val="0D7647"/>
-          <w:sz w:val="23"/>
-        </w:rPr>
-        <w:t>ĐIỀU 8: QUY TRÌNH YÊU CẦU THAY ĐỔI PHẠM VI (CHANGE REQUEST - CR)</w:t>
-      </w:r>
-    </w:p>
-    <w:p>
-      <w:pPr>
-        <w:spacing w:after="80" w:before="0" w:line="276" w:lineRule="auto"/>
-        <w:jc w:val="left"/>
+        <w:spacing w:before="20" w:after="60" w:line="276" w:lineRule="auto"/>
+        <w:jc w:val="both"/>
       </w:pPr>
       <w:r>
         <w:t xml:space="preserve">8.1. </w:t>
@@ -1703,8 +1854,8 @@
     </w:p>
     <w:p>
       <w:pPr>
-        <w:spacing w:after="80" w:before="0" w:line="276" w:lineRule="auto"/>
-        <w:jc w:val="left"/>
+        <w:spacing w:before="20" w:after="60" w:line="276" w:lineRule="auto"/>
+        <w:jc w:val="both"/>
       </w:pPr>
       <w:r>
         <w:t xml:space="preserve">8.2. </w:t>
@@ -1718,15 +1869,15 @@
     </w:p>
     <w:p>
       <w:pPr>
-        <w:spacing w:after="60" w:before="20" w:line="276" w:lineRule="auto"/>
+        <w:spacing w:before="20" w:after="40" w:line="276" w:lineRule="auto"/>
         <w:ind w:left="360"/>
-        <w:jc w:val="left"/>
+        <w:jc w:val="both"/>
       </w:pPr>
       <w:r>
         <w:rPr>
           <w:i/>
         </w:rPr>
-        <w:t>•  Bước 1 (Đề xuất):</w:t>
+        <w:t>Bước 1 (Đề xuất):</w:t>
       </w:r>
       <w:r>
         <w:t xml:space="preserve"> Bên A gửi yêu cầu thay đổi bằng văn bản, Email hoặc tin nhắn cấu trúc chuẩn trong Nhóm dự án.</w:t>
@@ -1734,15 +1885,15 @@
     </w:p>
     <w:p>
       <w:pPr>
-        <w:spacing w:after="60" w:before="20" w:line="276" w:lineRule="auto"/>
+        <w:spacing w:before="20" w:after="40" w:line="276" w:lineRule="auto"/>
         <w:ind w:left="360"/>
-        <w:jc w:val="left"/>
+        <w:jc w:val="both"/>
       </w:pPr>
       <w:r>
         <w:rPr>
           <w:i/>
         </w:rPr>
-        <w:t>•  Bước 2 (Đánh giá):</w:t>
+        <w:t>Bước 2 (Đánh giá):</w:t>
       </w:r>
       <w:r>
         <w:t xml:space="preserve"> Trong vòng 02 ngày làm việc, Bên B gửi Phiếu Change Request (CR Form) nêu rõ: (i) Mô tả giải pháp kỹ thuật; (ii) Chi phí phát sinh; (iii) Số ngày làm việc cần gia hạn thêm.</w:t>
@@ -1750,15 +1901,15 @@
     </w:p>
     <w:p>
       <w:pPr>
-        <w:spacing w:after="60" w:before="20" w:line="276" w:lineRule="auto"/>
+        <w:spacing w:before="20" w:after="40" w:line="276" w:lineRule="auto"/>
         <w:ind w:left="360"/>
-        <w:jc w:val="left"/>
+        <w:jc w:val="both"/>
       </w:pPr>
       <w:r>
         <w:rPr>
           <w:i/>
         </w:rPr>
-        <w:t>•  Bước 3 (Kích hoạt):</w:t>
+        <w:t>Bước 3 (Kích hoạt):</w:t>
       </w:r>
       <w:r>
         <w:t xml:space="preserve"> Hạng mục thay đổi chỉ chính thức có hiệu lực và được đưa vào luồng lập trình sau khi Bên A gửi văn bản xác nhận đồng ý (hoặc thanh toán chi phí phát sinh). Chi phí phát sinh được thanh toán 100% ngay khi xác nhận hoặc gộp vào kỳ thanh toán liền kề.</w:t>
@@ -1766,32 +1917,22 @@
     </w:p>
     <w:p>
       <w:pPr>
-        <w:spacing w:after="120" w:before="80"/>
+        <w:spacing w:before="180" w:after="60" w:line="276" w:lineRule="auto"/>
+        <w:jc w:val="left"/>
       </w:pPr>
       <w:r>
         <w:rPr>
-          <w:color w:val="CBD5E1"/>
+          <w:b/>
+          <w:color w:val="0F172A"/>
+          <w:sz w:val="22"/>
         </w:rPr>
-        <w:t>―――――――――――――――――――――――――――――――――――――――――――――――――――――――</w:t>
+        <w:t>ĐIỀU 9: QUY TRÌNH KIỂM THỬ VÀ CƠ CHẾ NGHIỆM THU MẶC NHIÊN</w:t>
       </w:r>
     </w:p>
     <w:p>
       <w:pPr>
-        <w:spacing w:before="160" w:after="60"/>
-      </w:pPr>
-      <w:r>
-        <w:rPr>
-          <w:b/>
-          <w:color w:val="0D7647"/>
-          <w:sz w:val="23"/>
-        </w:rPr>
-        <w:t>ĐIỀU 9: QUY TRÌNH KIỂM THỬ VÀ CƠ CHẾ NGHIỆM THU MẶC NHIÊN</w:t>
-      </w:r>
-    </w:p>
-    <w:p>
-      <w:pPr>
-        <w:spacing w:after="80" w:before="0" w:line="276" w:lineRule="auto"/>
-        <w:jc w:val="left"/>
+        <w:spacing w:before="20" w:after="60" w:line="276" w:lineRule="auto"/>
+        <w:jc w:val="both"/>
       </w:pPr>
       <w:r>
         <w:t xml:space="preserve">9.1. </w:t>
@@ -1808,8 +1949,8 @@
     </w:p>
     <w:p>
       <w:pPr>
-        <w:spacing w:after="80" w:before="0" w:line="276" w:lineRule="auto"/>
-        <w:jc w:val="left"/>
+        <w:spacing w:before="20" w:after="60" w:line="276" w:lineRule="auto"/>
+        <w:jc w:val="both"/>
       </w:pPr>
       <w:r>
         <w:t xml:space="preserve">9.2. </w:t>
@@ -1835,12 +1976,12 @@
     </w:p>
     <w:p>
       <w:pPr>
-        <w:spacing w:after="60" w:before="20" w:line="276" w:lineRule="auto"/>
+        <w:spacing w:before="20" w:after="40" w:line="276" w:lineRule="auto"/>
         <w:ind w:left="360"/>
-        <w:jc w:val="left"/>
-      </w:pPr>
-      <w:r>
-        <w:t xml:space="preserve">•  Bên A chỉ có quyền từ chối ký biên bản nghiệm thu nếu phát sinh </w:t>
+        <w:jc w:val="both"/>
+      </w:pPr>
+      <w:r>
+        <w:t xml:space="preserve">Bên A chỉ có quyền từ chối ký biên bản nghiệm thu nếu phát sinh </w:t>
       </w:r>
       <w:r>
         <w:rPr>
@@ -1854,18 +1995,18 @@
     </w:p>
     <w:p>
       <w:pPr>
-        <w:spacing w:after="60" w:before="20" w:line="276" w:lineRule="auto"/>
+        <w:spacing w:before="20" w:after="40" w:line="276" w:lineRule="auto"/>
         <w:ind w:left="360"/>
-        <w:jc w:val="left"/>
-      </w:pPr>
-      <w:r>
-        <w:t xml:space="preserve">•  Các lỗi thứ yếu về thẩm mỹ, chính tả, căn lề pixel (Minor Bugs) KHÔNG PHẢI là căn cứ để từ chối nghiệm thu toàn phần; Bên B có nghĩa vụ ghi nhận và khắc phục trong Thời hạn Bảo hành 30 ngày.  </w:t>
+        <w:jc w:val="both"/>
+      </w:pPr>
+      <w:r>
+        <w:t>Các lỗi thứ yếu về thẩm mỹ, chính tả, căn lề pixel (Minor Bugs) KHÔNG PHẢI là căn cứ để từ chối nghiệm thu toàn phần; Bên B có nghĩa vụ ghi nhận và khắc phục trong Thời hạn Bảo hành 30 ngày.</w:t>
       </w:r>
     </w:p>
     <w:p>
       <w:pPr>
-        <w:spacing w:after="80" w:before="0" w:line="276" w:lineRule="auto"/>
-        <w:jc w:val="left"/>
+        <w:spacing w:before="20" w:after="60" w:line="276" w:lineRule="auto"/>
+        <w:jc w:val="both"/>
       </w:pPr>
       <w:r>
         <w:t xml:space="preserve">9.3. </w:t>
@@ -1879,8 +2020,8 @@
     </w:p>
     <w:p>
       <w:pPr>
-        <w:spacing w:after="80" w:before="0" w:line="276" w:lineRule="auto"/>
-        <w:jc w:val="left"/>
+        <w:spacing w:before="20" w:after="60" w:line="276" w:lineRule="auto"/>
+        <w:jc w:val="both"/>
       </w:pPr>
       <w:r>
         <w:t>Nhằm ngăn chặn hành vi cố tình chây ỳ ký biên bản để trì hoãn thanh toán, Các Bên thỏa thuận cơ chế nghiệm thu mặc nhiên có điều kiện căn cứ Khoản 2 Điều 393 BLDS 2015 như sau:</w:t>
@@ -1888,22 +2029,22 @@
     </w:p>
     <w:p>
       <w:pPr>
-        <w:spacing w:after="60" w:before="20" w:line="276" w:lineRule="auto"/>
+        <w:spacing w:before="20" w:after="40" w:line="276" w:lineRule="auto"/>
         <w:ind w:left="360"/>
-        <w:jc w:val="left"/>
-      </w:pPr>
-      <w:r>
-        <w:t>•  Hết thời hạn 07 ngày làm việc UAT lần 1 mà Bên A không có phản hồi bằng văn bản chỉ rõ lỗi kỹ thuật, Bên B sẽ gửi "Thông báo Nhắc nhở Nghiệm thu Lần 2".</w:t>
+        <w:jc w:val="both"/>
+      </w:pPr>
+      <w:r>
+        <w:t>Hết thời hạn 07 ngày làm việc UAT lần 1 mà Bên A không có phản hồi bằng văn bản chỉ rõ lỗi kỹ thuật, Bên B sẽ gửi "Thông báo Nhắc nhở Nghiệm thu Lần 2".</w:t>
       </w:r>
     </w:p>
     <w:p>
       <w:pPr>
-        <w:spacing w:after="60" w:before="20" w:line="276" w:lineRule="auto"/>
+        <w:spacing w:before="20" w:after="40" w:line="276" w:lineRule="auto"/>
         <w:ind w:left="360"/>
-        <w:jc w:val="left"/>
-      </w:pPr>
-      <w:r>
-        <w:t xml:space="preserve">•  Bên A có thêm </w:t>
+        <w:jc w:val="both"/>
+      </w:pPr>
+      <w:r>
+        <w:t xml:space="preserve">Bên A có thêm </w:t>
       </w:r>
       <w:r>
         <w:rPr>
@@ -1921,13 +2062,13 @@
         <w:t>PHÁP LUẬT VÀ HỢP ĐỒNG NÀY MẶC NHIÊN CÔNG NHẬN LÀ ĐÃ ĐƯỢC BÊN A NGHIỆM THU ĐẠT CHẤT LƯỢNG 100% VÔ ĐIỀU KIỆN</w:t>
       </w:r>
       <w:r>
-        <w:t xml:space="preserve">.  </w:t>
+        <w:t>.</w:t>
       </w:r>
     </w:p>
     <w:p>
       <w:pPr>
-        <w:spacing w:after="80" w:before="0" w:line="276" w:lineRule="auto"/>
-        <w:jc w:val="left"/>
+        <w:spacing w:before="20" w:after="60" w:line="276" w:lineRule="auto"/>
+        <w:jc w:val="both"/>
       </w:pPr>
       <w:r>
         <w:t xml:space="preserve">9.4. </w:t>
@@ -1941,8 +2082,8 @@
     </w:p>
     <w:p>
       <w:pPr>
-        <w:spacing w:after="80" w:before="0" w:line="276" w:lineRule="auto"/>
-        <w:jc w:val="left"/>
+        <w:spacing w:before="20" w:after="60" w:line="276" w:lineRule="auto"/>
+        <w:jc w:val="both"/>
       </w:pPr>
       <w:r>
         <w:t>Bất kể biên bản nghiệm thu bằng chữ ký đã được ký kết hay chưa, nếu Bên A thực hiện bất kỳ hành vi nào sau đây:</w:t>
@@ -1950,8 +2091,8 @@
     </w:p>
     <w:p>
       <w:pPr>
-        <w:spacing w:after="80" w:before="0" w:line="276" w:lineRule="auto"/>
-        <w:jc w:val="left"/>
+        <w:spacing w:before="20" w:after="60" w:line="276" w:lineRule="auto"/>
+        <w:jc w:val="both"/>
       </w:pPr>
       <w:r>
         <w:t xml:space="preserve">a) Tự ý trỏ tên miền chính thức (Production Domain) vào mã nguồn website;  </w:t>
@@ -1959,8 +2100,8 @@
     </w:p>
     <w:p>
       <w:pPr>
-        <w:spacing w:after="80" w:before="0" w:line="276" w:lineRule="auto"/>
-        <w:jc w:val="left"/>
+        <w:spacing w:before="20" w:after="60" w:line="276" w:lineRule="auto"/>
+        <w:jc w:val="both"/>
       </w:pPr>
       <w:r>
         <w:t xml:space="preserve">b) Nhập dữ liệu khách hàng thật, triển khai chiến dịch quảng cáo trả phí kéo traffic vào hệ thống;  </w:t>
@@ -1968,8 +2109,8 @@
     </w:p>
     <w:p>
       <w:pPr>
-        <w:spacing w:after="80" w:before="0" w:line="276" w:lineRule="auto"/>
-        <w:jc w:val="left"/>
+        <w:spacing w:before="20" w:after="60" w:line="276" w:lineRule="auto"/>
+        <w:jc w:val="both"/>
       </w:pPr>
       <w:r>
         <w:t xml:space="preserve">c) Sử dụng website, landing page hoặc hệ thống CRM để thu tiền, bán hàng thương mại cho công chúng;  </w:t>
@@ -1977,8 +2118,8 @@
     </w:p>
     <w:p>
       <w:pPr>
-        <w:spacing w:after="80" w:before="0" w:line="276" w:lineRule="auto"/>
-        <w:jc w:val="left"/>
+        <w:spacing w:before="20" w:after="60" w:line="276" w:lineRule="auto"/>
+        <w:jc w:val="both"/>
       </w:pPr>
       <w:r>
         <w:t xml:space="preserve">thì sản phẩm được coi là </w:t>
@@ -1995,32 +2136,22 @@
     </w:p>
     <w:p>
       <w:pPr>
-        <w:spacing w:after="120" w:before="80"/>
+        <w:spacing w:before="180" w:after="60" w:line="276" w:lineRule="auto"/>
+        <w:jc w:val="left"/>
       </w:pPr>
       <w:r>
         <w:rPr>
-          <w:color w:val="CBD5E1"/>
+          <w:b/>
+          <w:color w:val="0F172A"/>
+          <w:sz w:val="22"/>
         </w:rPr>
-        <w:t>―――――――――――――――――――――――――――――――――――――――――――――――――――――――</w:t>
+        <w:t>ĐIỀU 10: QUYỀN SỞ HỮU TRÍ TUỆ VÀ BẢN QUYỀN TÀI SẢN SỐ</w:t>
       </w:r>
     </w:p>
     <w:p>
       <w:pPr>
-        <w:spacing w:before="160" w:after="60"/>
-      </w:pPr>
-      <w:r>
-        <w:rPr>
-          <w:b/>
-          <w:color w:val="0D7647"/>
-          <w:sz w:val="23"/>
-        </w:rPr>
-        <w:t>ĐIỀU 10: QUYỀN SỞ HỮU TRÍ TUỆ VÀ BẢN QUYỀN TÀI SẢN SỐ</w:t>
-      </w:r>
-    </w:p>
-    <w:p>
-      <w:pPr>
-        <w:spacing w:after="80" w:before="0" w:line="276" w:lineRule="auto"/>
-        <w:jc w:val="left"/>
+        <w:spacing w:before="20" w:after="60" w:line="276" w:lineRule="auto"/>
+        <w:jc w:val="both"/>
       </w:pPr>
       <w:r>
         <w:t xml:space="preserve">10.1. </w:t>
@@ -2037,15 +2168,15 @@
     </w:p>
     <w:p>
       <w:pPr>
-        <w:spacing w:after="60" w:before="20" w:line="276" w:lineRule="auto"/>
+        <w:spacing w:before="20" w:after="40" w:line="276" w:lineRule="auto"/>
         <w:ind w:left="360"/>
-        <w:jc w:val="left"/>
+        <w:jc w:val="both"/>
       </w:pPr>
       <w:r>
         <w:rPr>
           <w:b/>
         </w:rPr>
-        <w:t>•  Nhóm 1: Sản phẩm tạo riêng cho Khách hàng (Custom Deliverables):</w:t>
+        <w:t>Nhóm 1: Sản phẩm tạo riêng cho Khách hàng (Custom Deliverables):</w:t>
       </w:r>
       <w:r>
         <w:t xml:space="preserve"> Nội dung bài viết viết riêng, ảnh chụp độc quyền cơ sở, video quảng cáo dựng riêng, layout tùy biến mang nhận diện thương hiệu của Bên A. Quyền tài sản (Economic Rights) đối với nhóm này sẽ được </w:t>
@@ -2062,15 +2193,15 @@
     </w:p>
     <w:p>
       <w:pPr>
-        <w:spacing w:after="60" w:before="20" w:line="276" w:lineRule="auto"/>
+        <w:spacing w:before="20" w:after="40" w:line="276" w:lineRule="auto"/>
         <w:ind w:left="360"/>
-        <w:jc w:val="left"/>
+        <w:jc w:val="both"/>
       </w:pPr>
       <w:r>
         <w:rPr>
           <w:b/>
         </w:rPr>
-        <w:t>•  Nhóm 2: Tài sản nền tảng có sẵn của LocalMate (Pre-existing Materials / Core Framework):</w:t>
+        <w:t>Nhóm 2: Tài sản nền tảng có sẵn của LocalMate (Pre-existing Materials / Core Framework):</w:t>
       </w:r>
       <w:r>
         <w:t xml:space="preserve"> Kiến trúc hệ thống, mã nguồn nền tảng, boilerplate, theme tokens, UI component library, mã nguồn tự động hóa và các scripts công cụ thuộc </w:t>
@@ -2096,15 +2227,15 @@
     </w:p>
     <w:p>
       <w:pPr>
-        <w:spacing w:after="60" w:before="20" w:line="276" w:lineRule="auto"/>
+        <w:spacing w:before="20" w:after="40" w:line="276" w:lineRule="auto"/>
         <w:ind w:left="360"/>
-        <w:jc w:val="left"/>
+        <w:jc w:val="both"/>
       </w:pPr>
       <w:r>
         <w:rPr>
           <w:b/>
         </w:rPr>
-        <w:t>•  Nhóm 3: Tài sản Mã nguồn mở (Open Source Software - OSS):</w:t>
+        <w:t>Nhóm 3: Tài sản Mã nguồn mở (Open Source Software - OSS):</w:t>
       </w:r>
       <w:r>
         <w:t xml:space="preserve"> React, Tailwind CSS, Lucide icons, Vite plugins... tuân thủ giấy phép nguồn mở tương ứng (MIT, Apache 2.0). Được bàn giao theo nguyên trạng ("AS IS").</w:t>
@@ -2112,15 +2243,15 @@
     </w:p>
     <w:p>
       <w:pPr>
-        <w:spacing w:after="60" w:before="20" w:line="276" w:lineRule="auto"/>
+        <w:spacing w:before="20" w:after="40" w:line="276" w:lineRule="auto"/>
         <w:ind w:left="360"/>
-        <w:jc w:val="left"/>
+        <w:jc w:val="both"/>
       </w:pPr>
       <w:r>
         <w:rPr>
           <w:b/>
         </w:rPr>
-        <w:t>•  Nhóm 4: Tài sản Bên thứ ba có bản quyền (Third-Party Licensed Assets):</w:t>
+        <w:t>Nhóm 4: Tài sản Bên thứ ba có bản quyền (Third-Party Licensed Assets):</w:t>
       </w:r>
       <w:r>
         <w:t xml:space="preserve"> Fonts thương mại, Stock photos, API services... sử dụng theo Điều khoản dịch vụ (EULA/ToS) của bên thứ ba.</w:t>
@@ -2128,24 +2259,24 @@
     </w:p>
     <w:p>
       <w:pPr>
-        <w:spacing w:after="60" w:before="20" w:line="276" w:lineRule="auto"/>
+        <w:spacing w:before="20" w:after="40" w:line="276" w:lineRule="auto"/>
         <w:ind w:left="360"/>
-        <w:jc w:val="left"/>
+        <w:jc w:val="both"/>
       </w:pPr>
       <w:r>
         <w:rPr>
           <w:b/>
         </w:rPr>
-        <w:t>•  Nhóm 5: Tài sản của Khách hàng (Client Materials):</w:t>
-      </w:r>
-      <w:r>
-        <w:t xml:space="preserve"> Logo, nhãn hiệu, slogan, ảnh do Bên A cung cấp thuộc quyền sở hữu của Bên A. Bên A cấp cho Bên B quyền sử dụng miễn phí có thời hạn để thực hiện hợp đồng.  </w:t>
+        <w:t>Nhóm 5: Tài sản của Khách hàng (Client Materials):</w:t>
+      </w:r>
+      <w:r>
+        <w:t xml:space="preserve"> Logo, nhãn hiệu, slogan, ảnh do Bên A cung cấp thuộc quyền sở hữu của Bên A. Bên A cấp cho Bên B quyền sử dụng miễn phí có thời hạn để thực hiện hợp đồng.</w:t>
       </w:r>
     </w:p>
     <w:p>
       <w:pPr>
-        <w:spacing w:after="80" w:before="0" w:line="276" w:lineRule="auto"/>
-        <w:jc w:val="left"/>
+        <w:spacing w:before="20" w:after="60" w:line="276" w:lineRule="auto"/>
+        <w:jc w:val="both"/>
       </w:pPr>
       <w:r>
         <w:t xml:space="preserve">10.2. </w:t>
@@ -2159,8 +2290,8 @@
     </w:p>
     <w:p>
       <w:pPr>
-        <w:spacing w:after="80" w:before="0" w:line="276" w:lineRule="auto"/>
-        <w:jc w:val="left"/>
+        <w:spacing w:before="20" w:after="60" w:line="276" w:lineRule="auto"/>
+        <w:jc w:val="both"/>
       </w:pPr>
       <w:r>
         <w:t xml:space="preserve">Quyền sở hữu trí tuệ đối với Nhóm 1 CHỈ CHÍNH THỨC ĐƯỢC CHUYỂN GIAO sang Bên A </w:t>
@@ -2177,8 +2308,8 @@
     </w:p>
     <w:p>
       <w:pPr>
-        <w:spacing w:after="80" w:before="0" w:line="276" w:lineRule="auto"/>
-        <w:jc w:val="left"/>
+        <w:spacing w:before="20" w:after="60" w:line="276" w:lineRule="auto"/>
+        <w:jc w:val="both"/>
       </w:pPr>
       <w:r>
         <w:t xml:space="preserve">10.3. </w:t>
@@ -2192,8 +2323,8 @@
     </w:p>
     <w:p>
       <w:pPr>
-        <w:spacing w:after="80" w:before="0" w:line="276" w:lineRule="auto"/>
-        <w:jc w:val="left"/>
+        <w:spacing w:before="20" w:after="60" w:line="276" w:lineRule="auto"/>
+        <w:jc w:val="both"/>
       </w:pPr>
       <w:r>
         <w:t>Hai Bên xác nhận rằng một số thành phần hình ảnh hoặc dàn ý nội dung có thể được tạo ra với sự hỗ trợ của các công cụ Trí tuệ Nhân tạo trả phí thương mại. Quyền tác giả được bảo hộ trên phần đóng góp sáng tạo, biên tập chuyên sâu trực tiếp của con người (theo Điều 12a Luật SHTT). Bên B được miễn trừ trách nhiệm pháp lý phái sinh liên quan đến thuật toán huấn luyện dữ liệu gốc của các hãng AI quốc tế.</w:t>
@@ -2201,32 +2332,22 @@
     </w:p>
     <w:p>
       <w:pPr>
-        <w:spacing w:after="120" w:before="80"/>
+        <w:spacing w:before="180" w:after="60" w:line="276" w:lineRule="auto"/>
+        <w:jc w:val="left"/>
       </w:pPr>
       <w:r>
         <w:rPr>
-          <w:color w:val="CBD5E1"/>
+          <w:b/>
+          <w:color w:val="0F172A"/>
+          <w:sz w:val="22"/>
         </w:rPr>
-        <w:t>―――――――――――――――――――――――――――――――――――――――――――――――――――――――</w:t>
+        <w:t>ĐIỀU 11: BẢO MẬT THÔNG TIN (CONFIDENTIALITY / NDA)</w:t>
       </w:r>
     </w:p>
     <w:p>
       <w:pPr>
-        <w:spacing w:before="160" w:after="60"/>
-      </w:pPr>
-      <w:r>
-        <w:rPr>
-          <w:b/>
-          <w:color w:val="0D7647"/>
-          <w:sz w:val="23"/>
-        </w:rPr>
-        <w:t>ĐIỀU 11: BẢO MẬT THÔNG TIN (CONFIDENTIALITY / NDA)</w:t>
-      </w:r>
-    </w:p>
-    <w:p>
-      <w:pPr>
-        <w:spacing w:after="80" w:before="0" w:line="276" w:lineRule="auto"/>
-        <w:jc w:val="left"/>
+        <w:spacing w:before="20" w:after="60" w:line="276" w:lineRule="auto"/>
+        <w:jc w:val="both"/>
       </w:pPr>
       <w:r>
         <w:t xml:space="preserve">11.1. </w:t>
@@ -2243,8 +2364,8 @@
     </w:p>
     <w:p>
       <w:pPr>
-        <w:spacing w:after="80" w:before="0" w:line="276" w:lineRule="auto"/>
-        <w:jc w:val="left"/>
+        <w:spacing w:before="20" w:after="60" w:line="276" w:lineRule="auto"/>
+        <w:jc w:val="both"/>
       </w:pPr>
       <w:r>
         <w:t xml:space="preserve">11.2. </w:t>
@@ -2261,8 +2382,8 @@
     </w:p>
     <w:p>
       <w:pPr>
-        <w:spacing w:after="80" w:before="0" w:line="276" w:lineRule="auto"/>
-        <w:jc w:val="left"/>
+        <w:spacing w:before="20" w:after="60" w:line="276" w:lineRule="auto"/>
+        <w:jc w:val="both"/>
       </w:pPr>
       <w:r>
         <w:t xml:space="preserve">11.3. </w:t>
@@ -2279,8 +2400,8 @@
     </w:p>
     <w:p>
       <w:pPr>
-        <w:spacing w:after="80" w:before="0" w:line="276" w:lineRule="auto"/>
-        <w:jc w:val="left"/>
+        <w:spacing w:before="20" w:after="60" w:line="276" w:lineRule="auto"/>
+        <w:jc w:val="both"/>
       </w:pPr>
       <w:r>
         <w:t xml:space="preserve">a) Đã được công chúng biết đến rộng rãi không do lỗi của Bên Tiếp Nhận;  </w:t>
@@ -2288,8 +2409,8 @@
     </w:p>
     <w:p>
       <w:pPr>
-        <w:spacing w:after="80" w:before="0" w:line="276" w:lineRule="auto"/>
-        <w:jc w:val="left"/>
+        <w:spacing w:before="20" w:after="60" w:line="276" w:lineRule="auto"/>
+        <w:jc w:val="both"/>
       </w:pPr>
       <w:r>
         <w:t xml:space="preserve">b) Đã được Bên Tiếp Nhận biết hợp pháp trước thời điểm tiết lộ;  </w:t>
@@ -2297,8 +2418,8 @@
     </w:p>
     <w:p>
       <w:pPr>
-        <w:spacing w:after="80" w:before="0" w:line="276" w:lineRule="auto"/>
-        <w:jc w:val="left"/>
+        <w:spacing w:before="20" w:after="60" w:line="276" w:lineRule="auto"/>
+        <w:jc w:val="both"/>
       </w:pPr>
       <w:r>
         <w:t xml:space="preserve">c) Do Bên Tiếp Nhận tự nghiên cứu phát triển độc lập mà không sử dụng thông tin mật;  </w:t>
@@ -2306,8 +2427,8 @@
     </w:p>
     <w:p>
       <w:pPr>
-        <w:spacing w:after="80" w:before="0" w:line="276" w:lineRule="auto"/>
-        <w:jc w:val="left"/>
+        <w:spacing w:before="20" w:after="60" w:line="276" w:lineRule="auto"/>
+        <w:jc w:val="both"/>
       </w:pPr>
       <w:r>
         <w:t xml:space="preserve">d) Bắt buộc phải cung cấp theo quyết định có thẩm quyền của Tòa án hoặc Cơ quan Nhà nước có thẩm quyền theo quy định pháp luật.  </w:t>
@@ -2315,8 +2436,8 @@
     </w:p>
     <w:p>
       <w:pPr>
-        <w:spacing w:after="80" w:before="0" w:line="276" w:lineRule="auto"/>
-        <w:jc w:val="left"/>
+        <w:spacing w:before="20" w:after="60" w:line="276" w:lineRule="auto"/>
+        <w:jc w:val="both"/>
       </w:pPr>
       <w:r>
         <w:t xml:space="preserve">11.4. </w:t>
@@ -2342,32 +2463,22 @@
     </w:p>
     <w:p>
       <w:pPr>
-        <w:spacing w:after="120" w:before="80"/>
+        <w:spacing w:before="180" w:after="60" w:line="276" w:lineRule="auto"/>
+        <w:jc w:val="left"/>
       </w:pPr>
       <w:r>
         <w:rPr>
-          <w:color w:val="CBD5E1"/>
+          <w:b/>
+          <w:color w:val="0F172A"/>
+          <w:sz w:val="22"/>
         </w:rPr>
-        <w:t>―――――――――――――――――――――――――――――――――――――――――――――――――――――――</w:t>
+        <w:t>ĐIỀU 12: BẢO VỆ DỮ LIỆU CÁ NHÂN (DATA PROTECTION / DPA)</w:t>
       </w:r>
     </w:p>
     <w:p>
       <w:pPr>
-        <w:spacing w:before="160" w:after="60"/>
-      </w:pPr>
-      <w:r>
-        <w:rPr>
-          <w:b/>
-          <w:color w:val="0D7647"/>
-          <w:sz w:val="23"/>
-        </w:rPr>
-        <w:t>ĐIỀU 12: BẢO VỆ DỮ LIỆU CÁ NHÂN (DATA PROTECTION / DPA)</w:t>
-      </w:r>
-    </w:p>
-    <w:p>
-      <w:pPr>
-        <w:spacing w:after="80" w:before="0" w:line="276" w:lineRule="auto"/>
-        <w:jc w:val="left"/>
+        <w:spacing w:before="20" w:after="60" w:line="276" w:lineRule="auto"/>
+        <w:jc w:val="both"/>
       </w:pPr>
       <w:r>
         <w:t xml:space="preserve">12.1. </w:t>
@@ -2381,15 +2492,15 @@
     </w:p>
     <w:p>
       <w:pPr>
-        <w:spacing w:after="60" w:before="20" w:line="276" w:lineRule="auto"/>
+        <w:spacing w:before="20" w:after="40" w:line="276" w:lineRule="auto"/>
         <w:ind w:left="360"/>
-        <w:jc w:val="left"/>
+        <w:jc w:val="both"/>
       </w:pPr>
       <w:r>
         <w:rPr>
           <w:b/>
         </w:rPr>
-        <w:t>•  Bên A là Bên Kiểm soát Dữ liệu Cá nhân (Data Controller):</w:t>
+        <w:t>Bên A là Bên Kiểm soát Dữ liệu Cá nhân (Data Controller):</w:t>
       </w:r>
       <w:r>
         <w:t xml:space="preserve"> Chịu trách nhiệm toàn bộ về tính hợp pháp của nguồn dữ liệu khách hàng (Leads), xây dựng Chính sách quyền riêng tư hiển thị trên website, lấy chấp thuận rõ ràng (Consent) của chủ thể dữ liệu theo Điều 11 Nghị định 13/2023/NĐ-CP và nộp Hồ sơ đánh giá tác động xử lý dữ liệu (DPIA) cho Cục An ninh mạng (A05 - Bộ Công an) khi luật định.</w:t>
@@ -2397,24 +2508,24 @@
     </w:p>
     <w:p>
       <w:pPr>
-        <w:spacing w:after="60" w:before="20" w:line="276" w:lineRule="auto"/>
+        <w:spacing w:before="20" w:after="40" w:line="276" w:lineRule="auto"/>
         <w:ind w:left="360"/>
-        <w:jc w:val="left"/>
+        <w:jc w:val="both"/>
       </w:pPr>
       <w:r>
         <w:rPr>
           <w:b/>
         </w:rPr>
-        <w:t>•  Bên B là Bên Xử lý Dữ liệu Cá nhân (Data Processor):</w:t>
-      </w:r>
-      <w:r>
-        <w:t xml:space="preserve"> Chỉ thực hiện cài đặt hạ tầng kỹ thuật, cấu hình form lưu trữ, luồng webhook và truyền dữ liệu theo đúng hợp đồng và văn bản hướng dẫn của Bên A.  </w:t>
+        <w:t>Bên B là Bên Xử lý Dữ liệu Cá nhân (Data Processor):</w:t>
+      </w:r>
+      <w:r>
+        <w:t xml:space="preserve"> Chỉ thực hiện cài đặt hạ tầng kỹ thuật, cấu hình form lưu trữ, luồng webhook và truyền dữ liệu theo đúng hợp đồng và văn bản hướng dẫn của Bên A.</w:t>
       </w:r>
     </w:p>
     <w:p>
       <w:pPr>
-        <w:spacing w:after="80" w:before="0" w:line="276" w:lineRule="auto"/>
-        <w:jc w:val="left"/>
+        <w:spacing w:before="20" w:after="60" w:line="276" w:lineRule="auto"/>
+        <w:jc w:val="both"/>
       </w:pPr>
       <w:r>
         <w:t xml:space="preserve">12.2. </w:t>
@@ -2428,8 +2539,8 @@
     </w:p>
     <w:p>
       <w:pPr>
-        <w:spacing w:after="80" w:before="0" w:line="276" w:lineRule="auto"/>
-        <w:jc w:val="left"/>
+        <w:spacing w:before="20" w:after="60" w:line="276" w:lineRule="auto"/>
+        <w:jc w:val="both"/>
       </w:pPr>
       <w:r>
         <w:t xml:space="preserve">Bên B cam kết áp dụng các biện pháp an ninh kỹ thuật tiêu chuẩn công nghiệp (mã hóa đường truyền TLS 1.3, chống SQL Injection/XSS, mã hóa dữ liệu at-rest AES-256, xác thực MFA). Bên B </w:t>
@@ -2446,8 +2557,8 @@
     </w:p>
     <w:p>
       <w:pPr>
-        <w:spacing w:after="80" w:before="0" w:line="276" w:lineRule="auto"/>
-        <w:jc w:val="left"/>
+        <w:spacing w:before="20" w:after="60" w:line="276" w:lineRule="auto"/>
+        <w:jc w:val="both"/>
       </w:pPr>
       <w:r>
         <w:t xml:space="preserve">12.3. </w:t>
@@ -2482,8 +2593,8 @@
     </w:p>
     <w:p>
       <w:pPr>
-        <w:spacing w:after="80" w:before="0" w:line="276" w:lineRule="auto"/>
-        <w:jc w:val="left"/>
+        <w:spacing w:before="20" w:after="60" w:line="276" w:lineRule="auto"/>
+        <w:jc w:val="both"/>
       </w:pPr>
       <w:r>
         <w:t xml:space="preserve">12.4. </w:t>
@@ -2500,32 +2611,22 @@
     </w:p>
     <w:p>
       <w:pPr>
-        <w:spacing w:after="120" w:before="80"/>
+        <w:spacing w:before="180" w:after="60" w:line="276" w:lineRule="auto"/>
+        <w:jc w:val="left"/>
       </w:pPr>
       <w:r>
         <w:rPr>
-          <w:color w:val="CBD5E1"/>
+          <w:b/>
+          <w:color w:val="0F172A"/>
+          <w:sz w:val="22"/>
         </w:rPr>
-        <w:t>―――――――――――――――――――――――――――――――――――――――――――――――――――――――</w:t>
+        <w:t>ĐIỀU 13: BÀN GIAO TÀI SẢN SỐ &amp; AN TOÀN THÔNG TIN TÀI KHOẢN</w:t>
       </w:r>
     </w:p>
     <w:p>
       <w:pPr>
-        <w:spacing w:before="160" w:after="60"/>
-      </w:pPr>
-      <w:r>
-        <w:rPr>
-          <w:b/>
-          <w:color w:val="0D7647"/>
-          <w:sz w:val="23"/>
-        </w:rPr>
-        <w:t>ĐIỀU 13: BÀN GIAO TÀI SẢN SỐ &amp; AN TOÀN THÔNG TIN TÀI KHOẢN</w:t>
-      </w:r>
-    </w:p>
-    <w:p>
-      <w:pPr>
-        <w:spacing w:after="80" w:before="0" w:line="276" w:lineRule="auto"/>
-        <w:jc w:val="left"/>
+        <w:spacing w:before="20" w:after="60" w:line="276" w:lineRule="auto"/>
+        <w:jc w:val="both"/>
       </w:pPr>
       <w:r>
         <w:t xml:space="preserve">13.1. </w:t>
@@ -2542,8 +2643,8 @@
     </w:p>
     <w:p>
       <w:pPr>
-        <w:spacing w:after="80" w:before="0" w:line="276" w:lineRule="auto"/>
-        <w:jc w:val="left"/>
+        <w:spacing w:before="20" w:after="60" w:line="276" w:lineRule="auto"/>
+        <w:jc w:val="both"/>
       </w:pPr>
       <w:r>
         <w:t xml:space="preserve">13.2. </w:t>
@@ -2557,18 +2658,17 @@
     </w:p>
     <w:p>
       <w:pPr>
-        <w:spacing w:after="60" w:before="20" w:line="276" w:lineRule="auto"/>
+        <w:spacing w:before="20" w:after="40" w:line="276" w:lineRule="auto"/>
         <w:ind w:left="360"/>
-        <w:jc w:val="left"/>
-      </w:pPr>
-      <w:r>
-        <w:t>•  Đối với Google Business Profile: Thêm Gmail của Bên A làm Chủ sở hữu (</w:t>
+        <w:jc w:val="both"/>
+      </w:pPr>
+      <w:r>
+        <w:t>Đối với Google Business Profile: Thêm Gmail của Bên A làm Chủ sở hữu (</w:t>
       </w:r>
       <w:r>
         <w:rPr>
           <w:rFonts w:ascii="Consolas" w:hAnsi="Consolas"/>
-          <w:color w:val="B42828"/>
-          <w:sz w:val="20"/>
+          <w:sz w:val="19"/>
         </w:rPr>
         <w:t>Owner</w:t>
       </w:r>
@@ -2578,8 +2678,7 @@
       <w:r>
         <w:rPr>
           <w:rFonts w:ascii="Consolas" w:hAnsi="Consolas"/>
-          <w:color w:val="B42828"/>
-          <w:sz w:val="20"/>
+          <w:sz w:val="19"/>
         </w:rPr>
         <w:t>Primary Owner</w:t>
       </w:r>
@@ -2598,29 +2697,28 @@
     </w:p>
     <w:p>
       <w:pPr>
-        <w:spacing w:after="60" w:before="20" w:line="276" w:lineRule="auto"/>
+        <w:spacing w:before="20" w:after="40" w:line="276" w:lineRule="auto"/>
         <w:ind w:left="360"/>
-        <w:jc w:val="left"/>
-      </w:pPr>
-      <w:r>
-        <w:t>•  Đối với Google Ads / Meta BM / Cloudflare: Mời email chính chủ của Bên A với vai trò Quản trị viên (</w:t>
+        <w:jc w:val="both"/>
+      </w:pPr>
+      <w:r>
+        <w:t>Đối với Google Ads / Meta BM / Cloudflare: Mời email chính chủ của Bên A với vai trò Quản trị viên (</w:t>
       </w:r>
       <w:r>
         <w:rPr>
           <w:rFonts w:ascii="Consolas" w:hAnsi="Consolas"/>
-          <w:color w:val="B42828"/>
-          <w:sz w:val="20"/>
+          <w:sz w:val="19"/>
         </w:rPr>
         <w:t>Admin</w:t>
       </w:r>
       <w:r>
-        <w:t xml:space="preserve">).  </w:t>
+        <w:t>).</w:t>
       </w:r>
     </w:p>
     <w:p>
       <w:pPr>
-        <w:spacing w:after="80" w:before="0" w:line="276" w:lineRule="auto"/>
-        <w:jc w:val="left"/>
+        <w:spacing w:before="20" w:after="60" w:line="276" w:lineRule="auto"/>
+        <w:jc w:val="both"/>
       </w:pPr>
       <w:r>
         <w:t xml:space="preserve">13.3. </w:t>
@@ -2634,22 +2732,22 @@
     </w:p>
     <w:p>
       <w:pPr>
-        <w:spacing w:after="60" w:before="20" w:line="276" w:lineRule="auto"/>
+        <w:spacing w:before="20" w:after="40" w:line="276" w:lineRule="auto"/>
         <w:ind w:left="360"/>
-        <w:jc w:val="left"/>
-      </w:pPr>
-      <w:r>
-        <w:t>•  Tuyệt đối cấm ghi mật khẩu dạng văn bản rõ (plaintext) trong hợp đồng giấy, biên bản nghiệm thu hoặc tin nhắn chat không mã hóa.</w:t>
+        <w:jc w:val="both"/>
+      </w:pPr>
+      <w:r>
+        <w:t>Tuyệt đối cấm ghi mật khẩu dạng văn bản rõ (plaintext) trong hợp đồng giấy, biên bản nghiệm thu hoặc tin nhắn chat không mã hóa.</w:t>
       </w:r>
     </w:p>
     <w:p>
       <w:pPr>
-        <w:spacing w:after="60" w:before="20" w:line="276" w:lineRule="auto"/>
+        <w:spacing w:before="20" w:after="40" w:line="276" w:lineRule="auto"/>
         <w:ind w:left="360"/>
-        <w:jc w:val="left"/>
-      </w:pPr>
-      <w:r>
-        <w:t xml:space="preserve">•  Mọi thông tin tài khoản root không thể phân quyền qua email sẽ được bàn giao thông qua công cụ chia sẻ mã hóa đầu cuối </w:t>
+        <w:jc w:val="both"/>
+      </w:pPr>
+      <w:r>
+        <w:t xml:space="preserve">Mọi thông tin tài khoản root không thể phân quyền qua email sẽ được bàn giao thông qua công cụ chia sẻ mã hóa đầu cuối </w:t>
       </w:r>
       <w:r>
         <w:rPr>
@@ -2658,13 +2756,13 @@
         <w:t>Bitwarden Send</w:t>
       </w:r>
       <w:r>
-        <w:t xml:space="preserve"> (tự hủy sau 01 lần xem hoặc 24 giờ, kèm passphrase gửi qua kênh thứ hai độc lập).  </w:t>
+        <w:t xml:space="preserve"> (tự hủy sau 01 lần xem hoặc 24 giờ, kèm passphrase gửi qua kênh thứ hai độc lập).</w:t>
       </w:r>
     </w:p>
     <w:p>
       <w:pPr>
-        <w:spacing w:after="80" w:before="0" w:line="276" w:lineRule="auto"/>
-        <w:jc w:val="left"/>
+        <w:spacing w:before="20" w:after="60" w:line="276" w:lineRule="auto"/>
+        <w:jc w:val="both"/>
       </w:pPr>
       <w:r>
         <w:t xml:space="preserve">13.4. </w:t>
@@ -2681,32 +2779,22 @@
     </w:p>
     <w:p>
       <w:pPr>
-        <w:spacing w:after="120" w:before="80"/>
+        <w:spacing w:before="180" w:after="60" w:line="276" w:lineRule="auto"/>
+        <w:jc w:val="left"/>
       </w:pPr>
       <w:r>
         <w:rPr>
-          <w:color w:val="CBD5E1"/>
+          <w:b/>
+          <w:color w:val="0F172A"/>
+          <w:sz w:val="22"/>
         </w:rPr>
-        <w:t>―――――――――――――――――――――――――――――――――――――――――――――――――――――――</w:t>
+        <w:t>ĐIỀU 14: BẢO HÀNH DỊCH VỤ, HỖ TRỢ KỸ THUẬT VÀ SLA</w:t>
       </w:r>
     </w:p>
     <w:p>
       <w:pPr>
-        <w:spacing w:before="160" w:after="60"/>
-      </w:pPr>
-      <w:r>
-        <w:rPr>
-          <w:b/>
-          <w:color w:val="0D7647"/>
-          <w:sz w:val="23"/>
-        </w:rPr>
-        <w:t>ĐIỀU 14: BẢO HÀNH DỊCH VỤ, HỖ TRỢ KỸ THUẬT VÀ SLA</w:t>
-      </w:r>
-    </w:p>
-    <w:p>
-      <w:pPr>
-        <w:spacing w:after="80" w:before="0" w:line="276" w:lineRule="auto"/>
-        <w:jc w:val="left"/>
+        <w:spacing w:before="20" w:after="60" w:line="276" w:lineRule="auto"/>
+        <w:jc w:val="both"/>
       </w:pPr>
       <w:r>
         <w:t xml:space="preserve">14.1. </w:t>
@@ -2732,8 +2820,8 @@
     </w:p>
     <w:p>
       <w:pPr>
-        <w:spacing w:after="80" w:before="0" w:line="276" w:lineRule="auto"/>
-        <w:jc w:val="left"/>
+        <w:spacing w:before="20" w:after="60" w:line="276" w:lineRule="auto"/>
+        <w:jc w:val="both"/>
       </w:pPr>
       <w:r>
         <w:t xml:space="preserve">14.2. </w:t>
@@ -2747,22 +2835,22 @@
     </w:p>
     <w:p>
       <w:pPr>
-        <w:spacing w:after="60" w:before="20" w:line="276" w:lineRule="auto"/>
+        <w:spacing w:before="20" w:after="40" w:line="276" w:lineRule="auto"/>
         <w:ind w:left="360"/>
-        <w:jc w:val="left"/>
-      </w:pPr>
-      <w:r>
-        <w:t>•  Bảo hành bao gồm việc sửa chữa các lỗi lập trình (Bugs), lỗi hiển thị vỡ layout hoặc tính năng không hoạt động đúng theo Bảng SOW ban đầu.</w:t>
+        <w:jc w:val="both"/>
+      </w:pPr>
+      <w:r>
+        <w:t>Bảo hành bao gồm việc sửa chữa các lỗi lập trình (Bugs), lỗi hiển thị vỡ layout hoặc tính năng không hoạt động đúng theo Bảng SOW ban đầu.</w:t>
       </w:r>
     </w:p>
     <w:p>
       <w:pPr>
-        <w:spacing w:after="60" w:before="20" w:line="276" w:lineRule="auto"/>
+        <w:spacing w:before="20" w:after="40" w:line="276" w:lineRule="auto"/>
         <w:ind w:left="360"/>
-        <w:jc w:val="left"/>
-      </w:pPr>
-      <w:r>
-        <w:t xml:space="preserve">•  Bảo hành </w:t>
+        <w:jc w:val="both"/>
+      </w:pPr>
+      <w:r>
+        <w:t xml:space="preserve">Bảo hành </w:t>
       </w:r>
       <w:r>
         <w:rPr>
@@ -2771,13 +2859,13 @@
         <w:t>KHÔNG BAO GỒM</w:t>
       </w:r>
       <w:r>
-        <w:t xml:space="preserve">: Việc thay đổi nội dung, thay đổi thiết kế đã duyệt, thêm trang mới, thêm tính năng mới, hoặc sửa chữa các lỗi do Bên A tự ý can thiệp vào mã nguồn, tự ý cài đặt thêm plugin bên thứ ba hoặc do máy chủ hosting Bên A tự quản trị bị sập.  </w:t>
+        <w:t>: Việc thay đổi nội dung, thay đổi thiết kế đã duyệt, thêm trang mới, thêm tính năng mới, hoặc sửa chữa các lỗi do Bên A tự ý can thiệp vào mã nguồn, tự ý cài đặt thêm plugin bên thứ ba hoặc do máy chủ hosting Bên A tự quản trị bị sập.</w:t>
       </w:r>
     </w:p>
     <w:p>
       <w:pPr>
-        <w:spacing w:after="80" w:before="0" w:line="276" w:lineRule="auto"/>
-        <w:jc w:val="left"/>
+        <w:spacing w:before="20" w:after="60" w:line="276" w:lineRule="auto"/>
+        <w:jc w:val="both"/>
       </w:pPr>
       <w:r>
         <w:t xml:space="preserve">14.3. </w:t>
@@ -2791,61 +2879,51 @@
     </w:p>
     <w:p>
       <w:pPr>
-        <w:spacing w:after="60" w:before="20" w:line="276" w:lineRule="auto"/>
+        <w:spacing w:before="20" w:after="40" w:line="276" w:lineRule="auto"/>
         <w:ind w:left="360"/>
-        <w:jc w:val="left"/>
-      </w:pPr>
-      <w:r>
-        <w:t>•  Sự cố Nghiêm trọng (P0 - Website tê liệt hoàn toàn): Phản hồi trong vòng 02 giờ, khắc phục trong vòng 08 - 24 giờ làm việc.</w:t>
+        <w:jc w:val="both"/>
+      </w:pPr>
+      <w:r>
+        <w:t>Sự cố Nghiêm trọng (P0 - Website tê liệt hoàn toàn): Phản hồi trong vòng 02 giờ, khắc phục trong vòng 08 - 24 giờ làm việc.</w:t>
       </w:r>
     </w:p>
     <w:p>
       <w:pPr>
-        <w:spacing w:after="60" w:before="20" w:line="276" w:lineRule="auto"/>
+        <w:spacing w:before="20" w:after="40" w:line="276" w:lineRule="auto"/>
         <w:ind w:left="360"/>
-        <w:jc w:val="left"/>
-      </w:pPr>
-      <w:r>
-        <w:t>•  Sự cố Thông thường (P2/P3 - Lỗi hiển thị, cập nhật nội dung): Phản hồi trong vòng 04 giờ làm việc, xử lý trong vòng 24 - 48 giờ làm việc.</w:t>
+        <w:jc w:val="both"/>
+      </w:pPr>
+      <w:r>
+        <w:t>Sự cố Thông thường (P2/P3 - Lỗi hiển thị, cập nhật nội dung): Phản hồi trong vòng 04 giờ làm việc, xử lý trong vòng 24 - 48 giờ làm việc.</w:t>
       </w:r>
     </w:p>
     <w:p>
       <w:pPr>
-        <w:spacing w:after="120" w:before="80"/>
+        <w:spacing w:before="180" w:after="60" w:line="276" w:lineRule="auto"/>
+        <w:jc w:val="left"/>
       </w:pPr>
       <w:r>
         <w:rPr>
-          <w:color w:val="CBD5E1"/>
+          <w:b/>
+          <w:color w:val="0F172A"/>
+          <w:sz w:val="22"/>
         </w:rPr>
-        <w:t>―――――――――――――――――――――――――――――――――――――――――――――――――――――――</w:t>
+        <w:t>ĐIỀU 15: TUYÊN BỐ MIỄN TRỪ TRÁCH NHIỆM BÊN THỨ BA (THIRD-PARTY SERVICES)</w:t>
       </w:r>
     </w:p>
     <w:p>
       <w:pPr>
-        <w:spacing w:before="160" w:after="60"/>
-      </w:pPr>
-      <w:r>
-        <w:rPr>
-          <w:b/>
-          <w:color w:val="0D7647"/>
-          <w:sz w:val="23"/>
-        </w:rPr>
-        <w:t>ĐIỀU 15: TUYÊN BỐ MIỄN TRỪ TRÁCH NHIỆM BÊN THỨ BA (THIRD-PARTY SERVICES)</w:t>
+        <w:spacing w:before="20" w:after="60" w:line="276" w:lineRule="auto"/>
+        <w:jc w:val="both"/>
+      </w:pPr>
+      <w:r>
+        <w:t xml:space="preserve">15.1. Hai Bên thừa nhận rằng các dịch vụ số vận hành trên hạ tầng và thuật toán của các Nền tảng Bên Thứ Ba (Google, Meta, Cloudflare, OpenAI, Nhà mạng viễn thông). Bên B không sở hữu, không quản lý và không có quyền quyết định thay cho các nền tảng này.  </w:t>
       </w:r>
     </w:p>
     <w:p>
       <w:pPr>
-        <w:spacing w:after="80" w:before="0" w:line="276" w:lineRule="auto"/>
-        <w:jc w:val="left"/>
-      </w:pPr>
-      <w:r>
-        <w:t xml:space="preserve">15.1. Hai Bên thừa nhận rằng các dịch vụ số vận hành trên hạ tầng và thuật toán của các Nền tảng Bên Thứ Ba (Google, Meta, Cloudflare, OpenAI, Nhà mạng viễn thông). Bên B không sở hữu, không quản lý và không có quyền quyết định thay cho các nền tảng này.  </w:t>
-      </w:r>
-    </w:p>
-    <w:p>
-      <w:pPr>
-        <w:spacing w:after="80" w:before="0" w:line="276" w:lineRule="auto"/>
-        <w:jc w:val="left"/>
+        <w:spacing w:before="20" w:after="60" w:line="276" w:lineRule="auto"/>
+        <w:jc w:val="both"/>
       </w:pPr>
       <w:r>
         <w:t xml:space="preserve">15.2. </w:t>
@@ -2859,8 +2937,8 @@
     </w:p>
     <w:p>
       <w:pPr>
-        <w:spacing w:after="80" w:before="0" w:line="276" w:lineRule="auto"/>
-        <w:jc w:val="left"/>
+        <w:spacing w:before="20" w:after="60" w:line="276" w:lineRule="auto"/>
+        <w:jc w:val="both"/>
       </w:pPr>
       <w:r>
         <w:t xml:space="preserve">a) Sự cố mạng Internet diện rộng, đứt cáp quang biển quốc tế, sự cố ngừng hoạt động toàn cầu (Outage/Downtime) của mạng lưới máy chủ Cloudflare, Google Cloud, AWS;  </w:t>
@@ -2868,8 +2946,8 @@
     </w:p>
     <w:p>
       <w:pPr>
-        <w:spacing w:after="80" w:before="0" w:line="276" w:lineRule="auto"/>
-        <w:jc w:val="left"/>
+        <w:spacing w:before="20" w:after="60" w:line="276" w:lineRule="auto"/>
+        <w:jc w:val="both"/>
       </w:pPr>
       <w:r>
         <w:t xml:space="preserve">b) Tài khoản quảng cáo Google/Meta bị tạm ngưng, khóa hoặc từ chối duyệt do thuật toán AI của nền tảng quét tự động hoặc do vi phạm bắt nguồn từ thẻ tín dụng/mô hình kinh doanh của Bên A;  </w:t>
@@ -2877,8 +2955,8 @@
     </w:p>
     <w:p>
       <w:pPr>
-        <w:spacing w:after="80" w:before="0" w:line="276" w:lineRule="auto"/>
-        <w:jc w:val="left"/>
+        <w:spacing w:before="20" w:after="60" w:line="276" w:lineRule="auto"/>
+        <w:jc w:val="both"/>
       </w:pPr>
       <w:r>
         <w:t xml:space="preserve">c) Google Business Profile bị đình chỉ hoặc từ chối xác minh do địa chỉ thực tế của Bên A không đáp ứng yêu cầu kiểm tra thực địa của Google;  </w:t>
@@ -2886,8 +2964,8 @@
     </w:p>
     <w:p>
       <w:pPr>
-        <w:spacing w:after="80" w:before="0" w:line="276" w:lineRule="auto"/>
-        <w:jc w:val="left"/>
+        <w:spacing w:before="20" w:after="60" w:line="276" w:lineRule="auto"/>
+        <w:jc w:val="both"/>
       </w:pPr>
       <w:r>
         <w:t xml:space="preserve">d) Bên A chậm trễ nộp phí duy trì tên miền cho Nhà đăng ký dẫn đến việc tên miền bị tạm ngưng hoặc mất quyền sử dụng;  </w:t>
@@ -2895,8 +2973,8 @@
     </w:p>
     <w:p>
       <w:pPr>
-        <w:spacing w:after="80" w:before="0" w:line="276" w:lineRule="auto"/>
-        <w:jc w:val="left"/>
+        <w:spacing w:before="20" w:after="60" w:line="276" w:lineRule="auto"/>
+        <w:jc w:val="both"/>
       </w:pPr>
       <w:r>
         <w:t xml:space="preserve">e) Các nhà cung cấp API bên thứ ba (OpenAI, Resend, Zalo ZNS) đột ngột tăng giá cước, thay đổi cấu trúc kỹ thuật (API deprecation) hoặc ngừng cung cấp dịch vụ;  </w:t>
@@ -2904,8 +2982,8 @@
     </w:p>
     <w:p>
       <w:pPr>
-        <w:spacing w:after="80" w:before="0" w:line="276" w:lineRule="auto"/>
-        <w:jc w:val="left"/>
+        <w:spacing w:before="20" w:after="60" w:line="276" w:lineRule="auto"/>
+        <w:jc w:val="both"/>
       </w:pPr>
       <w:r>
         <w:t>VỚI ĐIỀU KIỆN Bên B đã tuân thủ đúng quy trình chuyên môn, không cố ý thực hiện các hành vi gian lận (black-hat) và đã nỗ lực hỗ trợ Bên A liên hệ khiếu nại (appeal) với nền tảng.</w:t>
@@ -2913,32 +2991,22 @@
     </w:p>
     <w:p>
       <w:pPr>
-        <w:spacing w:after="120" w:before="80"/>
+        <w:spacing w:before="180" w:after="60" w:line="276" w:lineRule="auto"/>
+        <w:jc w:val="left"/>
       </w:pPr>
       <w:r>
         <w:rPr>
-          <w:color w:val="CBD5E1"/>
+          <w:b/>
+          <w:color w:val="0F172A"/>
+          <w:sz w:val="22"/>
         </w:rPr>
-        <w:t>―――――――――――――――――――――――――――――――――――――――――――――――――――――――</w:t>
+        <w:t>ĐIỀU 16: GIỚI HẠN TRÁCH NHIỆM BỒI THƯỜNG (LIMITATION OF LIABILITY)</w:t>
       </w:r>
     </w:p>
     <w:p>
       <w:pPr>
-        <w:spacing w:before="160" w:after="60"/>
-      </w:pPr>
-      <w:r>
-        <w:rPr>
-          <w:b/>
-          <w:color w:val="0D7647"/>
-          <w:sz w:val="23"/>
-        </w:rPr>
-        <w:t>ĐIỀU 16: GIỚI HẠN TRÁCH NHIỆM BỒI THƯỜNG (LIMITATION OF LIABILITY)</w:t>
-      </w:r>
-    </w:p>
-    <w:p>
-      <w:pPr>
-        <w:spacing w:after="80" w:before="0" w:line="276" w:lineRule="auto"/>
-        <w:jc w:val="left"/>
+        <w:spacing w:before="20" w:after="60" w:line="276" w:lineRule="auto"/>
+        <w:jc w:val="both"/>
       </w:pPr>
       <w:r>
         <w:t xml:space="preserve">16.1. </w:t>
@@ -2952,8 +3020,8 @@
     </w:p>
     <w:p>
       <w:pPr>
-        <w:spacing w:after="80" w:before="0" w:line="276" w:lineRule="auto"/>
-        <w:jc w:val="left"/>
+        <w:spacing w:before="20" w:after="60" w:line="276" w:lineRule="auto"/>
+        <w:jc w:val="both"/>
       </w:pPr>
       <w:r>
         <w:t xml:space="preserve">Căn cứ Điều 302 Luật Thương mại 2005, trong mọi trường hợp được pháp luật cho phép, Bên B sẽ không chịu trách nhiệm đối với bất kỳ thiệt hại gián tiếp, thiệt hại ngẫu nhiên, tổn thất cơ hội kinh doanh, uy tín thương hiệu, hoặc các khoản lợi nhuận kỳ vọng lẽ ra được hưởng (Lost Profits) của Bên A phát sinh từ hoặc liên quan đến Hợp đồng này.  </w:t>
@@ -2961,8 +3029,8 @@
     </w:p>
     <w:p>
       <w:pPr>
-        <w:spacing w:after="80" w:before="0" w:line="276" w:lineRule="auto"/>
-        <w:jc w:val="left"/>
+        <w:spacing w:before="20" w:after="60" w:line="276" w:lineRule="auto"/>
+        <w:jc w:val="both"/>
       </w:pPr>
       <w:r>
         <w:t xml:space="preserve">16.2. </w:t>
@@ -2976,8 +3044,8 @@
     </w:p>
     <w:p>
       <w:pPr>
-        <w:spacing w:after="80" w:before="0" w:line="276" w:lineRule="auto"/>
-        <w:jc w:val="left"/>
+        <w:spacing w:before="20" w:after="60" w:line="276" w:lineRule="auto"/>
+        <w:jc w:val="both"/>
       </w:pPr>
       <w:r>
         <w:t xml:space="preserve">Trong mọi trường hợp phát sinh tranh chấp hoặc vi phạm hợp đồng được cơ quan tài phán có thẩm quyền xác định thuộc về lỗi bất cẩn của Bên B bằng bản án/phán quyết có hiệu lực pháp luật, </w:t>
@@ -2994,8 +3062,8 @@
     </w:p>
     <w:p>
       <w:pPr>
-        <w:spacing w:after="80" w:before="0" w:line="276" w:lineRule="auto"/>
-        <w:jc w:val="left"/>
+        <w:spacing w:before="20" w:after="60" w:line="276" w:lineRule="auto"/>
+        <w:jc w:val="both"/>
       </w:pPr>
       <w:r>
         <w:t xml:space="preserve">16.3. </w:t>
@@ -3012,8 +3080,8 @@
     </w:p>
     <w:p>
       <w:pPr>
-        <w:spacing w:after="80" w:before="0" w:line="276" w:lineRule="auto"/>
-        <w:jc w:val="left"/>
+        <w:spacing w:before="20" w:after="60" w:line="276" w:lineRule="auto"/>
+        <w:jc w:val="both"/>
       </w:pPr>
       <w:r>
         <w:t xml:space="preserve">a) Thiệt hại phát sinh do hành vi cố ý vi phạm hợp đồng hoặc cố ý làm lộ bí mật kinh doanh;  </w:t>
@@ -3021,8 +3089,8 @@
     </w:p>
     <w:p>
       <w:pPr>
-        <w:spacing w:after="80" w:before="0" w:line="276" w:lineRule="auto"/>
-        <w:jc w:val="left"/>
+        <w:spacing w:before="20" w:after="60" w:line="276" w:lineRule="auto"/>
+        <w:jc w:val="both"/>
       </w:pPr>
       <w:r>
         <w:t xml:space="preserve">b) Hành vi xâm phạm quyền sở hữu trí tuệ của bên thứ ba do lỗi cố ý trực tiếp của Bên B.  </w:t>
@@ -3030,8 +3098,8 @@
     </w:p>
     <w:p>
       <w:pPr>
-        <w:spacing w:after="80" w:before="0" w:line="276" w:lineRule="auto"/>
-        <w:jc w:val="left"/>
+        <w:spacing w:before="20" w:after="60" w:line="276" w:lineRule="auto"/>
+        <w:jc w:val="both"/>
       </w:pPr>
       <w:r>
         <w:t xml:space="preserve">16.4. </w:t>
@@ -3048,32 +3116,22 @@
     </w:p>
     <w:p>
       <w:pPr>
-        <w:spacing w:after="120" w:before="80"/>
+        <w:spacing w:before="180" w:after="60" w:line="276" w:lineRule="auto"/>
+        <w:jc w:val="left"/>
       </w:pPr>
       <w:r>
         <w:rPr>
-          <w:color w:val="CBD5E1"/>
+          <w:b/>
+          <w:color w:val="0F172A"/>
+          <w:sz w:val="22"/>
         </w:rPr>
-        <w:t>―――――――――――――――――――――――――――――――――――――――――――――――――――――――</w:t>
+        <w:t>ĐIỀU 17: CAM KẾT VỀ NỘI DUNG VÀ NGHĨA VỤ BỒI HOÀN CỦA KHÁCH HÀNG (INDEMNIFICATION)</w:t>
       </w:r>
     </w:p>
     <w:p>
       <w:pPr>
-        <w:spacing w:before="160" w:after="60"/>
-      </w:pPr>
-      <w:r>
-        <w:rPr>
-          <w:b/>
-          <w:color w:val="0D7647"/>
-          <w:sz w:val="23"/>
-        </w:rPr>
-        <w:t>ĐIỀU 17: CAM KẾT VỀ NỘI DUNG VÀ NGHĨA VỤ BỒI HOÀN CỦA KHÁCH HÀNG (INDEMNIFICATION)</w:t>
-      </w:r>
-    </w:p>
-    <w:p>
-      <w:pPr>
-        <w:spacing w:after="80" w:before="0" w:line="276" w:lineRule="auto"/>
-        <w:jc w:val="left"/>
+        <w:spacing w:before="20" w:after="60" w:line="276" w:lineRule="auto"/>
+        <w:jc w:val="both"/>
       </w:pPr>
       <w:r>
         <w:t xml:space="preserve">17.1. </w:t>
@@ -3090,8 +3148,8 @@
     </w:p>
     <w:p>
       <w:pPr>
-        <w:spacing w:after="80" w:before="0" w:line="276" w:lineRule="auto"/>
-        <w:jc w:val="left"/>
+        <w:spacing w:before="20" w:after="60" w:line="276" w:lineRule="auto"/>
+        <w:jc w:val="both"/>
       </w:pPr>
       <w:r>
         <w:t xml:space="preserve">17.2. </w:t>
@@ -3105,8 +3163,8 @@
     </w:p>
     <w:p>
       <w:pPr>
-        <w:spacing w:after="80" w:before="0" w:line="276" w:lineRule="auto"/>
-        <w:jc w:val="left"/>
+        <w:spacing w:before="20" w:after="60" w:line="276" w:lineRule="auto"/>
+        <w:jc w:val="both"/>
       </w:pPr>
       <w:r>
         <w:t>Trường hợp cơ quan quản lý nhà nước có thẩm quyền (Thanh tra Bộ/Sở TT&amp;TT, Quản lý thị trường, Cơ quan Thuế, Công an) tiến hành kiểm tra, xử phạt vi phạm hành chính đối với Bên B, hoặc bên thứ ba khởi kiện Bên B do nội dung quảng cáo, sản phẩm kinh doanh hoặc tài liệu do Bên A cung cấp:</w:t>
@@ -3114,8 +3172,8 @@
     </w:p>
     <w:p>
       <w:pPr>
-        <w:spacing w:after="80" w:before="0" w:line="276" w:lineRule="auto"/>
-        <w:jc w:val="left"/>
+        <w:spacing w:before="20" w:after="60" w:line="276" w:lineRule="auto"/>
+        <w:jc w:val="both"/>
       </w:pPr>
       <w:r>
         <w:t xml:space="preserve">a) Bên A có nghĩa vụ bồi hoàn vô điều kiện 100% toàn bộ số tiền phạt ghi trong quyết định xử phạt vi phạm hành chính thay cho Bên B trong vòng </w:t>
@@ -3132,8 +3190,8 @@
     </w:p>
     <w:p>
       <w:pPr>
-        <w:spacing w:after="80" w:before="0" w:line="276" w:lineRule="auto"/>
-        <w:jc w:val="left"/>
+        <w:spacing w:before="20" w:after="60" w:line="276" w:lineRule="auto"/>
+        <w:jc w:val="both"/>
       </w:pPr>
       <w:r>
         <w:t xml:space="preserve">b) Bên A phải thanh toán toàn bộ chi phí phát sinh hợp lý liên quan, bao gồm chi phí pháp lý, phí luật sư đại diện bảo vệ và chi phí khắc phục tổn thất danh tiếng của Bên B.  </w:t>
@@ -3141,8 +3199,8 @@
     </w:p>
     <w:p>
       <w:pPr>
-        <w:spacing w:after="80" w:before="0" w:line="276" w:lineRule="auto"/>
-        <w:jc w:val="left"/>
+        <w:spacing w:before="20" w:after="60" w:line="276" w:lineRule="auto"/>
+        <w:jc w:val="both"/>
       </w:pPr>
       <w:r>
         <w:t xml:space="preserve">17.3. </w:t>
@@ -3159,32 +3217,22 @@
     </w:p>
     <w:p>
       <w:pPr>
-        <w:spacing w:after="120" w:before="80"/>
+        <w:spacing w:before="180" w:after="60" w:line="276" w:lineRule="auto"/>
+        <w:jc w:val="left"/>
       </w:pPr>
       <w:r>
         <w:rPr>
-          <w:color w:val="CBD5E1"/>
+          <w:b/>
+          <w:color w:val="0F172A"/>
+          <w:sz w:val="22"/>
         </w:rPr>
-        <w:t>―――――――――――――――――――――――――――――――――――――――――――――――――――――――</w:t>
+        <w:t>ĐIỀU 18: SỰ KIỆN BẤT KHẢ KHÁNG (FORCE MAJEURE)</w:t>
       </w:r>
     </w:p>
     <w:p>
       <w:pPr>
-        <w:spacing w:before="160" w:after="60"/>
-      </w:pPr>
-      <w:r>
-        <w:rPr>
-          <w:b/>
-          <w:color w:val="0D7647"/>
-          <w:sz w:val="23"/>
-        </w:rPr>
-        <w:t>ĐIỀU 18: SỰ KIỆN BẤT KHẢ KHÁNG (FORCE MAJEURE)</w:t>
-      </w:r>
-    </w:p>
-    <w:p>
-      <w:pPr>
-        <w:spacing w:after="80" w:before="0" w:line="276" w:lineRule="auto"/>
-        <w:jc w:val="left"/>
+        <w:spacing w:before="20" w:after="60" w:line="276" w:lineRule="auto"/>
+        <w:jc w:val="both"/>
       </w:pPr>
       <w:r>
         <w:t xml:space="preserve">18.1. </w:t>
@@ -3201,8 +3249,8 @@
     </w:p>
     <w:p>
       <w:pPr>
-        <w:spacing w:after="80" w:before="0" w:line="276" w:lineRule="auto"/>
-        <w:jc w:val="left"/>
+        <w:spacing w:before="20" w:after="60" w:line="276" w:lineRule="auto"/>
+        <w:jc w:val="both"/>
       </w:pPr>
       <w:r>
         <w:t xml:space="preserve">18.2. </w:t>
@@ -3219,8 +3267,8 @@
     </w:p>
     <w:p>
       <w:pPr>
-        <w:spacing w:after="80" w:before="0" w:line="276" w:lineRule="auto"/>
-        <w:jc w:val="left"/>
+        <w:spacing w:before="20" w:after="60" w:line="276" w:lineRule="auto"/>
+        <w:jc w:val="both"/>
       </w:pPr>
       <w:r>
         <w:t xml:space="preserve">18.3. </w:t>
@@ -3237,32 +3285,22 @@
     </w:p>
     <w:p>
       <w:pPr>
-        <w:spacing w:after="120" w:before="80"/>
+        <w:spacing w:before="180" w:after="60" w:line="276" w:lineRule="auto"/>
+        <w:jc w:val="left"/>
       </w:pPr>
       <w:r>
         <w:rPr>
-          <w:color w:val="CBD5E1"/>
+          <w:b/>
+          <w:color w:val="0F172A"/>
+          <w:sz w:val="22"/>
         </w:rPr>
-        <w:t>―――――――――――――――――――――――――――――――――――――――――――――――――――――――</w:t>
+        <w:t>ĐIỀU 19: GIAO DỊCH ĐIỆN TỬ VÀ CHỮ KÝ ĐIỆN TỬ (E-SIGN &amp; DIGITAL TRANSACTIONS)</w:t>
       </w:r>
     </w:p>
     <w:p>
       <w:pPr>
-        <w:spacing w:before="160" w:after="60"/>
-      </w:pPr>
-      <w:r>
-        <w:rPr>
-          <w:b/>
-          <w:color w:val="0D7647"/>
-          <w:sz w:val="23"/>
-        </w:rPr>
-        <w:t>ĐIỀU 19: GIAO DỊCH ĐIỆN TỬ VÀ CHỮ KÝ ĐIỆN TỬ (E-SIGN &amp; DIGITAL TRANSACTIONS)</w:t>
-      </w:r>
-    </w:p>
-    <w:p>
-      <w:pPr>
-        <w:spacing w:after="80" w:before="0" w:line="276" w:lineRule="auto"/>
-        <w:jc w:val="left"/>
+        <w:spacing w:before="20" w:after="60" w:line="276" w:lineRule="auto"/>
+        <w:jc w:val="both"/>
       </w:pPr>
       <w:r>
         <w:t xml:space="preserve">19.1. </w:t>
@@ -3279,8 +3317,8 @@
     </w:p>
     <w:p>
       <w:pPr>
-        <w:spacing w:after="80" w:before="0" w:line="276" w:lineRule="auto"/>
-        <w:jc w:val="left"/>
+        <w:spacing w:before="20" w:after="60" w:line="276" w:lineRule="auto"/>
+        <w:jc w:val="both"/>
       </w:pPr>
       <w:r>
         <w:t xml:space="preserve">19.2. </w:t>
@@ -3294,8 +3332,8 @@
     </w:p>
     <w:p>
       <w:pPr>
-        <w:spacing w:after="80" w:before="0" w:line="276" w:lineRule="auto"/>
-        <w:jc w:val="left"/>
+        <w:spacing w:before="20" w:after="60" w:line="276" w:lineRule="auto"/>
+        <w:jc w:val="both"/>
       </w:pPr>
       <w:r>
         <w:t xml:space="preserve">a) Ký bằng Chữ ký số (Digital Signature) do tổ chức CA công cộng hợp pháp tại Việt Nam cấp (VNPT, Viettel, MISA, FPT...);  </w:t>
@@ -3303,8 +3341,8 @@
     </w:p>
     <w:p>
       <w:pPr>
-        <w:spacing w:after="80" w:before="0" w:line="276" w:lineRule="auto"/>
-        <w:jc w:val="left"/>
+        <w:spacing w:before="20" w:after="60" w:line="276" w:lineRule="auto"/>
+        <w:jc w:val="both"/>
       </w:pPr>
       <w:r>
         <w:t xml:space="preserve">b) Ký kết qua các Nền tảng hợp đồng điện tử có Audit Trail và dấu thời gian Timestamp (FPT.eContract, VNPT eContract, MISA AMIS, DocuSign);  </w:t>
@@ -3312,8 +3350,8 @@
     </w:p>
     <w:p>
       <w:pPr>
-        <w:spacing w:after="80" w:before="0" w:line="276" w:lineRule="auto"/>
-        <w:jc w:val="left"/>
+        <w:spacing w:before="20" w:after="60" w:line="276" w:lineRule="auto"/>
+        <w:jc w:val="both"/>
       </w:pPr>
       <w:r>
         <w:t xml:space="preserve">c) Ký tay, đóng dấu trên văn bản giấy rồi scan toàn văn dưới định dạng PDF gửi qua Email chính thức;  </w:t>
@@ -3321,8 +3359,8 @@
     </w:p>
     <w:p>
       <w:pPr>
-        <w:spacing w:after="80" w:before="0" w:line="276" w:lineRule="auto"/>
-        <w:jc w:val="left"/>
+        <w:spacing w:before="20" w:after="60" w:line="276" w:lineRule="auto"/>
+        <w:jc w:val="both"/>
       </w:pPr>
       <w:r>
         <w:t xml:space="preserve">d) Đối với gói dịch vụ tiêu chuẩn đặt trực tuyến: Thao tác tick chọn đồng ý Điều khoản và thanh toán thành công theo Điều 34 Luật GDĐT 2023 và Điều 19 Nghị định 52/2013/NĐ-CP.  </w:t>
@@ -3330,8 +3368,8 @@
     </w:p>
     <w:p>
       <w:pPr>
-        <w:spacing w:after="80" w:before="0" w:line="276" w:lineRule="auto"/>
-        <w:jc w:val="left"/>
+        <w:spacing w:before="20" w:after="60" w:line="276" w:lineRule="auto"/>
+        <w:jc w:val="both"/>
       </w:pPr>
       <w:r>
         <w:t xml:space="preserve">19.3. </w:t>
@@ -3348,32 +3386,22 @@
     </w:p>
     <w:p>
       <w:pPr>
-        <w:spacing w:after="120" w:before="80"/>
+        <w:spacing w:before="180" w:after="60" w:line="276" w:lineRule="auto"/>
+        <w:jc w:val="left"/>
       </w:pPr>
       <w:r>
         <w:rPr>
-          <w:color w:val="CBD5E1"/>
+          <w:b/>
+          <w:color w:val="0F172A"/>
+          <w:sz w:val="22"/>
         </w:rPr>
-        <w:t>―――――――――――――――――――――――――――――――――――――――――――――――――――――――</w:t>
+        <w:t>ĐIỀU 20: THỜI HẠN, CHẤM DỨT VÀ THANH LÝ HỢP ĐỒNG</w:t>
       </w:r>
     </w:p>
     <w:p>
       <w:pPr>
-        <w:spacing w:before="160" w:after="60"/>
-      </w:pPr>
-      <w:r>
-        <w:rPr>
-          <w:b/>
-          <w:color w:val="0D7647"/>
-          <w:sz w:val="23"/>
-        </w:rPr>
-        <w:t>ĐIỀU 20: THỜI HẠN, CHẤM DỨT VÀ THANH LÝ HỢP ĐỒNG</w:t>
-      </w:r>
-    </w:p>
-    <w:p>
-      <w:pPr>
-        <w:spacing w:after="80" w:before="0" w:line="276" w:lineRule="auto"/>
-        <w:jc w:val="left"/>
+        <w:spacing w:before="20" w:after="60" w:line="276" w:lineRule="auto"/>
+        <w:jc w:val="both"/>
       </w:pPr>
       <w:r>
         <w:t xml:space="preserve">20.1. </w:t>
@@ -3399,8 +3427,8 @@
     </w:p>
     <w:p>
       <w:pPr>
-        <w:spacing w:after="80" w:before="0" w:line="276" w:lineRule="auto"/>
-        <w:jc w:val="left"/>
+        <w:spacing w:before="20" w:after="60" w:line="276" w:lineRule="auto"/>
+        <w:jc w:val="both"/>
       </w:pPr>
       <w:r>
         <w:t xml:space="preserve">20.2. </w:t>
@@ -3417,8 +3445,8 @@
     </w:p>
     <w:p>
       <w:pPr>
-        <w:spacing w:after="80" w:before="0" w:line="276" w:lineRule="auto"/>
-        <w:jc w:val="left"/>
+        <w:spacing w:before="20" w:after="60" w:line="276" w:lineRule="auto"/>
+        <w:jc w:val="both"/>
       </w:pPr>
       <w:r>
         <w:t xml:space="preserve">a) Hai Bên thỏa thuận chấm dứt bằng văn bản;  </w:t>
@@ -3426,8 +3454,8 @@
     </w:p>
     <w:p>
       <w:pPr>
-        <w:spacing w:after="80" w:before="0" w:line="276" w:lineRule="auto"/>
-        <w:jc w:val="left"/>
+        <w:spacing w:before="20" w:after="60" w:line="276" w:lineRule="auto"/>
+        <w:jc w:val="both"/>
       </w:pPr>
       <w:r>
         <w:t xml:space="preserve">b) Một Bên bị giải thể, phá sản hoặc chấm dứt hoạt động;  </w:t>
@@ -3435,8 +3463,8 @@
     </w:p>
     <w:p>
       <w:pPr>
-        <w:spacing w:after="80" w:before="0" w:line="276" w:lineRule="auto"/>
-        <w:jc w:val="left"/>
+        <w:spacing w:before="20" w:after="60" w:line="276" w:lineRule="auto"/>
+        <w:jc w:val="both"/>
       </w:pPr>
       <w:r>
         <w:t xml:space="preserve">c) Một Bên vi phạm cơ bản nghĩa vụ hợp đồng (như chậm thanh toán quá 20 ngày làm việc hoặc chậm tiến độ quá 30 ngày làm việc không có lý do chính đáng) và không khắc phục trong vòng 10 ngày làm việc kể từ khi nhận được thông báo vi phạm bằng văn bản.  </w:t>
@@ -3444,8 +3472,8 @@
     </w:p>
     <w:p>
       <w:pPr>
-        <w:spacing w:after="80" w:before="0" w:line="276" w:lineRule="auto"/>
-        <w:jc w:val="left"/>
+        <w:spacing w:before="20" w:after="60" w:line="276" w:lineRule="auto"/>
+        <w:jc w:val="both"/>
       </w:pPr>
       <w:r>
         <w:t xml:space="preserve">20.3. </w:t>
@@ -3462,48 +3490,48 @@
     </w:p>
     <w:p>
       <w:pPr>
-        <w:spacing w:after="60" w:before="20" w:line="276" w:lineRule="auto"/>
+        <w:spacing w:before="20" w:after="40" w:line="276" w:lineRule="auto"/>
         <w:ind w:left="360"/>
-        <w:jc w:val="left"/>
-      </w:pPr>
-      <w:r>
-        <w:t>•  Hai Bên tiến hành đối soát khối lượng công việc thực tế đã hoàn thành;</w:t>
+        <w:jc w:val="both"/>
+      </w:pPr>
+      <w:r>
+        <w:t>Hai Bên tiến hành đối soát khối lượng công việc thực tế đã hoàn thành;</w:t>
       </w:r>
     </w:p>
     <w:p>
       <w:pPr>
-        <w:spacing w:after="60" w:before="20" w:line="276" w:lineRule="auto"/>
+        <w:spacing w:before="20" w:after="40" w:line="276" w:lineRule="auto"/>
         <w:ind w:left="360"/>
-        <w:jc w:val="left"/>
-      </w:pPr>
-      <w:r>
-        <w:t>•  Bên A thanh toán đầy đủ toàn bộ các khoản nợ còn thiếu cho Bên B;</w:t>
+        <w:jc w:val="both"/>
+      </w:pPr>
+      <w:r>
+        <w:t>Bên A thanh toán đầy đủ toàn bộ các khoản nợ còn thiếu cho Bên B;</w:t>
       </w:r>
     </w:p>
     <w:p>
       <w:pPr>
-        <w:spacing w:after="60" w:before="20" w:line="276" w:lineRule="auto"/>
+        <w:spacing w:before="20" w:after="40" w:line="276" w:lineRule="auto"/>
         <w:ind w:left="360"/>
-        <w:jc w:val="left"/>
-      </w:pPr>
-      <w:r>
-        <w:t>•  Bên B bàn giao quyền sở hữu tài sản tương ứng với số tiền đã nhận và tiến hành xóa dữ liệu theo Điều 12;</w:t>
+        <w:jc w:val="both"/>
+      </w:pPr>
+      <w:r>
+        <w:t>Bên B bàn giao quyền sở hữu tài sản tương ứng với số tiền đã nhận và tiến hành xóa dữ liệu theo Điều 12;</w:t>
       </w:r>
     </w:p>
     <w:p>
       <w:pPr>
-        <w:spacing w:after="60" w:before="20" w:line="276" w:lineRule="auto"/>
+        <w:spacing w:before="20" w:after="40" w:line="276" w:lineRule="auto"/>
         <w:ind w:left="360"/>
-        <w:jc w:val="left"/>
-      </w:pPr>
-      <w:r>
-        <w:t xml:space="preserve">•  Hai Bên ký kết Biên Bản Thanh Lý Hợp Đồng để chấm dứt toàn bộ quyền và nghĩa vụ.  </w:t>
+        <w:jc w:val="both"/>
+      </w:pPr>
+      <w:r>
+        <w:t>Hai Bên ký kết Biên Bản Thanh Lý Hợp Đồng để chấm dứt toàn bộ quyền và nghĩa vụ.</w:t>
       </w:r>
     </w:p>
     <w:p>
       <w:pPr>
-        <w:spacing w:after="80" w:before="0" w:line="276" w:lineRule="auto"/>
-        <w:jc w:val="left"/>
+        <w:spacing w:before="20" w:after="60" w:line="276" w:lineRule="auto"/>
+        <w:jc w:val="both"/>
       </w:pPr>
       <w:r>
         <w:t xml:space="preserve">20.4. </w:t>
@@ -3520,32 +3548,22 @@
     </w:p>
     <w:p>
       <w:pPr>
-        <w:spacing w:after="120" w:before="80"/>
+        <w:spacing w:before="180" w:after="60" w:line="276" w:lineRule="auto"/>
+        <w:jc w:val="left"/>
       </w:pPr>
       <w:r>
         <w:rPr>
-          <w:color w:val="CBD5E1"/>
+          <w:b/>
+          <w:color w:val="0F172A"/>
+          <w:sz w:val="22"/>
         </w:rPr>
-        <w:t>―――――――――――――――――――――――――――――――――――――――――――――――――――――――</w:t>
+        <w:t>ĐIỀU 21: LUẬT ÁP DỤNG VÀ GIẢI QUYẾT TRANH CHẤP</w:t>
       </w:r>
     </w:p>
     <w:p>
       <w:pPr>
-        <w:spacing w:before="160" w:after="60"/>
-      </w:pPr>
-      <w:r>
-        <w:rPr>
-          <w:b/>
-          <w:color w:val="0D7647"/>
-          <w:sz w:val="23"/>
-        </w:rPr>
-        <w:t>ĐIỀU 21: LUẬT ÁP DỤNG VÀ GIẢI QUYẾT TRANH CHẤP</w:t>
-      </w:r>
-    </w:p>
-    <w:p>
-      <w:pPr>
-        <w:spacing w:after="80" w:before="0" w:line="276" w:lineRule="auto"/>
-        <w:jc w:val="left"/>
+        <w:spacing w:before="20" w:after="60" w:line="276" w:lineRule="auto"/>
+        <w:jc w:val="both"/>
       </w:pPr>
       <w:r>
         <w:t xml:space="preserve">21.1. </w:t>
@@ -3562,8 +3580,8 @@
     </w:p>
     <w:p>
       <w:pPr>
-        <w:spacing w:after="80" w:before="0" w:line="276" w:lineRule="auto"/>
-        <w:jc w:val="left"/>
+        <w:spacing w:before="20" w:after="60" w:line="276" w:lineRule="auto"/>
+        <w:jc w:val="both"/>
       </w:pPr>
       <w:r>
         <w:t xml:space="preserve">21.2. </w:t>
@@ -3580,8 +3598,8 @@
     </w:p>
     <w:p>
       <w:pPr>
-        <w:spacing w:after="80" w:before="0" w:line="276" w:lineRule="auto"/>
-        <w:jc w:val="left"/>
+        <w:spacing w:before="20" w:after="60" w:line="276" w:lineRule="auto"/>
+        <w:jc w:val="both"/>
       </w:pPr>
       <w:r>
         <w:t xml:space="preserve">21.3. </w:t>
@@ -3607,168 +3625,448 @@
     </w:p>
     <w:p>
       <w:pPr>
-        <w:spacing w:after="120" w:before="80"/>
+        <w:spacing w:before="180" w:after="60" w:line="276" w:lineRule="auto"/>
+        <w:jc w:val="left"/>
       </w:pPr>
       <w:r>
         <w:rPr>
-          <w:color w:val="CBD5E1"/>
+          <w:b/>
+          <w:color w:val="0F172A"/>
+          <w:sz w:val="22"/>
         </w:rPr>
-        <w:t>―――――――――――――――――――――――――――――――――――――――――――――――――――――――</w:t>
+        <w:t>ĐIỀU 22: HIỆU LỰC THI HÀNH</w:t>
       </w:r>
     </w:p>
     <w:p>
       <w:pPr>
-        <w:spacing w:before="160" w:after="60"/>
+        <w:spacing w:before="20" w:after="60" w:line="276" w:lineRule="auto"/>
+        <w:jc w:val="both"/>
+      </w:pPr>
+      <w:r>
+        <w:t xml:space="preserve">22.1. Hợp đồng này có hiệu lực kể từ ngày ký và thay thế toàn bộ các thỏa thuận miệng hoặc văn bản ghi nhớ trước đây giữa Các Bên về cùng nội dung.  </w:t>
+      </w:r>
+    </w:p>
+    <w:p>
+      <w:pPr>
+        <w:spacing w:before="20" w:after="60" w:line="276" w:lineRule="auto"/>
+        <w:jc w:val="both"/>
+      </w:pPr>
+      <w:r>
+        <w:t xml:space="preserve">22.2. Mọi sửa đổi, bổ sung đối với Hợp đồng này chỉ có giá trị pháp lý khi được lập thành văn bản hoặc phụ lục hợp đồng có chữ ký/chữ ký điện tử của Người đại diện có thẩm quyền của Các Bên.  </w:t>
+      </w:r>
+    </w:p>
+    <w:p>
+      <w:pPr>
+        <w:spacing w:before="20" w:after="60" w:line="276" w:lineRule="auto"/>
+        <w:jc w:val="both"/>
+      </w:pPr>
+      <w:r>
+        <w:t>22.3. Hợp đồng được lập thành 02 (hai) bản gốc bằng tiếng Việt có giá trị pháp lý như nhau, mỗi Bên giữ 01 (một) bản để thực hiện (hoặc được phát hành và lưu trữ dưới dạng 01 bản điện tử có chữ ký số hợp pháp của Các Bên).</w:t>
+      </w:r>
+    </w:p>
+    <w:p>
+      <w:pPr>
+        <w:spacing w:before="180" w:after="60" w:line="276" w:lineRule="auto"/>
+        <w:jc w:val="left"/>
       </w:pPr>
       <w:r>
         <w:rPr>
           <w:b/>
-          <w:color w:val="0D7647"/>
-          <w:sz w:val="23"/>
+          <w:color w:val="0F172A"/>
+          <w:sz w:val="22"/>
         </w:rPr>
-        <w:t>ĐIỀU 22: HIỆU LỰC THI HÀNH</w:t>
+        <w:t>ĐẠI DIỆN CÁC BÊN KÝ TÊN</w:t>
       </w:r>
     </w:p>
     <w:p>
       <w:pPr>
-        <w:spacing w:after="80" w:before="0" w:line="276" w:lineRule="auto"/>
-        <w:jc w:val="left"/>
-      </w:pPr>
-      <w:r>
-        <w:t xml:space="preserve">22.1. Hợp đồng này có hiệu lực kể từ ngày ký và thay thế toàn bộ các thỏa thuận miệng hoặc văn bản ghi nhớ trước đây giữa Các Bên về cùng nội dung.  </w:t>
+        <w:spacing w:before="20" w:after="60" w:line="276" w:lineRule="auto"/>
+        <w:jc w:val="both"/>
+      </w:pPr>
+      <w:r>
+        <w:rPr>
+          <w:i/>
+        </w:rPr>
+        <w:t>(Ký, ghi rõ họ tên và đóng dấu pháp nhân)</w:t>
       </w:r>
     </w:p>
+    <w:tbl>
+      <w:tblPr>
+        <w:tblW w:type="auto" w:w="0"/>
+        <w:jc w:val="center"/>
+        <w:tblLook w:firstColumn="1" w:firstRow="1" w:lastColumn="0" w:lastRow="0" w:noHBand="0" w:noVBand="1" w:val="04A0"/>
+        <w:tblBorders>
+          <w:top w:val="single" w:sz="4" w:space="0" w:color="CBD5E1"/>
+          <w:bottom w:val="single" w:sz="4" w:space="0" w:color="CBD5E1"/>
+          <w:left w:val="none"/>
+          <w:right w:val="none"/>
+          <w:insideH w:val="single" w:sz="4" w:space="0" w:color="CBD5E1"/>
+          <w:insideV w:val="none"/>
+        </w:tblBorders>
+      </w:tblPr>
+      <w:tblGrid>
+        <w:gridCol w:w="4874"/>
+        <w:gridCol w:w="4874"/>
+      </w:tblGrid>
+      <w:tr>
+        <w:trPr>
+          <w:cantSplit/>
+        </w:trPr>
+        <w:tc>
+          <w:tcPr>
+            <w:tcW w:type="dxa" w:w="4867"/>
+            <w:vAlign w:val="center"/>
+            <w:tcW w:w="4867" w:type="dxa"/>
+            <w:tcMar>
+              <w:top w:w="90" w:type="dxa"/>
+              <w:bottom w:w="90" w:type="dxa"/>
+              <w:left w:w="100" w:type="dxa"/>
+              <w:right w:w="100" w:type="dxa"/>
+            </w:tcMar>
+            <w:shd w:fill="F8FAFC"/>
+          </w:tcPr>
+          <w:p>
+            <w:r/>
+          </w:p>
+          <w:p>
+            <w:pPr>
+              <w:spacing w:before="0" w:after="40" w:line="276" w:lineRule="auto"/>
+              <w:jc w:val="center"/>
+            </w:pPr>
+            <w:r>
+              <w:rPr>
+                <w:b/>
+                <w:sz w:val="20"/>
+              </w:rPr>
+              <w:t>ĐẠI DIỆN BÊN A</w:t>
+            </w:r>
+          </w:p>
+        </w:tc>
+        <w:tc>
+          <w:tcPr>
+            <w:tcW w:type="dxa" w:w="4882"/>
+            <w:vAlign w:val="center"/>
+            <w:tcW w:w="4881" w:type="dxa"/>
+            <w:tcMar>
+              <w:top w:w="90" w:type="dxa"/>
+              <w:bottom w:w="90" w:type="dxa"/>
+              <w:left w:w="100" w:type="dxa"/>
+              <w:right w:w="100" w:type="dxa"/>
+            </w:tcMar>
+            <w:shd w:fill="F8FAFC"/>
+          </w:tcPr>
+          <w:p>
+            <w:r/>
+          </w:p>
+          <w:p>
+            <w:pPr>
+              <w:spacing w:before="0" w:after="40" w:line="276" w:lineRule="auto"/>
+              <w:jc w:val="center"/>
+            </w:pPr>
+            <w:r>
+              <w:rPr>
+                <w:b/>
+                <w:sz w:val="20"/>
+              </w:rPr>
+              <w:t>ĐẠI DIỆN BÊN B</w:t>
+            </w:r>
+          </w:p>
+        </w:tc>
+      </w:tr>
+      <w:tr>
+        <w:trPr>
+          <w:cantSplit/>
+        </w:trPr>
+        <w:tc>
+          <w:tcPr>
+            <w:tcW w:type="dxa" w:w="4867"/>
+            <w:vAlign w:val="center"/>
+            <w:tcW w:w="4867" w:type="dxa"/>
+            <w:tcMar>
+              <w:top w:w="80" w:type="dxa"/>
+              <w:bottom w:w="80" w:type="dxa"/>
+              <w:left w:w="100" w:type="dxa"/>
+              <w:right w:w="100" w:type="dxa"/>
+            </w:tcMar>
+            <w:shd w:fill="FFFFFF"/>
+          </w:tcPr>
+          <w:p>
+            <w:r/>
+          </w:p>
+          <w:p>
+            <w:pPr>
+              <w:spacing w:before="0" w:after="40" w:line="276" w:lineRule="auto"/>
+              <w:jc w:val="left"/>
+            </w:pPr>
+            <w:r>
+              <w:rPr>
+                <w:b/>
+              </w:rPr>
+              <w:t>[TÊN_DOANH_NGHIỆP_KHÁCH_HÀNG]</w:t>
+            </w:r>
+          </w:p>
+        </w:tc>
+        <w:tc>
+          <w:tcPr>
+            <w:tcW w:type="dxa" w:w="4882"/>
+            <w:vAlign w:val="center"/>
+            <w:tcW w:w="4881" w:type="dxa"/>
+            <w:tcMar>
+              <w:top w:w="80" w:type="dxa"/>
+              <w:bottom w:w="80" w:type="dxa"/>
+              <w:left w:w="100" w:type="dxa"/>
+              <w:right w:w="100" w:type="dxa"/>
+            </w:tcMar>
+            <w:shd w:fill="FFFFFF"/>
+          </w:tcPr>
+          <w:p>
+            <w:r/>
+          </w:p>
+          <w:p>
+            <w:pPr>
+              <w:spacing w:before="0" w:after="40" w:line="276" w:lineRule="auto"/>
+              <w:jc w:val="left"/>
+            </w:pPr>
+            <w:r>
+              <w:rPr>
+                <w:b/>
+              </w:rPr>
+              <w:t>[LOCALMATE_LEGAL_NAME]</w:t>
+            </w:r>
+          </w:p>
+        </w:tc>
+      </w:tr>
+      <w:tr>
+        <w:trPr>
+          <w:cantSplit/>
+        </w:trPr>
+        <w:tc>
+          <w:tcPr>
+            <w:tcW w:type="dxa" w:w="4867"/>
+            <w:vAlign w:val="center"/>
+            <w:tcW w:w="4867" w:type="dxa"/>
+            <w:tcMar>
+              <w:top w:w="80" w:type="dxa"/>
+              <w:bottom w:w="80" w:type="dxa"/>
+              <w:left w:w="100" w:type="dxa"/>
+              <w:right w:w="100" w:type="dxa"/>
+            </w:tcMar>
+            <w:shd w:fill="FAFAFA"/>
+          </w:tcPr>
+          <w:p>
+            <w:r/>
+          </w:p>
+          <w:p>
+            <w:pPr>
+              <w:spacing w:before="0" w:after="40" w:line="276" w:lineRule="auto"/>
+              <w:jc w:val="left"/>
+            </w:pPr>
+            <w:r>
+              <w:rPr>
+                <w:i/>
+              </w:rPr>
+              <w:t>(Ký tên, đóng dấu hoặc Ký số điện tử)</w:t>
+            </w:r>
+          </w:p>
+        </w:tc>
+        <w:tc>
+          <w:tcPr>
+            <w:tcW w:type="dxa" w:w="4882"/>
+            <w:vAlign w:val="center"/>
+            <w:tcW w:w="4881" w:type="dxa"/>
+            <w:tcMar>
+              <w:top w:w="80" w:type="dxa"/>
+              <w:bottom w:w="80" w:type="dxa"/>
+              <w:left w:w="100" w:type="dxa"/>
+              <w:right w:w="100" w:type="dxa"/>
+            </w:tcMar>
+            <w:shd w:fill="FAFAFA"/>
+          </w:tcPr>
+          <w:p>
+            <w:r/>
+          </w:p>
+          <w:p>
+            <w:pPr>
+              <w:spacing w:before="0" w:after="40" w:line="276" w:lineRule="auto"/>
+              <w:jc w:val="left"/>
+            </w:pPr>
+            <w:r>
+              <w:rPr>
+                <w:i/>
+              </w:rPr>
+              <w:t>(Ký tên, đóng dấu hoặc Ký số điện tử)</w:t>
+            </w:r>
+          </w:p>
+        </w:tc>
+      </w:tr>
+      <w:tr>
+        <w:trPr>
+          <w:cantSplit/>
+        </w:trPr>
+        <w:tc>
+          <w:tcPr>
+            <w:tcW w:type="dxa" w:w="4867"/>
+            <w:vAlign w:val="center"/>
+            <w:tcW w:w="4867" w:type="dxa"/>
+            <w:tcMar>
+              <w:top w:w="80" w:type="dxa"/>
+              <w:bottom w:w="80" w:type="dxa"/>
+              <w:left w:w="100" w:type="dxa"/>
+              <w:right w:w="100" w:type="dxa"/>
+            </w:tcMar>
+            <w:shd w:fill="FFFFFF"/>
+          </w:tcPr>
+          <w:p>
+            <w:r/>
+          </w:p>
+        </w:tc>
+        <w:tc>
+          <w:tcPr>
+            <w:tcW w:type="dxa" w:w="4882"/>
+            <w:vAlign w:val="center"/>
+            <w:tcW w:w="4881" w:type="dxa"/>
+            <w:tcMar>
+              <w:top w:w="80" w:type="dxa"/>
+              <w:bottom w:w="80" w:type="dxa"/>
+              <w:left w:w="100" w:type="dxa"/>
+              <w:right w:w="100" w:type="dxa"/>
+            </w:tcMar>
+            <w:shd w:fill="FFFFFF"/>
+          </w:tcPr>
+          <w:p>
+            <w:r/>
+          </w:p>
+        </w:tc>
+      </w:tr>
+      <w:tr>
+        <w:trPr>
+          <w:cantSplit/>
+        </w:trPr>
+        <w:tc>
+          <w:tcPr>
+            <w:tcW w:type="dxa" w:w="4867"/>
+            <w:vAlign w:val="center"/>
+            <w:tcW w:w="4867" w:type="dxa"/>
+            <w:tcMar>
+              <w:top w:w="80" w:type="dxa"/>
+              <w:bottom w:w="80" w:type="dxa"/>
+              <w:left w:w="100" w:type="dxa"/>
+              <w:right w:w="100" w:type="dxa"/>
+            </w:tcMar>
+            <w:shd w:fill="FAFAFA"/>
+          </w:tcPr>
+          <w:p>
+            <w:r/>
+          </w:p>
+          <w:p>
+            <w:pPr>
+              <w:spacing w:before="0" w:after="40" w:line="276" w:lineRule="auto"/>
+              <w:jc w:val="left"/>
+            </w:pPr>
+            <w:r>
+              <w:rPr>
+                <w:b/>
+              </w:rPr>
+              <w:t>[ĐẠI_DIỆN_KHÁCH_HÀNG]</w:t>
+            </w:r>
+          </w:p>
+        </w:tc>
+        <w:tc>
+          <w:tcPr>
+            <w:tcW w:type="dxa" w:w="4882"/>
+            <w:vAlign w:val="center"/>
+            <w:tcW w:w="4881" w:type="dxa"/>
+            <w:tcMar>
+              <w:top w:w="80" w:type="dxa"/>
+              <w:bottom w:w="80" w:type="dxa"/>
+              <w:left w:w="100" w:type="dxa"/>
+              <w:right w:w="100" w:type="dxa"/>
+            </w:tcMar>
+            <w:shd w:fill="FAFAFA"/>
+          </w:tcPr>
+          <w:p>
+            <w:r/>
+          </w:p>
+          <w:p>
+            <w:pPr>
+              <w:spacing w:before="0" w:after="40" w:line="276" w:lineRule="auto"/>
+              <w:jc w:val="left"/>
+            </w:pPr>
+            <w:r>
+              <w:rPr>
+                <w:b/>
+              </w:rPr>
+              <w:t>[REPRESENTATIVE]</w:t>
+            </w:r>
+          </w:p>
+        </w:tc>
+      </w:tr>
+      <w:tr>
+        <w:trPr>
+          <w:cantSplit/>
+        </w:trPr>
+        <w:tc>
+          <w:tcPr>
+            <w:tcW w:type="dxa" w:w="4867"/>
+            <w:vAlign w:val="center"/>
+            <w:tcW w:w="4867" w:type="dxa"/>
+            <w:tcMar>
+              <w:top w:w="80" w:type="dxa"/>
+              <w:bottom w:w="80" w:type="dxa"/>
+              <w:left w:w="100" w:type="dxa"/>
+              <w:right w:w="100" w:type="dxa"/>
+            </w:tcMar>
+            <w:shd w:fill="FFFFFF"/>
+          </w:tcPr>
+          <w:p>
+            <w:r/>
+          </w:p>
+          <w:p>
+            <w:pPr>
+              <w:spacing w:before="0" w:after="40" w:line="276" w:lineRule="auto"/>
+              <w:jc w:val="left"/>
+            </w:pPr>
+            <w:r>
+              <w:t>Chức vụ: [CHỨC_VỤ_KHÁCH_HÀNG]</w:t>
+            </w:r>
+          </w:p>
+        </w:tc>
+        <w:tc>
+          <w:tcPr>
+            <w:tcW w:type="dxa" w:w="4882"/>
+            <w:vAlign w:val="center"/>
+            <w:tcW w:w="4881" w:type="dxa"/>
+            <w:tcMar>
+              <w:top w:w="80" w:type="dxa"/>
+              <w:bottom w:w="80" w:type="dxa"/>
+              <w:left w:w="100" w:type="dxa"/>
+              <w:right w:w="100" w:type="dxa"/>
+            </w:tcMar>
+            <w:shd w:fill="FFFFFF"/>
+          </w:tcPr>
+          <w:p>
+            <w:r/>
+          </w:p>
+          <w:p>
+            <w:pPr>
+              <w:spacing w:before="0" w:after="40" w:line="276" w:lineRule="auto"/>
+              <w:jc w:val="left"/>
+            </w:pPr>
+            <w:r>
+              <w:t>Chức vụ: [TITLE]</w:t>
+            </w:r>
+          </w:p>
+        </w:tc>
+      </w:tr>
+    </w:tbl>
     <w:p>
       <w:pPr>
-        <w:spacing w:after="80" w:before="0" w:line="276" w:lineRule="auto"/>
-        <w:jc w:val="left"/>
-      </w:pPr>
-      <w:r>
-        <w:t xml:space="preserve">22.2. Mọi sửa đổi, bổ sung đối với Hợp đồng này chỉ có giá trị pháp lý khi được lập thành văn bản hoặc phụ lục hợp đồng có chữ ký/chữ ký điện tử của Người đại diện có thẩm quyền của Các Bên.  </w:t>
-      </w:r>
-    </w:p>
-    <w:p>
-      <w:pPr>
-        <w:spacing w:after="80" w:before="0" w:line="276" w:lineRule="auto"/>
-        <w:jc w:val="left"/>
-      </w:pPr>
-      <w:r>
-        <w:t>22.3. Hợp đồng được lập thành 02 (hai) bản gốc bằng tiếng Việt có giá trị pháp lý như nhau, mỗi Bên giữ 01 (một) bản để thực hiện (hoặc được phát hành và lưu trữ dưới dạng 01 bản điện tử có chữ ký số hợp pháp của Các Bên).</w:t>
-      </w:r>
-    </w:p>
-    <w:p>
-      <w:pPr>
-        <w:spacing w:after="120" w:before="80"/>
-      </w:pPr>
-      <w:r>
-        <w:rPr>
-          <w:color w:val="CBD5E1"/>
-        </w:rPr>
-        <w:t>―――――――――――――――――――――――――――――――――――――――――――――――――――――――</w:t>
-      </w:r>
-    </w:p>
-    <w:p>
-      <w:pPr>
-        <w:spacing w:before="160" w:after="60"/>
-      </w:pPr>
-      <w:r>
-        <w:rPr>
-          <w:b/>
-          <w:color w:val="0D7647"/>
-          <w:sz w:val="23"/>
-        </w:rPr>
-        <w:t>ĐẠI DIỆN CÁC BÊN KÝ TÊN</w:t>
-      </w:r>
-    </w:p>
-    <w:p>
-      <w:pPr>
-        <w:spacing w:after="80" w:before="0" w:line="276" w:lineRule="auto"/>
-        <w:jc w:val="left"/>
-      </w:pPr>
-      <w:r>
-        <w:rPr>
-          <w:rFonts w:ascii="Consolas" w:hAnsi="Consolas"/>
-          <w:color w:val="B42828"/>
-          <w:sz w:val="20"/>
-        </w:rPr>
-      </w:r>
-      <w:r>
-        <w:t>`</w:t>
-      </w:r>
-    </w:p>
-    <w:p>
-      <w:pPr>
-        <w:spacing w:after="80" w:before="0" w:line="276" w:lineRule="auto"/>
-        <w:jc w:val="left"/>
-      </w:pPr>
-      <w:r>
-        <w:t xml:space="preserve">             ĐẠI DIỆN BÊN A                                   ĐẠI DIỆN BÊN B</w:t>
-      </w:r>
-    </w:p>
-    <w:p>
-      <w:pPr>
-        <w:spacing w:after="80" w:before="0" w:line="276" w:lineRule="auto"/>
-        <w:jc w:val="left"/>
-      </w:pPr>
-      <w:r>
-        <w:t xml:space="preserve">  [TÊN_DOANH_NGHIỆP_KHÁCH_HÀNG]                           [LOCALMATE_LEGAL_NAME]</w:t>
-      </w:r>
-    </w:p>
-    <w:p>
-      <w:pPr>
-        <w:spacing w:after="80" w:before="0" w:line="276" w:lineRule="auto"/>
-        <w:jc w:val="left"/>
-      </w:pPr>
-      <w:r>
-        <w:t>_________________________________________         _________________________________________</w:t>
-      </w:r>
-    </w:p>
-    <w:p>
-      <w:pPr>
-        <w:spacing w:after="80" w:before="0" w:line="276" w:lineRule="auto"/>
-        <w:jc w:val="left"/>
-      </w:pPr>
-      <w:r>
-        <w:t xml:space="preserve">  [ĐẠI_DIỆN_KHÁCH_HÀNG]                             [REPRESENTATIVE]</w:t>
-      </w:r>
-    </w:p>
-    <w:p>
-      <w:pPr>
-        <w:spacing w:after="80" w:before="0" w:line="276" w:lineRule="auto"/>
-        <w:jc w:val="left"/>
-      </w:pPr>
-      <w:r>
-        <w:t xml:space="preserve">  Chức vụ: [CHỨC_VỤ_KHÁCH_HÀNG]                     Chức vụ: [TITLE]</w:t>
-      </w:r>
-    </w:p>
-    <w:p>
-      <w:pPr>
-        <w:spacing w:after="80" w:before="0" w:line="276" w:lineRule="auto"/>
-        <w:jc w:val="left"/>
-      </w:pPr>
-      <w:r>
-        <w:t xml:space="preserve">  (Ký tên, đóng dấu hoặc Ký số điện tử)             (Ký tên, đóng dấu hoặc Ký số điện tử)</w:t>
-      </w:r>
-    </w:p>
-    <w:p>
-      <w:pPr>
-        <w:spacing w:after="80" w:before="0" w:line="276" w:lineRule="auto"/>
-        <w:jc w:val="left"/>
-      </w:pPr>
-      <w:r>
-        <w:rPr>
-          <w:rFonts w:ascii="Consolas" w:hAnsi="Consolas"/>
-          <w:color w:val="B42828"/>
-          <w:sz w:val="20"/>
-        </w:rPr>
-      </w:r>
-      <w:r>
-        <w:t>`</w:t>
-      </w:r>
+        <w:spacing w:before="0" w:after="80"/>
+      </w:pPr>
     </w:p>
     <w:sectPr>
       <w:pgSz w:w="11909" w:h="16834"/>
-      <w:pgMar w:top="1152" w:right="1152" w:bottom="1152" w:left="1152" w:header="720" w:footer="720" w:gutter="0"/>
+      <w:pgMar w:top="1138" w:right="936" w:bottom="1138" w:left="1224" w:header="720" w:footer="720" w:gutter="0"/>
       <w:cols w:space="720"/>
       <w:docGrid w:linePitch="360"/>
     </w:sectPr>
@@ -4141,7 +4439,7 @@
     <w:rsid w:val="00FC693F"/>
     <w:rPr>
       <w:rFonts w:ascii="Times New Roman" w:hAnsi="Times New Roman"/>
-      <w:color w:val="1E293B"/>
+      <w:color w:val="0F172A"/>
       <w:sz w:val="22"/>
     </w:rPr>
   </w:style>

</xml_diff>

<commit_message>
feat(legal): implement 3-tier IP architecture and 'Your Data. Your Business. Your Control' policy with Exit Guarantee
</commit_message>
<xml_diff>
--- a/legal/01-core/01_MASTER_SERVICE_AGREEMENT_LOCALMATE.docx
+++ b/legal/01-core/01_MASTER_SERVICE_AGREEMENT_LOCALMATE.docx
@@ -2145,7 +2145,7 @@
           <w:color w:val="0F172A"/>
           <w:sz w:val="22"/>
         </w:rPr>
-        <w:t>ĐIỀU 10: QUYỀN SỞ HỮU TRÍ TUỆ VÀ BẢN QUYỀN TÀI SẢN SỐ</w:t>
+        <w:t>ĐIỀU 10: QUYỀN SỞ HỮU TRÍ TUỆ, BẢO ĐẢM KIỂM SOÁT DỮ LIỆU &amp; LỐI THOÁT AN TOÀN</w:t>
       </w:r>
     </w:p>
     <w:p>
@@ -2160,10 +2160,19 @@
         <w:rPr>
           <w:b/>
         </w:rPr>
-        <w:t>Phân Định 5 Nhóm Tài Sản Số (IP Matrix):</w:t>
-      </w:r>
-      <w:r>
-        <w:t xml:space="preserve"> Căn cứ Luật Sở hữu trí tuệ 2005 (sửa đổi 2022) và Nghị định 17/2023/NĐ-CP, toàn bộ tài sản phát sinh từ Hợp đồng này được phân loại và quản trị như sau:</w:t>
+        <w:t>Nguyên Tắc Thương Mại Cốt Lõi ("Your Data. Your Business. Your Control"):</w:t>
+      </w:r>
+      <w:r>
+        <w:t xml:space="preserve">  </w:t>
+      </w:r>
+    </w:p>
+    <w:p>
+      <w:pPr>
+        <w:spacing w:before="20" w:after="60" w:line="276" w:lineRule="auto"/>
+        <w:jc w:val="both"/>
+      </w:pPr>
+      <w:r>
+        <w:t>Hai Bên xác lập nguyên tắc tôn trọng tối đa quyền tự chủ của Khách hàng, loại trừ triệt để nguy cơ trói buộc công nghệ (Vendor Lock-in):</w:t>
       </w:r>
     </w:p>
     <w:p>
@@ -2173,22 +2182,44 @@
         <w:jc w:val="both"/>
       </w:pPr>
       <w:r>
+        <w:t xml:space="preserve">Dữ liệu kinh doanh, danh bạ khách hàng, CRM, tài khoản quảng cáo, Google Maps và tên miền </w:t>
+      </w:r>
+      <w:r>
         <w:rPr>
           <w:b/>
         </w:rPr>
-        <w:t>Nhóm 1: Sản phẩm tạo riêng cho Khách hàng (Custom Deliverables):</w:t>
-      </w:r>
-      <w:r>
-        <w:t xml:space="preserve"> Nội dung bài viết viết riêng, ảnh chụp độc quyền cơ sở, video quảng cáo dựng riêng, layout tùy biến mang nhận diện thương hiệu của Bên A. Quyền tài sản (Economic Rights) đối với nhóm này sẽ được </w:t>
+        <w:t>luôn thuộc quyền sở hữu tuyệt đối của Bên A</w:t>
+      </w:r>
+      <w:r>
+        <w:t>.</w:t>
+      </w:r>
+    </w:p>
+    <w:p>
+      <w:pPr>
+        <w:spacing w:before="20" w:after="40" w:line="276" w:lineRule="auto"/>
+        <w:ind w:left="360"/>
+        <w:jc w:val="both"/>
+      </w:pPr>
+      <w:r>
+        <w:t>LocalMate chỉ giữ quyền sở hữu đối với nền tảng, công nghệ lõi và thành phần dùng chung để duy trì, bảo trì và tiếp tục phát triển sản phẩm.</w:t>
+      </w:r>
+    </w:p>
+    <w:p>
+      <w:pPr>
+        <w:spacing w:before="20" w:after="60" w:line="276" w:lineRule="auto"/>
+        <w:jc w:val="both"/>
+      </w:pPr>
+      <w:r>
+        <w:t xml:space="preserve">10.2. </w:t>
       </w:r>
       <w:r>
         <w:rPr>
           <w:b/>
         </w:rPr>
-        <w:t>Chuyển nhượng cho Bên A sau khi hoàn tất thanh toán 100%</w:t>
-      </w:r>
-      <w:r>
-        <w:t>.</w:t>
+        <w:t>Phân Định Ba Tầng Tài Sản Trí Tuệ:</w:t>
+      </w:r>
+      <w:r>
+        <w:t xml:space="preserve"> Căn cứ Luật Sở hữu trí tuệ và các văn bản hướng dẫn thi hành:</w:t>
       </w:r>
     </w:p>
     <w:p>
@@ -2201,10 +2232,26 @@
         <w:rPr>
           <w:b/>
         </w:rPr>
-        <w:t>Nhóm 2: Tài sản nền tảng có sẵn của LocalMate (Pre-existing Materials / Core Framework):</w:t>
-      </w:r>
-      <w:r>
-        <w:t xml:space="preserve"> Kiến trúc hệ thống, mã nguồn nền tảng, boilerplate, theme tokens, UI component library, mã nguồn tự động hóa và các scripts công cụ thuộc </w:t>
+        <w:t>(A) Tài sản của Khách hàng (Customer IP &amp; Data):</w:t>
+      </w:r>
+      <w:r>
+        <w:t xml:space="preserve"> Toàn bộ dữ liệu kinh doanh, cơ sở dữ liệu khách hàng/học sinh, tên miền, tài khoản nền tảng số, logo, nhãn hiệu và tài liệu do Bên A cung cấp thuộc quyền sở hữu độc quyền 100% của Bên A. Bên B không có bất kỳ quyền sở hữu nào đối với nhóm tài sản này.</w:t>
+      </w:r>
+    </w:p>
+    <w:p>
+      <w:pPr>
+        <w:spacing w:before="20" w:after="40" w:line="276" w:lineRule="auto"/>
+        <w:ind w:left="360"/>
+        <w:jc w:val="both"/>
+      </w:pPr>
+      <w:r>
+        <w:rPr>
+          <w:b/>
+        </w:rPr>
+        <w:t>(B) Tài sản Công nghệ Lõi của LocalMate (Background IP):</w:t>
+      </w:r>
+      <w:r>
+        <w:t xml:space="preserve"> Nền tảng LocalMate Core, component library, UI kit, template, database abstraction, luồng tự động hóa, CI/CD scripts và bí quyết công nghệ (know-how) thuộc </w:t>
       </w:r>
       <w:r>
         <w:rPr>
@@ -2213,16 +2260,23 @@
         <w:t>QUYỀN SỞ HỮU DUY NHẤT VÀ VĨNH VIỄN CỦA LOCALMATE</w:t>
       </w:r>
       <w:r>
-        <w:t xml:space="preserve">. Bên B cấp cho Bên A một </w:t>
-      </w:r>
+        <w:t>. Bên B cấp cho Bên A quyền sử dụng (License) tích hợp sẵn trong sản phẩm, nghiêm cấm trích xuất bán lẻ độc lập hoặc sao chép để cạnh tranh trực tiếp.</w:t>
+      </w:r>
+    </w:p>
+    <w:p>
+      <w:pPr>
+        <w:spacing w:before="20" w:after="40" w:line="276" w:lineRule="auto"/>
+        <w:ind w:left="360"/>
+        <w:jc w:val="both"/>
+      </w:pPr>
       <w:r>
         <w:rPr>
           <w:b/>
         </w:rPr>
-        <w:t>Giấy phép sử dụng vĩnh viễn, không độc quyền, phạm vi toàn cầu, không thể chuyển nhượng lại và không thể cấp phép thứ cấp (Non-exclusive, Perpetual, Worldwide, Non-transferable License)</w:t>
-      </w:r>
-      <w:r>
-        <w:t xml:space="preserve"> để vận hành duy nhất sản phẩm bàn giao. Cấm Bên A trích xuất, sao chép, phân phối lại hoặc bán lại mã nguồn nền tảng này cho bất kỳ bên thứ ba nào.</w:t>
+        <w:t>(C) Sản phẩm Tạo riêng của Dự án (Project Deliverables):</w:t>
+      </w:r>
+      <w:r>
+        <w:t xml:space="preserve"> Giao diện tùy biến riêng, landing page, cấu hình automation riêng được xác định quyền hạn theo Cấp độ thương mại lựa chọn tại Đơn Đặt Hàng:</w:t>
       </w:r>
     </w:p>
     <w:p>
@@ -2233,12 +2287,12 @@
       </w:pPr>
       <w:r>
         <w:rPr>
-          <w:b/>
+          <w:i/>
         </w:rPr>
-        <w:t>Nhóm 3: Tài sản Mã nguồn mở (Open Source Software - OSS):</w:t>
-      </w:r>
-      <w:r>
-        <w:t xml:space="preserve"> React, Tailwind CSS, Lucide icons, Vite plugins... tuân thủ giấy phép nguồn mở tương ứng (MIT, Apache 2.0). Được bàn giao theo nguyên trạng ("AS IS").</w:t>
+        <w:t>Cấp độ 1 (Managed Service):</w:t>
+      </w:r>
+      <w:r>
+        <w:t xml:space="preserve"> Bên A mua quyền sử dụng dịch vụ vận hành hoàn chỉnh trên cloud, không chuyển giao mã nguồn;</w:t>
       </w:r>
     </w:p>
     <w:p>
@@ -2249,12 +2303,12 @@
       </w:pPr>
       <w:r>
         <w:rPr>
-          <w:b/>
+          <w:i/>
         </w:rPr>
-        <w:t>Nhóm 4: Tài sản Bên thứ ba có bản quyền (Third-Party Licensed Assets):</w:t>
-      </w:r>
-      <w:r>
-        <w:t xml:space="preserve"> Fonts thương mại, Stock photos, API services... sử dụng theo Điều khoản dịch vụ (EULA/ToS) của bên thứ ba.</w:t>
+        <w:t>Cấp độ 2 (Business Continuity License):</w:t>
+      </w:r>
+      <w:r>
+        <w:t xml:space="preserve"> Bên A được xuất full dữ liệu, bàn giao cấu hình riêng, tài liệu vận hành và được quyền thuê bên thứ ba tiếp quản nếu Bên B dừng dịch vụ (Bảo đảm vận hành liên tục);</w:t>
       </w:r>
     </w:p>
     <w:p>
@@ -2265,12 +2319,12 @@
       </w:pPr>
       <w:r>
         <w:rPr>
-          <w:b/>
+          <w:i/>
         </w:rPr>
-        <w:t>Nhóm 5: Tài sản của Khách hàng (Client Materials):</w:t>
-      </w:r>
-      <w:r>
-        <w:t xml:space="preserve"> Logo, nhãn hiệu, slogan, ảnh do Bên A cung cấp thuộc quyền sở hữu của Bên A. Bên A cấp cho Bên B quyền sử dụng miễn phí có thời hạn để thực hiện hợp đồng.</w:t>
+        <w:t>Cấp độ 3 (Source &amp; Deployment Handover):</w:t>
+      </w:r>
+      <w:r>
+        <w:t xml:space="preserve"> Bên B bàn giao Git Repository mã nguồn riêng của dự án và tài liệu triển khai hạ tầng sau khi Bên A thanh toán đủ 100%.</w:t>
       </w:r>
     </w:p>
     <w:p>
@@ -2279,55 +2333,111 @@
         <w:jc w:val="both"/>
       </w:pPr>
       <w:r>
-        <w:t xml:space="preserve">10.2. </w:t>
+        <w:t xml:space="preserve">10.3. </w:t>
       </w:r>
       <w:r>
         <w:rPr>
           <w:b/>
         </w:rPr>
-        <w:t>Điều Kiện Tiên Quyết Chuyển Giao Quyền Sở Hữu (Condition Precedent):</w:t>
+        <w:t>Hai Điều Khoản Nguyên Tắc Bất Biến (Golden Clauses):</w:t>
       </w:r>
     </w:p>
     <w:p>
       <w:pPr>
+        <w:spacing w:before="20" w:after="40" w:line="276" w:lineRule="auto"/>
+        <w:ind w:left="360"/>
+        <w:jc w:val="both"/>
+      </w:pPr>
+      <w:r>
+        <w:rPr>
+          <w:i/>
+        </w:rPr>
+        <w:t>Quy định bảo vệ công nghệ LocalMate:</w:t>
+      </w:r>
+      <w:r>
+        <w:t xml:space="preserve"> Việc chuyển giao sản phẩm, tài liệu kỹ thuật hoặc mã nguồn cho Bên A theo bất kỳ gói dịch vụ nào đều không được hiểu là chuyển giao quyền sở hữu đối với LocalMate Core, framework, thư viện, UI component, template dùng chung, công cụ nội bộ hoặc bí quyết kỹ thuật có trước của LocalMate, trừ khi có phụ lục bằng văn bản quy định rõ khác đi.</w:t>
+      </w:r>
+    </w:p>
+    <w:p>
+      <w:pPr>
+        <w:spacing w:before="20" w:after="40" w:line="276" w:lineRule="auto"/>
+        <w:ind w:left="360"/>
+        <w:jc w:val="both"/>
+      </w:pPr>
+      <w:r>
+        <w:rPr>
+          <w:i/>
+        </w:rPr>
+        <w:t>Quy định bảo vệ dữ liệu Bên A:</w:t>
+      </w:r>
+      <w:r>
+        <w:t xml:space="preserve"> LocalMate không có bất kỳ quyền sở hữu nào và cam kết không bao giờ xác lập quyền sở hữu đối với dữ liệu kinh doanh, dữ liệu khách hàng, thương hiệu, tên miền và tài sản do Bên A cung cấp hoặc hình thành trong quá trình sử dụng dịch vụ.</w:t>
+      </w:r>
+    </w:p>
+    <w:p>
+      <w:pPr>
         <w:spacing w:before="20" w:after="60" w:line="276" w:lineRule="auto"/>
         <w:jc w:val="both"/>
       </w:pPr>
       <w:r>
-        <w:t xml:space="preserve">Quyền sở hữu trí tuệ đối với Nhóm 1 CHỈ CHÍNH THỨC ĐƯỢC CHUYỂN GIAO sang Bên A </w:t>
+        <w:t xml:space="preserve">10.4. </w:t>
       </w:r>
       <w:r>
         <w:rPr>
           <w:b/>
         </w:rPr>
-        <w:t>KHI VÀ CHỈ KHI Bên A đã hoàn thành đầy đủ một trăm phần trăm (100%) nghĩa vụ thanh toán</w:t>
-      </w:r>
-      <w:r>
-        <w:t xml:space="preserve"> tổng giá trị Hợp đồng và các chi phí phát sinh. Cho đến thời điểm thanh toán đủ, Bên A chỉ được cấp quyền sử dụng tạm thời có thể bị thu hồi nhằm phục vụ kiểm thử nội bộ.  </w:t>
+        <w:t>Cam Kết Lối Thoát An Toàn (Exit Guarantee):</w:t>
+      </w:r>
+      <w:r>
+        <w:t xml:space="preserve"> Khi hợp đồng chấm dứt vì bất kỳ lý do gì:</w:t>
       </w:r>
     </w:p>
     <w:p>
       <w:pPr>
-        <w:spacing w:before="20" w:after="60" w:line="276" w:lineRule="auto"/>
+        <w:spacing w:before="20" w:after="40" w:line="276" w:lineRule="auto"/>
+        <w:ind w:left="360"/>
         <w:jc w:val="both"/>
       </w:pPr>
       <w:r>
-        <w:t xml:space="preserve">10.3. </w:t>
+        <w:t xml:space="preserve">Trong vòng </w:t>
       </w:r>
       <w:r>
         <w:rPr>
           <w:b/>
         </w:rPr>
-        <w:t>Quy chế Tài sản Hỗ trợ bởi Trí tuệ Nhân tạo (AI-Assisted Assets):</w:t>
+        <w:t>15 (mười lăm) ngày làm việc</w:t>
+      </w:r>
+      <w:r>
+        <w:t>, Bên B có nghĩa vụ cung cấp cho Bên A một bản trích xuất dữ liệu hoàn chỉnh ở định dạng tiêu chuẩn (CSV, Excel hoặc JSON);</w:t>
       </w:r>
     </w:p>
     <w:p>
       <w:pPr>
-        <w:spacing w:before="20" w:after="60" w:line="276" w:lineRule="auto"/>
+        <w:spacing w:before="20" w:after="40" w:line="276" w:lineRule="auto"/>
+        <w:ind w:left="360"/>
         <w:jc w:val="both"/>
       </w:pPr>
       <w:r>
-        <w:t>Hai Bên xác nhận rằng một số thành phần hình ảnh hoặc dàn ý nội dung có thể được tạo ra với sự hỗ trợ của các công cụ Trí tuệ Nhân tạo trả phí thương mại. Quyền tác giả được bảo hộ trên phần đóng góp sáng tạo, biên tập chuyên sâu trực tiếp của con người (theo Điều 12a Luật SHTT). Bên B được miễn trừ trách nhiệm pháp lý phái sinh liên quan đến thuật toán huấn luyện dữ liệu gốc của các hãng AI quốc tế.</w:t>
+        <w:t xml:space="preserve">Bên B duy trì liên kết tải dữ liệu an toàn trong vòng </w:t>
+      </w:r>
+      <w:r>
+        <w:rPr>
+          <w:b/>
+        </w:rPr>
+        <w:t>30 (ba mươi) ngày</w:t>
+      </w:r>
+      <w:r>
+        <w:t>;</w:t>
+      </w:r>
+    </w:p>
+    <w:p>
+      <w:pPr>
+        <w:spacing w:before="20" w:after="40" w:line="276" w:lineRule="auto"/>
+        <w:ind w:left="360"/>
+        <w:jc w:val="both"/>
+      </w:pPr>
+      <w:r>
+        <w:t>Hết thời hạn 30 ngày nêu trên, Bên B tiến hành tiêu hủy an toàn bản sao dữ liệu trên hệ thống lưu trữ chính thức (trừ nhật ký hệ thống bắt buộc lưu theo luật an ninh mạng và thuế), qua đó chính thức kết thúc nghĩa vụ lưu trữ dữ liệu của Bên B.</w:t>
       </w:r>
     </w:p>
     <w:p>

</xml_diff>